<commit_message>
Shorten Arabic BT2 exam to 3 pages and update answer key
Co-Authored-By: Claude Opus 5.5 <noreply@anthropic.com>
Claude-Session: https://claude.ai/code/session_01PHgZqhLAeFoDhbHXzt9YLK
</commit_message>
<xml_diff>
--- a/exams/BT2-الباريم.docx
+++ b/exams/BT2-الباريم.docx
@@ -350,7 +350,7 @@
                 <w:sz w:val="26"/>
                 <w:szCs w:val="26"/>
               </w:rPr>
-              <w:t xml:space="preserve">0.5</w:t>
+              <w:t xml:space="preserve">1</w:t>
             </w:r>
           </w:p>
         </w:tc>
@@ -456,113 +456,7 @@
                 <w:sz w:val="26"/>
                 <w:szCs w:val="26"/>
               </w:rPr>
-              <w:t xml:space="preserve">0.25 + 0.5</w:t>
-            </w:r>
-          </w:p>
-        </w:tc>
-      </w:tr>
-      <w:tr>
-        <w:trPr>
-          <w:cantSplit/>
-          <w:trHeight w:val="440"/>
-        </w:trPr>
-        <w:tc>
-          <w:tcPr>
-            <w:tcW w:w="1700" w:type="dxa"/>
-            <w:shd w:val="clear" w:color="auto" w:fill="EEF6F1"/>
-            <w:vAlign w:val="center"/>
-          </w:tcPr>
-          <w:p>
-            <w:pPr>
-              <w:bidi/>
-              <w:spacing w:before="0" w:after="0" w:line="276" w:lineRule="auto"/>
-              <w:jc w:val="center"/>
-            </w:pPr>
-            <w:r>
-              <w:rPr>
-                <w:rFonts w:ascii="Calibri" w:eastAsia="Calibri" w:hAnsi="Calibri" w:cs="Arial"/>
-                <w:b/>
-                <w:bCs/>
-                <w:color w:val="14532D"/>
-                <w:sz w:val="26"/>
-                <w:szCs w:val="26"/>
-                <w:rtl/>
-              </w:rPr>
-              <w:t xml:space="preserve">ج)</w:t>
-            </w:r>
-          </w:p>
-        </w:tc>
-        <w:tc>
-          <w:tcPr>
-            <w:tcW w:w="6940" w:type="dxa"/>
-            <w:vAlign w:val="center"/>
-          </w:tcPr>
-          <w:p>
-            <w:pPr>
-              <w:bidi/>
-              <w:spacing w:before="0" w:after="20" w:line="276" w:lineRule="auto"/>
-            </w:pPr>
-            <w:r>
-              <w:rPr>
-                <w:rFonts w:ascii="Calibri" w:eastAsia="Calibri" w:hAnsi="Calibri" w:cs="Arial"/>
-                <w:color w:val="1A1A1A"/>
-                <w:sz w:val="26"/>
-                <w:szCs w:val="26"/>
-                <w:rtl/>
-              </w:rPr>
-              <w:t xml:space="preserve">نضرب البسط والمقام بالمرافق </w:t>
-            </w:r>
-            <m:oMath>
-              <m:r>
-                <m:rPr>
-                  <m:sty m:val="p"/>
-                </m:rPr>
-                <w:rPr>
-                  <w:rFonts w:ascii="Cambria Math" w:hAnsi="Cambria Math"/>
-                  <w:sz w:val="30"/>
-                  <w:szCs w:val="30"/>
-                </w:rPr>
-                <m:t xml:space="preserve">(√3 + 1)</m:t>
-              </m:r>
-            </m:oMath>
-          </w:p>
-          <w:p>
-            <w:pPr>
-              <w:bidi w:val="0"/>
-              <w:spacing w:before="0" w:after="20" w:line="276" w:lineRule="auto"/>
-            </w:pPr>
-            <w:r>
-              <w:rPr>
-                <w:rFonts w:ascii="Cambria Math" w:hAnsi="Cambria Math" w:cs="Cambria Math"/>
-                <w:color w:val="1A1A1A"/>
-                <w:sz w:val="26"/>
-                <w:szCs w:val="26"/>
-              </w:rPr>
-              <w:t xml:space="preserve">C = (√3 + 1)² / (3 − 1) = (4 + 2√3) / 2 = 2 + √3</w:t>
-            </w:r>
-          </w:p>
-        </w:tc>
-        <w:tc>
-          <w:tcPr>
-            <w:tcW w:w="1800" w:type="dxa"/>
-            <w:shd w:val="clear" w:color="auto" w:fill="F6E9C6"/>
-            <w:vAlign w:val="center"/>
-          </w:tcPr>
-          <w:p>
-            <w:pPr>
-              <w:bidi w:val="0"/>
-              <w:spacing w:before="0" w:after="0" w:line="276" w:lineRule="auto"/>
-              <w:jc w:val="center"/>
-            </w:pPr>
-            <w:r>
-              <w:rPr>
-                <w:rFonts w:ascii="Cambria Math" w:hAnsi="Cambria Math" w:cs="Cambria Math"/>
-                <w:b/>
-                <w:color w:val="B8860B"/>
-                <w:sz w:val="26"/>
-                <w:szCs w:val="26"/>
-              </w:rPr>
-              <w:t xml:space="preserve">0.25 + 0.5</w:t>
+              <w:t xml:space="preserve">0.5 + 0.5</w:t>
             </w:r>
           </w:p>
         </w:tc>
@@ -790,7 +684,7 @@
                 <w:sz w:val="26"/>
                 <w:szCs w:val="26"/>
               </w:rPr>
-              <w:t xml:space="preserve">0.5</w:t>
+              <w:t xml:space="preserve">0.75</w:t>
             </w:r>
           </w:p>
         </w:tc>
@@ -867,7 +761,7 @@
                 <w:sz w:val="26"/>
                 <w:szCs w:val="26"/>
               </w:rPr>
-              <w:t xml:space="preserve">0.5</w:t>
+              <w:t xml:space="preserve">0.75</w:t>
             </w:r>
           </w:p>
         </w:tc>
@@ -899,7 +793,7 @@
                 <w:szCs w:val="26"/>
                 <w:rtl/>
               </w:rPr>
-              <w:t xml:space="preserve">أ) 3</w:t>
+              <w:t xml:space="preserve">ب) 1</w:t>
             </w:r>
           </w:p>
         </w:tc>
@@ -920,7 +814,7 @@
                 <w:sz w:val="26"/>
                 <w:szCs w:val="26"/>
               </w:rPr>
-              <w:t xml:space="preserve">(3x + 1)² = 9x² + 6x + 1</w:t>
+              <w:t xml:space="preserve">9x² − 12x + 4 = (3x − 2)²</w:t>
             </w:r>
           </w:p>
         </w:tc>
@@ -944,7 +838,7 @@
                 <w:sz w:val="26"/>
                 <w:szCs w:val="26"/>
               </w:rPr>
-              <w:t xml:space="preserve">0.5</w:t>
+              <w:t xml:space="preserve">0.75</w:t>
             </w:r>
           </w:p>
         </w:tc>
@@ -976,7 +870,7 @@
                 <w:szCs w:val="26"/>
                 <w:rtl/>
               </w:rPr>
-              <w:t xml:space="preserve">ب) 1</w:t>
+              <w:t xml:space="preserve">ب) 2</w:t>
             </w:r>
           </w:p>
         </w:tc>
@@ -997,7 +891,7 @@
                 <w:sz w:val="26"/>
                 <w:szCs w:val="26"/>
               </w:rPr>
-              <w:t xml:space="preserve">9x² − 12x + 4 = (3x − 2)²</w:t>
+              <w:t xml:space="preserve">25x² − 16 = (5x − 4)(5x + 4)</w:t>
             </w:r>
           </w:p>
         </w:tc>
@@ -1021,161 +915,7 @@
                 <w:sz w:val="26"/>
                 <w:szCs w:val="26"/>
               </w:rPr>
-              <w:t xml:space="preserve">0.5</w:t>
-            </w:r>
-          </w:p>
-        </w:tc>
-      </w:tr>
-      <w:tr>
-        <w:trPr>
-          <w:cantSplit/>
-          <w:trHeight w:val="440"/>
-        </w:trPr>
-        <w:tc>
-          <w:tcPr>
-            <w:tcW w:w="1700" w:type="dxa"/>
-            <w:shd w:val="clear" w:color="auto" w:fill="EEF6F1"/>
-            <w:vAlign w:val="center"/>
-          </w:tcPr>
-          <w:p>
-            <w:pPr>
-              <w:bidi/>
-              <w:spacing w:before="0" w:after="0" w:line="276" w:lineRule="auto"/>
-              <w:jc w:val="center"/>
-            </w:pPr>
-            <w:r>
-              <w:rPr>
-                <w:rFonts w:ascii="Calibri" w:eastAsia="Calibri" w:hAnsi="Calibri" w:cs="Arial"/>
-                <w:b/>
-                <w:bCs/>
-                <w:color w:val="14532D"/>
-                <w:sz w:val="26"/>
-                <w:szCs w:val="26"/>
-                <w:rtl/>
-              </w:rPr>
-              <w:t xml:space="preserve">ب) 2</w:t>
-            </w:r>
-          </w:p>
-        </w:tc>
-        <w:tc>
-          <w:tcPr>
-            <w:tcW w:w="6940" w:type="dxa"/>
-            <w:vAlign w:val="center"/>
-          </w:tcPr>
-          <w:p>
-            <w:pPr>
-              <w:bidi w:val="0"/>
-              <w:spacing w:before="0" w:after="20" w:line="276" w:lineRule="auto"/>
-            </w:pPr>
-            <w:r>
-              <w:rPr>
-                <w:rFonts w:ascii="Cambria Math" w:hAnsi="Cambria Math" w:cs="Cambria Math"/>
-                <w:color w:val="1A1A1A"/>
-                <w:sz w:val="26"/>
-                <w:szCs w:val="26"/>
-              </w:rPr>
-              <w:t xml:space="preserve">25x² − 16 = (5x − 4)(5x + 4)</w:t>
-            </w:r>
-          </w:p>
-        </w:tc>
-        <w:tc>
-          <w:tcPr>
-            <w:tcW w:w="1800" w:type="dxa"/>
-            <w:shd w:val="clear" w:color="auto" w:fill="F6E9C6"/>
-            <w:vAlign w:val="center"/>
-          </w:tcPr>
-          <w:p>
-            <w:pPr>
-              <w:bidi w:val="0"/>
-              <w:spacing w:before="0" w:after="0" w:line="276" w:lineRule="auto"/>
-              <w:jc w:val="center"/>
-            </w:pPr>
-            <w:r>
-              <w:rPr>
-                <w:rFonts w:ascii="Cambria Math" w:hAnsi="Cambria Math" w:cs="Cambria Math"/>
-                <w:b/>
-                <w:color w:val="B8860B"/>
-                <w:sz w:val="26"/>
-                <w:szCs w:val="26"/>
-              </w:rPr>
-              <w:t xml:space="preserve">0.5</w:t>
-            </w:r>
-          </w:p>
-        </w:tc>
-      </w:tr>
-      <w:tr>
-        <w:trPr>
-          <w:cantSplit/>
-          <w:trHeight w:val="440"/>
-        </w:trPr>
-        <w:tc>
-          <w:tcPr>
-            <w:tcW w:w="1700" w:type="dxa"/>
-            <w:shd w:val="clear" w:color="auto" w:fill="EEF6F1"/>
-            <w:vAlign w:val="center"/>
-          </w:tcPr>
-          <w:p>
-            <w:pPr>
-              <w:bidi/>
-              <w:spacing w:before="0" w:after="0" w:line="276" w:lineRule="auto"/>
-              <w:jc w:val="center"/>
-            </w:pPr>
-            <w:r>
-              <w:rPr>
-                <w:rFonts w:ascii="Calibri" w:eastAsia="Calibri" w:hAnsi="Calibri" w:cs="Arial"/>
-                <w:b/>
-                <w:bCs/>
-                <w:color w:val="14532D"/>
-                <w:sz w:val="26"/>
-                <w:szCs w:val="26"/>
-                <w:rtl/>
-              </w:rPr>
-              <w:t xml:space="preserve">ب) 3</w:t>
-            </w:r>
-          </w:p>
-        </w:tc>
-        <w:tc>
-          <w:tcPr>
-            <w:tcW w:w="6940" w:type="dxa"/>
-            <w:vAlign w:val="center"/>
-          </w:tcPr>
-          <w:p>
-            <w:pPr>
-              <w:bidi w:val="0"/>
-              <w:spacing w:before="0" w:after="20" w:line="276" w:lineRule="auto"/>
-            </w:pPr>
-            <w:r>
-              <w:rPr>
-                <w:rFonts w:ascii="Cambria Math" w:hAnsi="Cambria Math" w:cs="Cambria Math"/>
-                <w:color w:val="1A1A1A"/>
-                <w:sz w:val="26"/>
-                <w:szCs w:val="26"/>
-              </w:rPr>
-              <w:t xml:space="preserve">x² + 10x + 25 = (x + 5)²</w:t>
-            </w:r>
-          </w:p>
-        </w:tc>
-        <w:tc>
-          <w:tcPr>
-            <w:tcW w:w="1800" w:type="dxa"/>
-            <w:shd w:val="clear" w:color="auto" w:fill="F6E9C6"/>
-            <w:vAlign w:val="center"/>
-          </w:tcPr>
-          <w:p>
-            <w:pPr>
-              <w:bidi w:val="0"/>
-              <w:spacing w:before="0" w:after="0" w:line="276" w:lineRule="auto"/>
-              <w:jc w:val="center"/>
-            </w:pPr>
-            <w:r>
-              <w:rPr>
-                <w:rFonts w:ascii="Cambria Math" w:hAnsi="Cambria Math" w:cs="Cambria Math"/>
-                <w:b/>
-                <w:color w:val="B8860B"/>
-                <w:sz w:val="26"/>
-                <w:szCs w:val="26"/>
-              </w:rPr>
-              <w:t xml:space="preserve">0.5</w:t>
+              <w:t xml:space="preserve">0.75</w:t>
             </w:r>
           </w:p>
         </w:tc>
@@ -1418,7 +1158,7 @@
                 <w:sz w:val="26"/>
                 <w:szCs w:val="26"/>
               </w:rPr>
-              <w:t xml:space="preserve">0.5 + 0.5</w:t>
+              <w:t xml:space="preserve">0.75 + 0.75</w:t>
             </w:r>
           </w:p>
         </w:tc>
@@ -1510,99 +1250,7 @@
                 <w:sz w:val="26"/>
                 <w:szCs w:val="26"/>
               </w:rPr>
-              <w:t xml:space="preserve">0.5 + 0.5</w:t>
-            </w:r>
-          </w:p>
-        </w:tc>
-      </w:tr>
-      <w:tr>
-        <w:trPr>
-          <w:cantSplit/>
-          <w:trHeight w:val="440"/>
-        </w:trPr>
-        <w:tc>
-          <w:tcPr>
-            <w:tcW w:w="1700" w:type="dxa"/>
-            <w:shd w:val="clear" w:color="auto" w:fill="EEF6F1"/>
-            <w:vAlign w:val="center"/>
-          </w:tcPr>
-          <w:p>
-            <w:pPr>
-              <w:bidi/>
-              <w:spacing w:before="0" w:after="0" w:line="276" w:lineRule="auto"/>
-              <w:jc w:val="center"/>
-            </w:pPr>
-            <w:r>
-              <w:rPr>
-                <w:rFonts w:ascii="Calibri" w:eastAsia="Calibri" w:hAnsi="Calibri" w:cs="Arial"/>
-                <w:b/>
-                <w:bCs/>
-                <w:color w:val="14532D"/>
-                <w:sz w:val="26"/>
-                <w:szCs w:val="26"/>
-                <w:rtl/>
-              </w:rPr>
-              <w:t xml:space="preserve">ج) R(x)</w:t>
-            </w:r>
-          </w:p>
-        </w:tc>
-        <w:tc>
-          <w:tcPr>
-            <w:tcW w:w="6940" w:type="dxa"/>
-            <w:vAlign w:val="center"/>
-          </w:tcPr>
-          <w:p>
-            <w:pPr>
-              <w:bidi w:val="0"/>
-              <w:spacing w:before="0" w:after="20" w:line="276" w:lineRule="auto"/>
-            </w:pPr>
-            <w:r>
-              <w:rPr>
-                <w:rFonts w:ascii="Cambria Math" w:hAnsi="Cambria Math" w:cs="Cambria Math"/>
-                <w:color w:val="1A1A1A"/>
-                <w:sz w:val="26"/>
-                <w:szCs w:val="26"/>
-              </w:rPr>
-              <w:t xml:space="preserve">Δ = 16 + 48 = 64   ;   x₁ = 2 , x₂ = −6</w:t>
-            </w:r>
-          </w:p>
-          <w:p>
-            <w:pPr>
-              <w:bidi w:val="0"/>
-              <w:spacing w:before="0" w:after="20" w:line="276" w:lineRule="auto"/>
-            </w:pPr>
-            <w:r>
-              <w:rPr>
-                <w:rFonts w:ascii="Cambria Math" w:hAnsi="Cambria Math" w:cs="Cambria Math"/>
-                <w:color w:val="1A1A1A"/>
-                <w:sz w:val="26"/>
-                <w:szCs w:val="26"/>
-              </w:rPr>
-              <w:t xml:space="preserve">R(x) = (x − 2)(x + 6)</w:t>
-            </w:r>
-          </w:p>
-        </w:tc>
-        <w:tc>
-          <w:tcPr>
-            <w:tcW w:w="1800" w:type="dxa"/>
-            <w:shd w:val="clear" w:color="auto" w:fill="F6E9C6"/>
-            <w:vAlign w:val="center"/>
-          </w:tcPr>
-          <w:p>
-            <w:pPr>
-              <w:bidi w:val="0"/>
-              <w:spacing w:before="0" w:after="0" w:line="276" w:lineRule="auto"/>
-              <w:jc w:val="center"/>
-            </w:pPr>
-            <w:r>
-              <w:rPr>
-                <w:rFonts w:ascii="Cambria Math" w:hAnsi="Cambria Math" w:cs="Cambria Math"/>
-                <w:b/>
-                <w:color w:val="B8860B"/>
-                <w:sz w:val="26"/>
-                <w:szCs w:val="26"/>
-              </w:rPr>
-              <w:t xml:space="preserve">0.5 + 0.5</w:t>
+              <w:t xml:space="preserve">0.75 + 0.75</w:t>
             </w:r>
           </w:p>
         </w:tc>
@@ -1849,7 +1497,7 @@
                 <w:sz w:val="26"/>
                 <w:szCs w:val="26"/>
               </w:rPr>
-              <w:t xml:space="preserve">0.5</w:t>
+              <w:t xml:space="preserve">0.75</w:t>
             </w:r>
           </w:p>
         </w:tc>
@@ -1926,7 +1574,7 @@
                 <w:sz w:val="26"/>
                 <w:szCs w:val="26"/>
               </w:rPr>
-              <w:t xml:space="preserve">0.5</w:t>
+              <w:t xml:space="preserve">0.75</w:t>
             </w:r>
           </w:p>
         </w:tc>
@@ -2003,7 +1651,7 @@
                 <w:sz w:val="26"/>
                 <w:szCs w:val="26"/>
               </w:rPr>
-              <w:t xml:space="preserve">0.5</w:t>
+              <w:t xml:space="preserve">0.75</w:t>
             </w:r>
           </w:p>
         </w:tc>
@@ -2059,6 +1707,21 @@
               <w:t xml:space="preserve">B̄ = {1, 3, 5, 7, 9}</w:t>
             </w:r>
           </w:p>
+          <w:p>
+            <w:pPr>
+              <w:bidi w:val="0"/>
+              <w:spacing w:before="0" w:after="20" w:line="276" w:lineRule="auto"/>
+            </w:pPr>
+            <w:r>
+              <w:rPr>
+                <w:rFonts w:ascii="Cambria Math" w:hAnsi="Cambria Math" w:cs="Cambria Math"/>
+                <w:color w:val="1A1A1A"/>
+                <w:sz w:val="26"/>
+                <w:szCs w:val="26"/>
+              </w:rPr>
+              <w:t xml:space="preserve">Ā ∩ B̄ = {5, 7, 9}</w:t>
+            </w:r>
+          </w:p>
         </w:tc>
         <w:tc>
           <w:tcPr>
@@ -2080,237 +1743,7 @@
                 <w:sz w:val="26"/>
                 <w:szCs w:val="26"/>
               </w:rPr>
-              <w:t xml:space="preserve">0.5</w:t>
-            </w:r>
-          </w:p>
-        </w:tc>
-      </w:tr>
-      <w:tr>
-        <w:trPr>
-          <w:cantSplit/>
-          <w:trHeight w:val="440"/>
-        </w:trPr>
-        <w:tc>
-          <w:tcPr>
-            <w:tcW w:w="1700" w:type="dxa"/>
-            <w:shd w:val="clear" w:color="auto" w:fill="EEF6F1"/>
-            <w:vAlign w:val="center"/>
-          </w:tcPr>
-          <w:p>
-            <w:pPr>
-              <w:bidi/>
-              <w:spacing w:before="0" w:after="0" w:line="276" w:lineRule="auto"/>
-              <w:jc w:val="center"/>
-            </w:pPr>
-            <w:r>
-              <w:rPr>
-                <w:rFonts w:ascii="Calibri" w:eastAsia="Calibri" w:hAnsi="Calibri" w:cs="Arial"/>
-                <w:b/>
-                <w:bCs/>
-                <w:color w:val="14532D"/>
-                <w:sz w:val="26"/>
-                <w:szCs w:val="26"/>
-                <w:rtl/>
-              </w:rPr>
-              <w:t xml:space="preserve">هـ)</w:t>
-            </w:r>
-          </w:p>
-        </w:tc>
-        <w:tc>
-          <w:tcPr>
-            <w:tcW w:w="6940" w:type="dxa"/>
-            <w:vAlign w:val="center"/>
-          </w:tcPr>
-          <w:p>
-            <w:pPr>
-              <w:bidi/>
-              <w:spacing w:before="0" w:after="20" w:line="276" w:lineRule="auto"/>
-            </w:pPr>
-            <w:r>
-              <w:rPr>
-                <w:rFonts w:ascii="Calibri" w:eastAsia="Calibri" w:hAnsi="Calibri" w:cs="Arial"/>
-                <w:color w:val="1A1A1A"/>
-                <w:sz w:val="26"/>
-                <w:szCs w:val="26"/>
-                <w:rtl/>
-              </w:rPr>
-              <w:t xml:space="preserve">متمّم  </w:t>
-            </w:r>
-            <m:oMath>
-              <m:r>
-                <m:rPr>
-                  <m:sty m:val="p"/>
-                </m:rPr>
-                <w:rPr>
-                  <w:rFonts w:ascii="Cambria Math" w:hAnsi="Cambria Math"/>
-                  <w:sz w:val="30"/>
-                  <w:szCs w:val="30"/>
-                </w:rPr>
-                <m:t xml:space="preserve">(A ∪ B) = {5, 7, 9}</m:t>
-              </m:r>
-            </m:oMath>
-          </w:p>
-        </w:tc>
-        <w:tc>
-          <w:tcPr>
-            <w:tcW w:w="1800" w:type="dxa"/>
-            <w:shd w:val="clear" w:color="auto" w:fill="F6E9C6"/>
-            <w:vAlign w:val="center"/>
-          </w:tcPr>
-          <w:p>
-            <w:pPr>
-              <w:bidi w:val="0"/>
-              <w:spacing w:before="0" w:after="0" w:line="276" w:lineRule="auto"/>
-              <w:jc w:val="center"/>
-            </w:pPr>
-            <w:r>
-              <w:rPr>
-                <w:rFonts w:ascii="Cambria Math" w:hAnsi="Cambria Math" w:cs="Cambria Math"/>
-                <w:b/>
-                <w:color w:val="B8860B"/>
-                <w:sz w:val="26"/>
-                <w:szCs w:val="26"/>
-              </w:rPr>
-              <w:t xml:space="preserve">0.5</w:t>
-            </w:r>
-          </w:p>
-        </w:tc>
-      </w:tr>
-      <w:tr>
-        <w:trPr>
-          <w:cantSplit/>
-          <w:trHeight w:val="440"/>
-        </w:trPr>
-        <w:tc>
-          <w:tcPr>
-            <w:tcW w:w="1700" w:type="dxa"/>
-            <w:shd w:val="clear" w:color="auto" w:fill="EEF6F1"/>
-            <w:vAlign w:val="center"/>
-          </w:tcPr>
-          <w:p>
-            <w:pPr>
-              <w:bidi/>
-              <w:spacing w:before="0" w:after="0" w:line="276" w:lineRule="auto"/>
-              <w:jc w:val="center"/>
-            </w:pPr>
-            <w:r>
-              <w:rPr>
-                <w:rFonts w:ascii="Calibri" w:eastAsia="Calibri" w:hAnsi="Calibri" w:cs="Arial"/>
-                <w:b/>
-                <w:bCs/>
-                <w:color w:val="14532D"/>
-                <w:sz w:val="26"/>
-                <w:szCs w:val="26"/>
-                <w:rtl/>
-              </w:rPr>
-              <w:t xml:space="preserve">و)</w:t>
-            </w:r>
-          </w:p>
-        </w:tc>
-        <w:tc>
-          <w:tcPr>
-            <w:tcW w:w="6940" w:type="dxa"/>
-            <w:vAlign w:val="center"/>
-          </w:tcPr>
-          <w:p>
-            <w:pPr>
-              <w:bidi w:val="0"/>
-              <w:spacing w:before="0" w:after="20" w:line="276" w:lineRule="auto"/>
-            </w:pPr>
-            <w:r>
-              <w:rPr>
-                <w:rFonts w:ascii="Cambria Math" w:hAnsi="Cambria Math" w:cs="Cambria Math"/>
-                <w:color w:val="1A1A1A"/>
-                <w:sz w:val="26"/>
-                <w:szCs w:val="26"/>
-              </w:rPr>
-              <w:t xml:space="preserve">Ā ∩ B̄ = {5, 7, 9}</w:t>
-            </w:r>
-          </w:p>
-          <w:p>
-            <w:pPr>
-              <w:bidi/>
-              <w:spacing w:before="0" w:after="20" w:line="276" w:lineRule="auto"/>
-            </w:pPr>
-            <w:r>
-              <w:rPr>
-                <w:rFonts w:ascii="Calibri" w:eastAsia="Calibri" w:hAnsi="Calibri" w:cs="Arial"/>
-                <w:color w:val="1A1A1A"/>
-                <w:sz w:val="26"/>
-                <w:szCs w:val="26"/>
-                <w:rtl/>
-              </w:rPr>
-              <w:t xml:space="preserve">الملاحظة: متمّم </w:t>
-            </w:r>
-            <m:oMath>
-              <m:r>
-                <m:rPr>
-                  <m:sty m:val="p"/>
-                </m:rPr>
-                <w:rPr>
-                  <w:rFonts w:ascii="Cambria Math" w:hAnsi="Cambria Math"/>
-                  <w:sz w:val="30"/>
-                  <w:szCs w:val="30"/>
-                </w:rPr>
-                <m:t xml:space="preserve">(A ∪ B)</m:t>
-              </m:r>
-            </m:oMath>
-            <w:r>
-              <w:rPr>
-                <w:rFonts w:ascii="Calibri" w:eastAsia="Calibri" w:hAnsi="Calibri" w:cs="Arial"/>
-                <w:color w:val="1A1A1A"/>
-                <w:sz w:val="26"/>
-                <w:szCs w:val="26"/>
-                <w:rtl/>
-              </w:rPr>
-              <w:t xml:space="preserve"> يساوي </w:t>
-            </w:r>
-            <m:oMath>
-              <m:r>
-                <m:rPr>
-                  <m:sty m:val="p"/>
-                </m:rPr>
-                <w:rPr>
-                  <w:rFonts w:ascii="Cambria Math" w:hAnsi="Cambria Math"/>
-                  <w:sz w:val="30"/>
-                  <w:szCs w:val="30"/>
-                </w:rPr>
-                <m:t xml:space="preserve">Ā ∩ B̄</m:t>
-              </m:r>
-            </m:oMath>
-            <w:r>
-              <w:rPr>
-                <w:rFonts w:ascii="Calibri" w:eastAsia="Calibri" w:hAnsi="Calibri" w:cs="Arial"/>
-                <w:color w:val="1A1A1A"/>
-                <w:sz w:val="26"/>
-                <w:szCs w:val="26"/>
-                <w:rtl/>
-              </w:rPr>
-              <w:t xml:space="preserve"> (قانون دي مورغان).</w:t>
-            </w:r>
-          </w:p>
-        </w:tc>
-        <w:tc>
-          <w:tcPr>
-            <w:tcW w:w="1800" w:type="dxa"/>
-            <w:shd w:val="clear" w:color="auto" w:fill="F6E9C6"/>
-            <w:vAlign w:val="center"/>
-          </w:tcPr>
-          <w:p>
-            <w:pPr>
-              <w:bidi w:val="0"/>
-              <w:spacing w:before="0" w:after="0" w:line="276" w:lineRule="auto"/>
-              <w:jc w:val="center"/>
-            </w:pPr>
-            <w:r>
-              <w:rPr>
-                <w:rFonts w:ascii="Cambria Math" w:hAnsi="Cambria Math" w:cs="Cambria Math"/>
-                <w:b/>
-                <w:color w:val="B8860B"/>
-                <w:sz w:val="26"/>
-                <w:szCs w:val="26"/>
-              </w:rPr>
-              <w:t xml:space="preserve">0.5</w:t>
+              <w:t xml:space="preserve">0.75</w:t>
             </w:r>
           </w:p>
         </w:tc>
@@ -3715,7 +3148,7 @@
                 <w:sz w:val="26"/>
                 <w:szCs w:val="26"/>
               </w:rPr>
-              <w:t xml:space="preserve">0.5</w:t>
+              <w:t xml:space="preserve">0.75</w:t>
             </w:r>
           </w:p>
         </w:tc>
@@ -3747,7 +3180,7 @@
                 <w:szCs w:val="26"/>
                 <w:rtl/>
               </w:rPr>
-              <w:t xml:space="preserve">2 – ب)</w:t>
+              <w:t xml:space="preserve">2 – ج)</w:t>
             </w:r>
           </w:p>
         </w:tc>
@@ -3768,7 +3201,7 @@
                 <w:sz w:val="26"/>
                 <w:szCs w:val="26"/>
               </w:rPr>
-              <w:t xml:space="preserve">]−∞ ; −3]</w:t>
+              <w:t xml:space="preserve">]−∞ ; 3[</w:t>
             </w:r>
           </w:p>
         </w:tc>
@@ -3792,7 +3225,7 @@
                 <w:sz w:val="26"/>
                 <w:szCs w:val="26"/>
               </w:rPr>
-              <w:t xml:space="preserve">0.5</w:t>
+              <w:t xml:space="preserve">0.75</w:t>
             </w:r>
           </w:p>
         </w:tc>
@@ -3824,7 +3257,7 @@
                 <w:szCs w:val="26"/>
                 <w:rtl/>
               </w:rPr>
-              <w:t xml:space="preserve">3 – ج)</w:t>
+              <w:t xml:space="preserve">3 – ب)</w:t>
             </w:r>
           </w:p>
         </w:tc>
@@ -3845,7 +3278,7 @@
                 <w:sz w:val="26"/>
                 <w:szCs w:val="26"/>
               </w:rPr>
-              <w:t xml:space="preserve">]−∞ ; 3[</w:t>
+              <w:t xml:space="preserve">]−3 ; 3[</w:t>
             </w:r>
           </w:p>
         </w:tc>
@@ -3869,7 +3302,7 @@
                 <w:sz w:val="26"/>
                 <w:szCs w:val="26"/>
               </w:rPr>
-              <w:t xml:space="preserve">0.5</w:t>
+              <w:t xml:space="preserve">0.75</w:t>
             </w:r>
           </w:p>
         </w:tc>
@@ -3901,7 +3334,7 @@
                 <w:szCs w:val="26"/>
                 <w:rtl/>
               </w:rPr>
-              <w:t xml:space="preserve">4 – ب)</w:t>
+              <w:t xml:space="preserve">4 – ج)</w:t>
             </w:r>
           </w:p>
         </w:tc>
@@ -3922,7 +3355,7 @@
                 <w:sz w:val="26"/>
                 <w:szCs w:val="26"/>
               </w:rPr>
-              <w:t xml:space="preserve">]−3 ; 3[</w:t>
+              <w:t xml:space="preserve">]−∞ ; −2] ∪ [2 ; +∞[</w:t>
             </w:r>
           </w:p>
         </w:tc>
@@ -3946,161 +3379,7 @@
                 <w:sz w:val="26"/>
                 <w:szCs w:val="26"/>
               </w:rPr>
-              <w:t xml:space="preserve">0.5</w:t>
-            </w:r>
-          </w:p>
-        </w:tc>
-      </w:tr>
-      <w:tr>
-        <w:trPr>
-          <w:cantSplit/>
-          <w:trHeight w:val="440"/>
-        </w:trPr>
-        <w:tc>
-          <w:tcPr>
-            <w:tcW w:w="1700" w:type="dxa"/>
-            <w:shd w:val="clear" w:color="auto" w:fill="EEF6F1"/>
-            <w:vAlign w:val="center"/>
-          </w:tcPr>
-          <w:p>
-            <w:pPr>
-              <w:bidi/>
-              <w:spacing w:before="0" w:after="0" w:line="276" w:lineRule="auto"/>
-              <w:jc w:val="center"/>
-            </w:pPr>
-            <w:r>
-              <w:rPr>
-                <w:rFonts w:ascii="Calibri" w:eastAsia="Calibri" w:hAnsi="Calibri" w:cs="Arial"/>
-                <w:b/>
-                <w:bCs/>
-                <w:color w:val="14532D"/>
-                <w:sz w:val="26"/>
-                <w:szCs w:val="26"/>
-                <w:rtl/>
-              </w:rPr>
-              <w:t xml:space="preserve">5 – ج)</w:t>
-            </w:r>
-          </w:p>
-        </w:tc>
-        <w:tc>
-          <w:tcPr>
-            <w:tcW w:w="6940" w:type="dxa"/>
-            <w:vAlign w:val="center"/>
-          </w:tcPr>
-          <w:p>
-            <w:pPr>
-              <w:bidi w:val="0"/>
-              <w:spacing w:before="0" w:after="20" w:line="276" w:lineRule="auto"/>
-            </w:pPr>
-            <w:r>
-              <w:rPr>
-                <w:rFonts w:ascii="Cambria Math" w:hAnsi="Cambria Math" w:cs="Cambria Math"/>
-                <w:color w:val="1A1A1A"/>
-                <w:sz w:val="26"/>
-                <w:szCs w:val="26"/>
-              </w:rPr>
-              <w:t xml:space="preserve">]−∞ ; −2] ∪ [2 ; +∞[</w:t>
-            </w:r>
-          </w:p>
-        </w:tc>
-        <w:tc>
-          <w:tcPr>
-            <w:tcW w:w="1800" w:type="dxa"/>
-            <w:shd w:val="clear" w:color="auto" w:fill="F6E9C6"/>
-            <w:vAlign w:val="center"/>
-          </w:tcPr>
-          <w:p>
-            <w:pPr>
-              <w:bidi w:val="0"/>
-              <w:spacing w:before="0" w:after="0" w:line="276" w:lineRule="auto"/>
-              <w:jc w:val="center"/>
-            </w:pPr>
-            <w:r>
-              <w:rPr>
-                <w:rFonts w:ascii="Cambria Math" w:hAnsi="Cambria Math" w:cs="Cambria Math"/>
-                <w:b/>
-                <w:color w:val="B8860B"/>
-                <w:sz w:val="26"/>
-                <w:szCs w:val="26"/>
-              </w:rPr>
-              <w:t xml:space="preserve">0.5</w:t>
-            </w:r>
-          </w:p>
-        </w:tc>
-      </w:tr>
-      <w:tr>
-        <w:trPr>
-          <w:cantSplit/>
-          <w:trHeight w:val="440"/>
-        </w:trPr>
-        <w:tc>
-          <w:tcPr>
-            <w:tcW w:w="1700" w:type="dxa"/>
-            <w:shd w:val="clear" w:color="auto" w:fill="EEF6F1"/>
-            <w:vAlign w:val="center"/>
-          </w:tcPr>
-          <w:p>
-            <w:pPr>
-              <w:bidi/>
-              <w:spacing w:before="0" w:after="0" w:line="276" w:lineRule="auto"/>
-              <w:jc w:val="center"/>
-            </w:pPr>
-            <w:r>
-              <w:rPr>
-                <w:rFonts w:ascii="Calibri" w:eastAsia="Calibri" w:hAnsi="Calibri" w:cs="Arial"/>
-                <w:b/>
-                <w:bCs/>
-                <w:color w:val="14532D"/>
-                <w:sz w:val="26"/>
-                <w:szCs w:val="26"/>
-                <w:rtl/>
-              </w:rPr>
-              <w:t xml:space="preserve">6 – أ)</w:t>
-            </w:r>
-          </w:p>
-        </w:tc>
-        <w:tc>
-          <w:tcPr>
-            <w:tcW w:w="6940" w:type="dxa"/>
-            <w:vAlign w:val="center"/>
-          </w:tcPr>
-          <w:p>
-            <w:pPr>
-              <w:bidi w:val="0"/>
-              <w:spacing w:before="0" w:after="20" w:line="276" w:lineRule="auto"/>
-            </w:pPr>
-            <w:r>
-              <w:rPr>
-                <w:rFonts w:ascii="Cambria Math" w:hAnsi="Cambria Math" w:cs="Cambria Math"/>
-                <w:color w:val="1A1A1A"/>
-                <w:sz w:val="26"/>
-                <w:szCs w:val="26"/>
-              </w:rPr>
-              <w:t xml:space="preserve">[−5 ; 1]</w:t>
-            </w:r>
-          </w:p>
-        </w:tc>
-        <w:tc>
-          <w:tcPr>
-            <w:tcW w:w="1800" w:type="dxa"/>
-            <w:shd w:val="clear" w:color="auto" w:fill="F6E9C6"/>
-            <w:vAlign w:val="center"/>
-          </w:tcPr>
-          <w:p>
-            <w:pPr>
-              <w:bidi w:val="0"/>
-              <w:spacing w:before="0" w:after="0" w:line="276" w:lineRule="auto"/>
-              <w:jc w:val="center"/>
-            </w:pPr>
-            <w:r>
-              <w:rPr>
-                <w:rFonts w:ascii="Cambria Math" w:hAnsi="Cambria Math" w:cs="Cambria Math"/>
-                <w:b/>
-                <w:color w:val="B8860B"/>
-                <w:sz w:val="26"/>
-                <w:szCs w:val="26"/>
-              </w:rPr>
-              <w:t xml:space="preserve">0.5</w:t>
+              <w:t xml:space="preserve">0.75</w:t>
             </w:r>
           </w:p>
         </w:tc>
@@ -4305,21 +3584,23 @@
                 <w:szCs w:val="26"/>
                 <w:rtl/>
               </w:rPr>
-              <w:t xml:space="preserve">قلمان ودفتر ثمنها 7 $ ، إذن </w:t>
-            </w:r>
-            <m:oMath>
-              <m:r>
-                <m:rPr>
-                  <m:sty m:val="p"/>
-                </m:rPr>
-                <w:rPr>
-                  <w:rFonts w:ascii="Cambria Math" w:hAnsi="Cambria Math"/>
-                  <w:sz w:val="30"/>
-                  <w:szCs w:val="30"/>
-                </w:rPr>
-                <m:t xml:space="preserve">2x + y = 7</m:t>
-              </m:r>
-            </m:oMath>
+              <w:t xml:space="preserve">بجمع المعادلتين:</w:t>
+            </w:r>
+          </w:p>
+          <w:p>
+            <w:pPr>
+              <w:bidi w:val="0"/>
+              <w:spacing w:before="0" w:after="20" w:line="276" w:lineRule="auto"/>
+            </w:pPr>
+            <w:r>
+              <w:rPr>
+                <w:rFonts w:ascii="Cambria Math" w:hAnsi="Cambria Math" w:cs="Cambria Math"/>
+                <w:color w:val="1A1A1A"/>
+                <w:sz w:val="26"/>
+                <w:szCs w:val="26"/>
+              </w:rPr>
+              <w:t xml:space="preserve">3x = 9  ⇒  x = 3</w:t>
+            </w:r>
           </w:p>
           <w:p>
             <w:pPr>
@@ -4334,21 +3615,38 @@
                 <w:szCs w:val="26"/>
                 <w:rtl/>
               </w:rPr>
-              <w:t xml:space="preserve">ثمن القلم يزيد 2 $ عن ثمن الدفتر، إذن </w:t>
-            </w:r>
-            <m:oMath>
-              <m:r>
-                <m:rPr>
-                  <m:sty m:val="p"/>
-                </m:rPr>
-                <w:rPr>
-                  <w:rFonts w:ascii="Cambria Math" w:hAnsi="Cambria Math"/>
-                  <w:sz w:val="30"/>
-                  <w:szCs w:val="30"/>
-                </w:rPr>
-                <m:t xml:space="preserve">x − y = 2</m:t>
-              </m:r>
-            </m:oMath>
+              <w:t xml:space="preserve">بالتعويض في المعادلة الثانية:</w:t>
+            </w:r>
+          </w:p>
+          <w:p>
+            <w:pPr>
+              <w:bidi w:val="0"/>
+              <w:spacing w:before="0" w:after="20" w:line="276" w:lineRule="auto"/>
+            </w:pPr>
+            <w:r>
+              <w:rPr>
+                <w:rFonts w:ascii="Cambria Math" w:hAnsi="Cambria Math" w:cs="Cambria Math"/>
+                <w:color w:val="1A1A1A"/>
+                <w:sz w:val="26"/>
+                <w:szCs w:val="26"/>
+              </w:rPr>
+              <w:t xml:space="preserve">3 − y = 2  ⇒  y = 1</w:t>
+            </w:r>
+          </w:p>
+          <w:p>
+            <w:pPr>
+              <w:bidi w:val="0"/>
+              <w:spacing w:before="0" w:after="20" w:line="276" w:lineRule="auto"/>
+            </w:pPr>
+            <w:r>
+              <w:rPr>
+                <w:rFonts w:ascii="Cambria Math" w:hAnsi="Cambria Math" w:cs="Cambria Math"/>
+                <w:color w:val="1A1A1A"/>
+                <w:sz w:val="26"/>
+                <w:szCs w:val="26"/>
+              </w:rPr>
+              <w:t xml:space="preserve">(x ; y) = (3 ; 1)</w:t>
+            </w:r>
           </w:p>
         </w:tc>
         <w:tc>
@@ -4371,7 +3669,7 @@
                 <w:sz w:val="26"/>
                 <w:szCs w:val="26"/>
               </w:rPr>
-              <w:t xml:space="preserve">0.5</w:t>
+              <w:t xml:space="preserve">1 + 1 + 0.5</w:t>
             </w:r>
           </w:p>
         </w:tc>
@@ -4414,18 +3712,17 @@
           </w:tcPr>
           <w:p>
             <w:pPr>
-              <w:bidi/>
+              <w:bidi w:val="0"/>
               <w:spacing w:before="0" w:after="20" w:line="276" w:lineRule="auto"/>
             </w:pPr>
             <w:r>
               <w:rPr>
-                <w:rFonts w:ascii="Calibri" w:eastAsia="Calibri" w:hAnsi="Calibri" w:cs="Arial"/>
-                <w:color w:val="1A1A1A"/>
-                <w:sz w:val="26"/>
-                <w:szCs w:val="26"/>
-                <w:rtl/>
-              </w:rPr>
-              <w:t xml:space="preserve">بجمع المعادلتين:</w:t>
+                <w:rFonts w:ascii="Cambria Math" w:hAnsi="Cambria Math" w:cs="Cambria Math"/>
+                <w:color w:val="1A1A1A"/>
+                <w:sz w:val="26"/>
+                <w:szCs w:val="26"/>
+              </w:rPr>
+              <w:t xml:space="preserve">2(3) + 1 = 7  ✓</w:t>
             </w:r>
           </w:p>
           <w:p>
@@ -4440,131 +3737,7 @@
                 <w:sz w:val="26"/>
                 <w:szCs w:val="26"/>
               </w:rPr>
-              <w:t xml:space="preserve">3x = 9  ⇒  x = 3</w:t>
-            </w:r>
-          </w:p>
-          <w:p>
-            <w:pPr>
-              <w:bidi/>
-              <w:spacing w:before="0" w:after="20" w:line="276" w:lineRule="auto"/>
-            </w:pPr>
-            <w:r>
-              <w:rPr>
-                <w:rFonts w:ascii="Calibri" w:eastAsia="Calibri" w:hAnsi="Calibri" w:cs="Arial"/>
-                <w:color w:val="1A1A1A"/>
-                <w:sz w:val="26"/>
-                <w:szCs w:val="26"/>
-                <w:rtl/>
-              </w:rPr>
-              <w:t xml:space="preserve">بالتعويض:</w:t>
-            </w:r>
-          </w:p>
-          <w:p>
-            <w:pPr>
-              <w:bidi w:val="0"/>
-              <w:spacing w:before="0" w:after="20" w:line="276" w:lineRule="auto"/>
-            </w:pPr>
-            <w:r>
-              <w:rPr>
-                <w:rFonts w:ascii="Cambria Math" w:hAnsi="Cambria Math" w:cs="Cambria Math"/>
-                <w:color w:val="1A1A1A"/>
-                <w:sz w:val="26"/>
-                <w:szCs w:val="26"/>
-              </w:rPr>
-              <w:t xml:space="preserve">3 − y = 2  ⇒  y = 1</w:t>
-            </w:r>
-          </w:p>
-          <w:p>
-            <w:pPr>
-              <w:bidi w:val="0"/>
-              <w:spacing w:before="0" w:after="20" w:line="276" w:lineRule="auto"/>
-            </w:pPr>
-            <w:r>
-              <w:rPr>
-                <w:rFonts w:ascii="Cambria Math" w:hAnsi="Cambria Math" w:cs="Cambria Math"/>
-                <w:color w:val="1A1A1A"/>
-                <w:sz w:val="26"/>
-                <w:szCs w:val="26"/>
-              </w:rPr>
-              <w:t xml:space="preserve">(x ; y) = (3 ; 1)</w:t>
-            </w:r>
-          </w:p>
-        </w:tc>
-        <w:tc>
-          <w:tcPr>
-            <w:tcW w:w="1800" w:type="dxa"/>
-            <w:shd w:val="clear" w:color="auto" w:fill="F6E9C6"/>
-            <w:vAlign w:val="center"/>
-          </w:tcPr>
-          <w:p>
-            <w:pPr>
-              <w:bidi w:val="0"/>
-              <w:spacing w:before="0" w:after="0" w:line="276" w:lineRule="auto"/>
-              <w:jc w:val="center"/>
-            </w:pPr>
-            <w:r>
-              <w:rPr>
-                <w:rFonts w:ascii="Cambria Math" w:hAnsi="Cambria Math" w:cs="Cambria Math"/>
-                <w:b/>
-                <w:color w:val="B8860B"/>
-                <w:sz w:val="26"/>
-                <w:szCs w:val="26"/>
-              </w:rPr>
-              <w:t xml:space="preserve">1 + 0.5 + 0.5</w:t>
-            </w:r>
-          </w:p>
-        </w:tc>
-      </w:tr>
-      <w:tr>
-        <w:trPr>
-          <w:cantSplit/>
-          <w:trHeight w:val="440"/>
-        </w:trPr>
-        <w:tc>
-          <w:tcPr>
-            <w:tcW w:w="1700" w:type="dxa"/>
-            <w:shd w:val="clear" w:color="auto" w:fill="EEF6F1"/>
-            <w:vAlign w:val="center"/>
-          </w:tcPr>
-          <w:p>
-            <w:pPr>
-              <w:bidi/>
-              <w:spacing w:before="0" w:after="0" w:line="276" w:lineRule="auto"/>
-              <w:jc w:val="center"/>
-            </w:pPr>
-            <w:r>
-              <w:rPr>
-                <w:rFonts w:ascii="Calibri" w:eastAsia="Calibri" w:hAnsi="Calibri" w:cs="Arial"/>
-                <w:b/>
-                <w:bCs/>
-                <w:color w:val="14532D"/>
-                <w:sz w:val="26"/>
-                <w:szCs w:val="26"/>
-                <w:rtl/>
-              </w:rPr>
-              <w:t xml:space="preserve">ج)</w:t>
-            </w:r>
-          </w:p>
-        </w:tc>
-        <w:tc>
-          <w:tcPr>
-            <w:tcW w:w="6940" w:type="dxa"/>
-            <w:vAlign w:val="center"/>
-          </w:tcPr>
-          <w:p>
-            <w:pPr>
-              <w:bidi/>
-              <w:spacing w:before="0" w:after="20" w:line="276" w:lineRule="auto"/>
-            </w:pPr>
-            <w:r>
-              <w:rPr>
-                <w:rFonts w:ascii="Calibri" w:eastAsia="Calibri" w:hAnsi="Calibri" w:cs="Arial"/>
-                <w:color w:val="1A1A1A"/>
-                <w:sz w:val="26"/>
-                <w:szCs w:val="26"/>
-                <w:rtl/>
-              </w:rPr>
-              <w:t xml:space="preserve">ثمن القلم 3 $ وثمن الدفتر 1 $.</w:t>
+              <w:t xml:space="preserve">3 − 1 = 2  ✓</w:t>
             </w:r>
           </w:p>
         </w:tc>

</xml_diff>

<commit_message>
Shorten Arabic BT2 exam to 2 pages, simplify inequalities question
Co-Authored-By: Claude Opus 5.5 <noreply@anthropic.com>
Claude-Session: https://claude.ai/code/session_01PHgZqhLAeFoDhbHXzt9YLK
</commit_message>
<xml_diff>
--- a/exams/BT2-الباريم.docx
+++ b/exams/BT2-الباريم.docx
@@ -138,7 +138,7 @@
         </w:pBdr>
         <w:shd w:val="clear" w:color="auto" w:fill="14532D"/>
         <w:bidi/>
-        <w:spacing w:before="240" w:after="120" w:line="276" w:lineRule="auto"/>
+        <w:spacing w:before="180" w:after="100" w:line="276" w:lineRule="auto"/>
         <w:ind w:left="120" w:right="120"/>
       </w:pPr>
       <w:r>
@@ -472,7 +472,7 @@
         </w:pBdr>
         <w:shd w:val="clear" w:color="auto" w:fill="14532D"/>
         <w:bidi/>
-        <w:spacing w:before="240" w:after="120" w:line="276" w:lineRule="auto"/>
+        <w:spacing w:before="180" w:after="100" w:line="276" w:lineRule="auto"/>
         <w:ind w:left="120" w:right="120"/>
       </w:pPr>
       <w:r>
@@ -639,7 +639,7 @@
                 <w:szCs w:val="26"/>
                 <w:rtl/>
               </w:rPr>
-              <w:t xml:space="preserve">أ) 1</w:t>
+              <w:t xml:space="preserve">أ)</w:t>
             </w:r>
           </w:p>
         </w:tc>
@@ -684,7 +684,7 @@
                 <w:sz w:val="26"/>
                 <w:szCs w:val="26"/>
               </w:rPr>
-              <w:t xml:space="preserve">0.75</w:t>
+              <w:t xml:space="preserve">1</w:t>
             </w:r>
           </w:p>
         </w:tc>
@@ -716,7 +716,7 @@
                 <w:szCs w:val="26"/>
                 <w:rtl/>
               </w:rPr>
-              <w:t xml:space="preserve">أ) 2</w:t>
+              <w:t xml:space="preserve">ب) 1</w:t>
             </w:r>
           </w:p>
         </w:tc>
@@ -737,7 +737,7 @@
                 <w:sz w:val="26"/>
                 <w:szCs w:val="26"/>
               </w:rPr>
-              <w:t xml:space="preserve">(x + 4)(x − 4) = x² − 16</w:t>
+              <w:t xml:space="preserve">9x² − 12x + 4 = (3x − 2)²</w:t>
             </w:r>
           </w:p>
         </w:tc>
@@ -761,7 +761,7 @@
                 <w:sz w:val="26"/>
                 <w:szCs w:val="26"/>
               </w:rPr>
-              <w:t xml:space="preserve">0.75</w:t>
+              <w:t xml:space="preserve">1</w:t>
             </w:r>
           </w:p>
         </w:tc>
@@ -793,7 +793,7 @@
                 <w:szCs w:val="26"/>
                 <w:rtl/>
               </w:rPr>
-              <w:t xml:space="preserve">ب) 1</w:t>
+              <w:t xml:space="preserve">ب) 2</w:t>
             </w:r>
           </w:p>
         </w:tc>
@@ -814,7 +814,7 @@
                 <w:sz w:val="26"/>
                 <w:szCs w:val="26"/>
               </w:rPr>
-              <w:t xml:space="preserve">9x² − 12x + 4 = (3x − 2)²</w:t>
+              <w:t xml:space="preserve">25x² − 16 = (5x − 4)(5x + 4)</w:t>
             </w:r>
           </w:p>
         </w:tc>
@@ -838,84 +838,7 @@
                 <w:sz w:val="26"/>
                 <w:szCs w:val="26"/>
               </w:rPr>
-              <w:t xml:space="preserve">0.75</w:t>
-            </w:r>
-          </w:p>
-        </w:tc>
-      </w:tr>
-      <w:tr>
-        <w:trPr>
-          <w:cantSplit/>
-          <w:trHeight w:val="440"/>
-        </w:trPr>
-        <w:tc>
-          <w:tcPr>
-            <w:tcW w:w="1700" w:type="dxa"/>
-            <w:shd w:val="clear" w:color="auto" w:fill="EEF6F1"/>
-            <w:vAlign w:val="center"/>
-          </w:tcPr>
-          <w:p>
-            <w:pPr>
-              <w:bidi/>
-              <w:spacing w:before="0" w:after="0" w:line="276" w:lineRule="auto"/>
-              <w:jc w:val="center"/>
-            </w:pPr>
-            <w:r>
-              <w:rPr>
-                <w:rFonts w:ascii="Calibri" w:eastAsia="Calibri" w:hAnsi="Calibri" w:cs="Arial"/>
-                <w:b/>
-                <w:bCs/>
-                <w:color w:val="14532D"/>
-                <w:sz w:val="26"/>
-                <w:szCs w:val="26"/>
-                <w:rtl/>
-              </w:rPr>
-              <w:t xml:space="preserve">ب) 2</w:t>
-            </w:r>
-          </w:p>
-        </w:tc>
-        <w:tc>
-          <w:tcPr>
-            <w:tcW w:w="6940" w:type="dxa"/>
-            <w:vAlign w:val="center"/>
-          </w:tcPr>
-          <w:p>
-            <w:pPr>
-              <w:bidi w:val="0"/>
-              <w:spacing w:before="0" w:after="20" w:line="276" w:lineRule="auto"/>
-            </w:pPr>
-            <w:r>
-              <w:rPr>
-                <w:rFonts w:ascii="Cambria Math" w:hAnsi="Cambria Math" w:cs="Cambria Math"/>
-                <w:color w:val="1A1A1A"/>
-                <w:sz w:val="26"/>
-                <w:szCs w:val="26"/>
-              </w:rPr>
-              <w:t xml:space="preserve">25x² − 16 = (5x − 4)(5x + 4)</w:t>
-            </w:r>
-          </w:p>
-        </w:tc>
-        <w:tc>
-          <w:tcPr>
-            <w:tcW w:w="1800" w:type="dxa"/>
-            <w:shd w:val="clear" w:color="auto" w:fill="F6E9C6"/>
-            <w:vAlign w:val="center"/>
-          </w:tcPr>
-          <w:p>
-            <w:pPr>
-              <w:bidi w:val="0"/>
-              <w:spacing w:before="0" w:after="0" w:line="276" w:lineRule="auto"/>
-              <w:jc w:val="center"/>
-            </w:pPr>
-            <w:r>
-              <w:rPr>
-                <w:rFonts w:ascii="Cambria Math" w:hAnsi="Cambria Math" w:cs="Cambria Math"/>
-                <w:b/>
-                <w:color w:val="B8860B"/>
-                <w:sz w:val="26"/>
-                <w:szCs w:val="26"/>
-              </w:rPr>
-              <w:t xml:space="preserve">0.75</w:t>
+              <w:t xml:space="preserve">1</w:t>
             </w:r>
           </w:p>
         </w:tc>
@@ -931,7 +854,7 @@
         </w:pBdr>
         <w:shd w:val="clear" w:color="auto" w:fill="14532D"/>
         <w:bidi/>
-        <w:spacing w:before="240" w:after="120" w:line="276" w:lineRule="auto"/>
+        <w:spacing w:before="180" w:after="100" w:line="276" w:lineRule="auto"/>
         <w:ind w:left="120" w:right="120"/>
       </w:pPr>
       <w:r>
@@ -1285,7 +1208,7 @@
         </w:pBdr>
         <w:shd w:val="clear" w:color="auto" w:fill="14532D"/>
         <w:bidi/>
-        <w:spacing w:before="240" w:after="120" w:line="276" w:lineRule="auto"/>
+        <w:spacing w:before="180" w:after="100" w:line="276" w:lineRule="auto"/>
         <w:ind w:left="120" w:right="120"/>
       </w:pPr>
       <w:r>
@@ -1759,7 +1682,7 @@
         </w:pBdr>
         <w:shd w:val="clear" w:color="auto" w:fill="14532D"/>
         <w:bidi/>
-        <w:spacing w:before="240" w:after="120" w:line="276" w:lineRule="auto"/>
+        <w:spacing w:before="180" w:after="100" w:line="276" w:lineRule="auto"/>
         <w:ind w:left="120" w:right="120"/>
       </w:pPr>
       <w:r>
@@ -1986,7 +1909,7 @@
                 <w:sz w:val="26"/>
                 <w:szCs w:val="26"/>
               </w:rPr>
-              <w:t xml:space="preserve">0.5 + 0.5</w:t>
+              <w:t xml:space="preserve">1 + 0.5</w:t>
             </w:r>
           </w:p>
         </w:tc>
@@ -2923,7 +2846,26 @@
           <w:szCs w:val="22"/>
           <w:rtl/>
         </w:rPr>
-        <w:t xml:space="preserve">  (الجدول 1.5 + S 0.5)</w:t>
+        <w:t xml:space="preserve">  (الدراسة 1 + S 0.5)</w:t>
+      </w:r>
+    </w:p>
+    <w:p>
+      <w:pPr>
+        <w:keepNext/>
+        <w:bidi/>
+        <w:spacing w:before="0" w:after="80" w:line="276" w:lineRule="auto"/>
+      </w:pPr>
+      <w:r>
+        <w:rPr>
+          <w:rFonts w:ascii="Calibri" w:eastAsia="Calibri" w:hAnsi="Calibri" w:cs="Arial"/>
+          <w:i/>
+          <w:iCs/>
+          <w:color w:val="1F4E79"/>
+          <w:sz w:val="24"/>
+          <w:szCs w:val="24"/>
+          <w:rtl/>
+        </w:rPr>
+        <w:t xml:space="preserve">يُقبل جدول الإشارات أو أي طريقة صحيحة أخرى.</w:t>
       </w:r>
     </w:p>
     <w:p>
@@ -2936,7 +2878,7 @@
         </w:pBdr>
         <w:shd w:val="clear" w:color="auto" w:fill="14532D"/>
         <w:bidi/>
-        <w:spacing w:before="240" w:after="120" w:line="276" w:lineRule="auto"/>
+        <w:spacing w:before="180" w:after="100" w:line="276" w:lineRule="auto"/>
         <w:ind w:left="120" w:right="120"/>
       </w:pPr>
       <w:r>
@@ -3395,7 +3337,7 @@
         </w:pBdr>
         <w:shd w:val="clear" w:color="auto" w:fill="14532D"/>
         <w:bidi/>
-        <w:spacing w:before="240" w:after="120" w:line="276" w:lineRule="auto"/>
+        <w:spacing w:before="180" w:after="100" w:line="276" w:lineRule="auto"/>
         <w:ind w:left="120" w:right="120"/>
       </w:pPr>
       <w:r>
@@ -3562,7 +3504,7 @@
                 <w:szCs w:val="26"/>
                 <w:rtl/>
               </w:rPr>
-              <w:t xml:space="preserve">أ)</w:t>
+              <w:t xml:space="preserve">الحل</w:t>
             </w:r>
           </w:p>
         </w:tc>
@@ -3669,99 +3611,7 @@
                 <w:sz w:val="26"/>
                 <w:szCs w:val="26"/>
               </w:rPr>
-              <w:t xml:space="preserve">1 + 1 + 0.5</w:t>
-            </w:r>
-          </w:p>
-        </w:tc>
-      </w:tr>
-      <w:tr>
-        <w:trPr>
-          <w:cantSplit/>
-          <w:trHeight w:val="440"/>
-        </w:trPr>
-        <w:tc>
-          <w:tcPr>
-            <w:tcW w:w="1700" w:type="dxa"/>
-            <w:shd w:val="clear" w:color="auto" w:fill="EEF6F1"/>
-            <w:vAlign w:val="center"/>
-          </w:tcPr>
-          <w:p>
-            <w:pPr>
-              <w:bidi/>
-              <w:spacing w:before="0" w:after="0" w:line="276" w:lineRule="auto"/>
-              <w:jc w:val="center"/>
-            </w:pPr>
-            <w:r>
-              <w:rPr>
-                <w:rFonts w:ascii="Calibri" w:eastAsia="Calibri" w:hAnsi="Calibri" w:cs="Arial"/>
-                <w:b/>
-                <w:bCs/>
-                <w:color w:val="14532D"/>
-                <w:sz w:val="26"/>
-                <w:szCs w:val="26"/>
-                <w:rtl/>
-              </w:rPr>
-              <w:t xml:space="preserve">ب)</w:t>
-            </w:r>
-          </w:p>
-        </w:tc>
-        <w:tc>
-          <w:tcPr>
-            <w:tcW w:w="6940" w:type="dxa"/>
-            <w:vAlign w:val="center"/>
-          </w:tcPr>
-          <w:p>
-            <w:pPr>
-              <w:bidi w:val="0"/>
-              <w:spacing w:before="0" w:after="20" w:line="276" w:lineRule="auto"/>
-            </w:pPr>
-            <w:r>
-              <w:rPr>
-                <w:rFonts w:ascii="Cambria Math" w:hAnsi="Cambria Math" w:cs="Cambria Math"/>
-                <w:color w:val="1A1A1A"/>
-                <w:sz w:val="26"/>
-                <w:szCs w:val="26"/>
-              </w:rPr>
-              <w:t xml:space="preserve">2(3) + 1 = 7  ✓</w:t>
-            </w:r>
-          </w:p>
-          <w:p>
-            <w:pPr>
-              <w:bidi w:val="0"/>
-              <w:spacing w:before="0" w:after="20" w:line="276" w:lineRule="auto"/>
-            </w:pPr>
-            <w:r>
-              <w:rPr>
-                <w:rFonts w:ascii="Cambria Math" w:hAnsi="Cambria Math" w:cs="Cambria Math"/>
-                <w:color w:val="1A1A1A"/>
-                <w:sz w:val="26"/>
-                <w:szCs w:val="26"/>
-              </w:rPr>
-              <w:t xml:space="preserve">3 − 1 = 2  ✓</w:t>
-            </w:r>
-          </w:p>
-        </w:tc>
-        <w:tc>
-          <w:tcPr>
-            <w:tcW w:w="1800" w:type="dxa"/>
-            <w:shd w:val="clear" w:color="auto" w:fill="F6E9C6"/>
-            <w:vAlign w:val="center"/>
-          </w:tcPr>
-          <w:p>
-            <w:pPr>
-              <w:bidi w:val="0"/>
-              <w:spacing w:before="0" w:after="0" w:line="276" w:lineRule="auto"/>
-              <w:jc w:val="center"/>
-            </w:pPr>
-            <w:r>
-              <w:rPr>
-                <w:rFonts w:ascii="Cambria Math" w:hAnsi="Cambria Math" w:cs="Cambria Math"/>
-                <w:b/>
-                <w:color w:val="B8860B"/>
-                <w:sz w:val="26"/>
-                <w:szCs w:val="26"/>
-              </w:rPr>
-              <w:t xml:space="preserve">0.5</w:t>
+              <w:t xml:space="preserve">1 + 1 + 1</w:t>
             </w:r>
           </w:p>
         </w:tc>

</xml_diff>

<commit_message>
Redesign Arabic BT2 exam: separate answer sheet, card layout, fewer inequality items
Co-Authored-By: Claude Opus 5.5 <noreply@anthropic.com>
Claude-Session: https://claude.ai/code/session_01PHgZqhLAeFoDhbHXzt9YLK
</commit_message>
<xml_diff>
--- a/exams/BT2-الباريم.docx
+++ b/exams/BT2-الباريم.docx
@@ -716,7 +716,7 @@
                 <w:szCs w:val="26"/>
                 <w:rtl/>
               </w:rPr>
-              <w:t xml:space="preserve">ب) 1</w:t>
+              <w:t xml:space="preserve">ب)</w:t>
             </w:r>
           </w:p>
         </w:tc>
@@ -793,7 +793,7 @@
                 <w:szCs w:val="26"/>
                 <w:rtl/>
               </w:rPr>
-              <w:t xml:space="preserve">ب) 2</w:t>
+              <w:t xml:space="preserve">ج)</w:t>
             </w:r>
           </w:p>
         </w:tc>
@@ -1221,7 +1221,7 @@
           <w:szCs w:val="30"/>
           <w:rtl/>
         </w:rPr>
-        <w:t xml:space="preserve">السؤال الرابع: المجموعات</w:t>
+        <w:t xml:space="preserve">السؤال الرابع: المتراجحات</w:t>
       </w:r>
       <w:r>
         <w:rPr>
@@ -1233,706 +1233,15 @@
           <w:szCs w:val="26"/>
           <w:rtl/>
         </w:rPr>
-        <w:t xml:space="preserve">   —  3 علامات</w:t>
+        <w:t xml:space="preserve">   —  علامتان</w:t>
       </w:r>
     </w:p>
-    <w:tbl>
-      <w:tblPr>
-        <w:bidiVisual/>
-        <w:tblW w:w="10440" w:type="dxa"/>
-        <w:jc w:val="center"/>
-        <w:tblBorders>
-          <w:top w:val="single" w:sz="6" w:space="0" w:color="A7C4B2"/>
-          <w:left w:val="single" w:sz="6" w:space="0" w:color="A7C4B2"/>
-          <w:bottom w:val="single" w:sz="6" w:space="0" w:color="A7C4B2"/>
-          <w:right w:val="single" w:sz="6" w:space="0" w:color="A7C4B2"/>
-          <w:insideH w:val="single" w:sz="6" w:space="0" w:color="A7C4B2"/>
-          <w:insideV w:val="single" w:sz="6" w:space="0" w:color="A7C4B2"/>
-        </w:tblBorders>
-        <w:tblLayout w:type="fixed"/>
-        <w:tblCellMar>
-          <w:top w:w="80" w:type="dxa"/>
-          <w:left w:w="110" w:type="dxa"/>
-          <w:bottom w:w="80" w:type="dxa"/>
-          <w:right w:w="110" w:type="dxa"/>
-        </w:tblCellMar>
-        <w:tblLook w:val="04A0" w:firstRow="1" w:lastRow="0" w:firstColumn="1" w:lastColumn="0" w:noHBand="0" w:noVBand="1"/>
-      </w:tblPr>
-      <w:tblGrid>
-        <w:gridCol w:w="1700"/>
-        <w:gridCol w:w="6940"/>
-        <w:gridCol w:w="1800"/>
-      </w:tblGrid>
-      <w:tr>
-        <w:trPr>
-          <w:cantSplit/>
-          <w:trHeight w:val="420"/>
-          <w:tblHeader/>
-        </w:trPr>
-        <w:tc>
-          <w:tcPr>
-            <w:tcW w:w="1700" w:type="dxa"/>
-            <w:shd w:val="clear" w:color="auto" w:fill="14532D"/>
-            <w:vAlign w:val="center"/>
-          </w:tcPr>
-          <w:p>
-            <w:pPr>
-              <w:bidi/>
-              <w:spacing w:before="0" w:after="0" w:line="276" w:lineRule="auto"/>
-              <w:jc w:val="center"/>
-            </w:pPr>
-            <w:r>
-              <w:rPr>
-                <w:rFonts w:ascii="Calibri" w:eastAsia="Calibri" w:hAnsi="Calibri" w:cs="Arial"/>
-                <w:b/>
-                <w:bCs/>
-                <w:color w:val="FFFFFF"/>
-                <w:sz w:val="24"/>
-                <w:szCs w:val="24"/>
-                <w:rtl/>
-              </w:rPr>
-              <w:t xml:space="preserve">البند</w:t>
-            </w:r>
-          </w:p>
-        </w:tc>
-        <w:tc>
-          <w:tcPr>
-            <w:tcW w:w="6940" w:type="dxa"/>
-            <w:shd w:val="clear" w:color="auto" w:fill="14532D"/>
-            <w:vAlign w:val="center"/>
-          </w:tcPr>
-          <w:p>
-            <w:pPr>
-              <w:bidi/>
-              <w:spacing w:before="0" w:after="0" w:line="276" w:lineRule="auto"/>
-              <w:jc w:val="center"/>
-            </w:pPr>
-            <w:r>
-              <w:rPr>
-                <w:rFonts w:ascii="Calibri" w:eastAsia="Calibri" w:hAnsi="Calibri" w:cs="Arial"/>
-                <w:b/>
-                <w:bCs/>
-                <w:color w:val="FFFFFF"/>
-                <w:sz w:val="24"/>
-                <w:szCs w:val="24"/>
-                <w:rtl/>
-              </w:rPr>
-              <w:t xml:space="preserve">الإجابة</w:t>
-            </w:r>
-          </w:p>
-        </w:tc>
-        <w:tc>
-          <w:tcPr>
-            <w:tcW w:w="1800" w:type="dxa"/>
-            <w:shd w:val="clear" w:color="auto" w:fill="B8860B"/>
-            <w:vAlign w:val="center"/>
-          </w:tcPr>
-          <w:p>
-            <w:pPr>
-              <w:bidi/>
-              <w:spacing w:before="0" w:after="0" w:line="276" w:lineRule="auto"/>
-              <w:jc w:val="center"/>
-            </w:pPr>
-            <w:r>
-              <w:rPr>
-                <w:rFonts w:ascii="Calibri" w:eastAsia="Calibri" w:hAnsi="Calibri" w:cs="Arial"/>
-                <w:b/>
-                <w:bCs/>
-                <w:color w:val="FFFFFF"/>
-                <w:sz w:val="24"/>
-                <w:szCs w:val="24"/>
-                <w:rtl/>
-              </w:rPr>
-              <w:t xml:space="preserve">العلامة</w:t>
-            </w:r>
-          </w:p>
-        </w:tc>
-      </w:tr>
-      <w:tr>
-        <w:trPr>
-          <w:cantSplit/>
-          <w:trHeight w:val="440"/>
-        </w:trPr>
-        <w:tc>
-          <w:tcPr>
-            <w:tcW w:w="1700" w:type="dxa"/>
-            <w:shd w:val="clear" w:color="auto" w:fill="EEF6F1"/>
-            <w:vAlign w:val="center"/>
-          </w:tcPr>
-          <w:p>
-            <w:pPr>
-              <w:bidi/>
-              <w:spacing w:before="0" w:after="0" w:line="276" w:lineRule="auto"/>
-              <w:jc w:val="center"/>
-            </w:pPr>
-            <w:r>
-              <w:rPr>
-                <w:rFonts w:ascii="Calibri" w:eastAsia="Calibri" w:hAnsi="Calibri" w:cs="Arial"/>
-                <w:b/>
-                <w:bCs/>
-                <w:color w:val="14532D"/>
-                <w:sz w:val="26"/>
-                <w:szCs w:val="26"/>
-                <w:rtl/>
-              </w:rPr>
-              <w:t xml:space="preserve">أ)</w:t>
-            </w:r>
-          </w:p>
-        </w:tc>
-        <w:tc>
-          <w:tcPr>
-            <w:tcW w:w="6940" w:type="dxa"/>
-            <w:vAlign w:val="center"/>
-          </w:tcPr>
-          <w:p>
-            <w:pPr>
-              <w:bidi w:val="0"/>
-              <w:spacing w:before="0" w:after="20" w:line="276" w:lineRule="auto"/>
-            </w:pPr>
-            <w:r>
-              <w:rPr>
-                <w:rFonts w:ascii="Cambria Math" w:hAnsi="Cambria Math" w:cs="Cambria Math"/>
-                <w:color w:val="1A1A1A"/>
-                <w:sz w:val="26"/>
-                <w:szCs w:val="26"/>
-              </w:rPr>
-              <w:t xml:space="preserve">A ∩ B = {2, 4, 6}</w:t>
-            </w:r>
-          </w:p>
-        </w:tc>
-        <w:tc>
-          <w:tcPr>
-            <w:tcW w:w="1800" w:type="dxa"/>
-            <w:shd w:val="clear" w:color="auto" w:fill="F6E9C6"/>
-            <w:vAlign w:val="center"/>
-          </w:tcPr>
-          <w:p>
-            <w:pPr>
-              <w:bidi w:val="0"/>
-              <w:spacing w:before="0" w:after="0" w:line="276" w:lineRule="auto"/>
-              <w:jc w:val="center"/>
-            </w:pPr>
-            <w:r>
-              <w:rPr>
-                <w:rFonts w:ascii="Cambria Math" w:hAnsi="Cambria Math" w:cs="Cambria Math"/>
-                <w:b/>
-                <w:color w:val="B8860B"/>
-                <w:sz w:val="26"/>
-                <w:szCs w:val="26"/>
-              </w:rPr>
-              <w:t xml:space="preserve">0.75</w:t>
-            </w:r>
-          </w:p>
-        </w:tc>
-      </w:tr>
-      <w:tr>
-        <w:trPr>
-          <w:cantSplit/>
-          <w:trHeight w:val="440"/>
-        </w:trPr>
-        <w:tc>
-          <w:tcPr>
-            <w:tcW w:w="1700" w:type="dxa"/>
-            <w:shd w:val="clear" w:color="auto" w:fill="EEF6F1"/>
-            <w:vAlign w:val="center"/>
-          </w:tcPr>
-          <w:p>
-            <w:pPr>
-              <w:bidi/>
-              <w:spacing w:before="0" w:after="0" w:line="276" w:lineRule="auto"/>
-              <w:jc w:val="center"/>
-            </w:pPr>
-            <w:r>
-              <w:rPr>
-                <w:rFonts w:ascii="Calibri" w:eastAsia="Calibri" w:hAnsi="Calibri" w:cs="Arial"/>
-                <w:b/>
-                <w:bCs/>
-                <w:color w:val="14532D"/>
-                <w:sz w:val="26"/>
-                <w:szCs w:val="26"/>
-                <w:rtl/>
-              </w:rPr>
-              <w:t xml:space="preserve">ب)</w:t>
-            </w:r>
-          </w:p>
-        </w:tc>
-        <w:tc>
-          <w:tcPr>
-            <w:tcW w:w="6940" w:type="dxa"/>
-            <w:vAlign w:val="center"/>
-          </w:tcPr>
-          <w:p>
-            <w:pPr>
-              <w:bidi w:val="0"/>
-              <w:spacing w:before="0" w:after="20" w:line="276" w:lineRule="auto"/>
-            </w:pPr>
-            <w:r>
-              <w:rPr>
-                <w:rFonts w:ascii="Cambria Math" w:hAnsi="Cambria Math" w:cs="Cambria Math"/>
-                <w:color w:val="1A1A1A"/>
-                <w:sz w:val="26"/>
-                <w:szCs w:val="26"/>
-              </w:rPr>
-              <w:t xml:space="preserve">A ∪ B = {1, 2, 3, 4, 6, 8, 10}</w:t>
-            </w:r>
-          </w:p>
-        </w:tc>
-        <w:tc>
-          <w:tcPr>
-            <w:tcW w:w="1800" w:type="dxa"/>
-            <w:shd w:val="clear" w:color="auto" w:fill="F6E9C6"/>
-            <w:vAlign w:val="center"/>
-          </w:tcPr>
-          <w:p>
-            <w:pPr>
-              <w:bidi w:val="0"/>
-              <w:spacing w:before="0" w:after="0" w:line="276" w:lineRule="auto"/>
-              <w:jc w:val="center"/>
-            </w:pPr>
-            <w:r>
-              <w:rPr>
-                <w:rFonts w:ascii="Cambria Math" w:hAnsi="Cambria Math" w:cs="Cambria Math"/>
-                <w:b/>
-                <w:color w:val="B8860B"/>
-                <w:sz w:val="26"/>
-                <w:szCs w:val="26"/>
-              </w:rPr>
-              <w:t xml:space="preserve">0.75</w:t>
-            </w:r>
-          </w:p>
-        </w:tc>
-      </w:tr>
-      <w:tr>
-        <w:trPr>
-          <w:cantSplit/>
-          <w:trHeight w:val="440"/>
-        </w:trPr>
-        <w:tc>
-          <w:tcPr>
-            <w:tcW w:w="1700" w:type="dxa"/>
-            <w:shd w:val="clear" w:color="auto" w:fill="EEF6F1"/>
-            <w:vAlign w:val="center"/>
-          </w:tcPr>
-          <w:p>
-            <w:pPr>
-              <w:bidi/>
-              <w:spacing w:before="0" w:after="0" w:line="276" w:lineRule="auto"/>
-              <w:jc w:val="center"/>
-            </w:pPr>
-            <w:r>
-              <w:rPr>
-                <w:rFonts w:ascii="Calibri" w:eastAsia="Calibri" w:hAnsi="Calibri" w:cs="Arial"/>
-                <w:b/>
-                <w:bCs/>
-                <w:color w:val="14532D"/>
-                <w:sz w:val="26"/>
-                <w:szCs w:val="26"/>
-                <w:rtl/>
-              </w:rPr>
-              <w:t xml:space="preserve">ج)</w:t>
-            </w:r>
-          </w:p>
-        </w:tc>
-        <w:tc>
-          <w:tcPr>
-            <w:tcW w:w="6940" w:type="dxa"/>
-            <w:vAlign w:val="center"/>
-          </w:tcPr>
-          <w:p>
-            <w:pPr>
-              <w:bidi w:val="0"/>
-              <w:spacing w:before="0" w:after="20" w:line="276" w:lineRule="auto"/>
-            </w:pPr>
-            <w:r>
-              <w:rPr>
-                <w:rFonts w:ascii="Cambria Math" w:hAnsi="Cambria Math" w:cs="Cambria Math"/>
-                <w:color w:val="1A1A1A"/>
-                <w:sz w:val="26"/>
-                <w:szCs w:val="26"/>
-              </w:rPr>
-              <w:t xml:space="preserve">Ā = {5, 7, 8, 9, 10}</w:t>
-            </w:r>
-          </w:p>
-        </w:tc>
-        <w:tc>
-          <w:tcPr>
-            <w:tcW w:w="1800" w:type="dxa"/>
-            <w:shd w:val="clear" w:color="auto" w:fill="F6E9C6"/>
-            <w:vAlign w:val="center"/>
-          </w:tcPr>
-          <w:p>
-            <w:pPr>
-              <w:bidi w:val="0"/>
-              <w:spacing w:before="0" w:after="0" w:line="276" w:lineRule="auto"/>
-              <w:jc w:val="center"/>
-            </w:pPr>
-            <w:r>
-              <w:rPr>
-                <w:rFonts w:ascii="Cambria Math" w:hAnsi="Cambria Math" w:cs="Cambria Math"/>
-                <w:b/>
-                <w:color w:val="B8860B"/>
-                <w:sz w:val="26"/>
-                <w:szCs w:val="26"/>
-              </w:rPr>
-              <w:t xml:space="preserve">0.75</w:t>
-            </w:r>
-          </w:p>
-        </w:tc>
-      </w:tr>
-      <w:tr>
-        <w:trPr>
-          <w:cantSplit/>
-          <w:trHeight w:val="440"/>
-        </w:trPr>
-        <w:tc>
-          <w:tcPr>
-            <w:tcW w:w="1700" w:type="dxa"/>
-            <w:shd w:val="clear" w:color="auto" w:fill="EEF6F1"/>
-            <w:vAlign w:val="center"/>
-          </w:tcPr>
-          <w:p>
-            <w:pPr>
-              <w:bidi/>
-              <w:spacing w:before="0" w:after="0" w:line="276" w:lineRule="auto"/>
-              <w:jc w:val="center"/>
-            </w:pPr>
-            <w:r>
-              <w:rPr>
-                <w:rFonts w:ascii="Calibri" w:eastAsia="Calibri" w:hAnsi="Calibri" w:cs="Arial"/>
-                <w:b/>
-                <w:bCs/>
-                <w:color w:val="14532D"/>
-                <w:sz w:val="26"/>
-                <w:szCs w:val="26"/>
-                <w:rtl/>
-              </w:rPr>
-              <w:t xml:space="preserve">د)</w:t>
-            </w:r>
-          </w:p>
-        </w:tc>
-        <w:tc>
-          <w:tcPr>
-            <w:tcW w:w="6940" w:type="dxa"/>
-            <w:vAlign w:val="center"/>
-          </w:tcPr>
-          <w:p>
-            <w:pPr>
-              <w:bidi w:val="0"/>
-              <w:spacing w:before="0" w:after="20" w:line="276" w:lineRule="auto"/>
-            </w:pPr>
-            <w:r>
-              <w:rPr>
-                <w:rFonts w:ascii="Cambria Math" w:hAnsi="Cambria Math" w:cs="Cambria Math"/>
-                <w:color w:val="1A1A1A"/>
-                <w:sz w:val="26"/>
-                <w:szCs w:val="26"/>
-              </w:rPr>
-              <w:t xml:space="preserve">B̄ = {1, 3, 5, 7, 9}</w:t>
-            </w:r>
-          </w:p>
-          <w:p>
-            <w:pPr>
-              <w:bidi w:val="0"/>
-              <w:spacing w:before="0" w:after="20" w:line="276" w:lineRule="auto"/>
-            </w:pPr>
-            <w:r>
-              <w:rPr>
-                <w:rFonts w:ascii="Cambria Math" w:hAnsi="Cambria Math" w:cs="Cambria Math"/>
-                <w:color w:val="1A1A1A"/>
-                <w:sz w:val="26"/>
-                <w:szCs w:val="26"/>
-              </w:rPr>
-              <w:t xml:space="preserve">Ā ∩ B̄ = {5, 7, 9}</w:t>
-            </w:r>
-          </w:p>
-        </w:tc>
-        <w:tc>
-          <w:tcPr>
-            <w:tcW w:w="1800" w:type="dxa"/>
-            <w:shd w:val="clear" w:color="auto" w:fill="F6E9C6"/>
-            <w:vAlign w:val="center"/>
-          </w:tcPr>
-          <w:p>
-            <w:pPr>
-              <w:bidi w:val="0"/>
-              <w:spacing w:before="0" w:after="0" w:line="276" w:lineRule="auto"/>
-              <w:jc w:val="center"/>
-            </w:pPr>
-            <w:r>
-              <w:rPr>
-                <w:rFonts w:ascii="Cambria Math" w:hAnsi="Cambria Math" w:cs="Cambria Math"/>
-                <w:b/>
-                <w:color w:val="B8860B"/>
-                <w:sz w:val="26"/>
-                <w:szCs w:val="26"/>
-              </w:rPr>
-              <w:t xml:space="preserve">0.75</w:t>
-            </w:r>
-          </w:p>
-        </w:tc>
-      </w:tr>
-    </w:tbl>
-    <w:p>
-      <w:pPr>
-        <w:keepNext/>
-        <w:pBdr>
-          <w:top w:val="single" w:sz="18" w:space="3" w:color="14532D"/>
-          <w:bottom w:val="single" w:sz="18" w:space="3" w:color="14532D"/>
-          <w:right w:val="single" w:sz="48" w:space="6" w:color="B8860B"/>
-        </w:pBdr>
-        <w:shd w:val="clear" w:color="auto" w:fill="14532D"/>
-        <w:bidi/>
-        <w:spacing w:before="180" w:after="100" w:line="276" w:lineRule="auto"/>
-        <w:ind w:left="120" w:right="120"/>
-      </w:pPr>
-      <w:r>
-        <w:rPr>
-          <w:rFonts w:ascii="Calibri" w:eastAsia="Calibri" w:hAnsi="Calibri" w:cs="Arial"/>
-          <w:b/>
-          <w:bCs/>
-          <w:color w:val="FFFFFF"/>
-          <w:sz w:val="30"/>
-          <w:szCs w:val="30"/>
-          <w:rtl/>
-        </w:rPr>
-        <w:t xml:space="preserve">السؤال الخامس: المتراجحات</w:t>
-      </w:r>
-      <w:r>
-        <w:rPr>
-          <w:rFonts w:ascii="Calibri" w:eastAsia="Calibri" w:hAnsi="Calibri" w:cs="Arial"/>
-          <w:b/>
-          <w:bCs/>
-          <w:color w:val="F6D98B"/>
-          <w:sz w:val="26"/>
-          <w:szCs w:val="26"/>
-          <w:rtl/>
-        </w:rPr>
-        <w:t xml:space="preserve">   —  3 علامات</w:t>
-      </w:r>
-    </w:p>
-    <w:tbl>
-      <w:tblPr>
-        <w:bidiVisual/>
-        <w:tblW w:w="10440" w:type="dxa"/>
-        <w:jc w:val="center"/>
-        <w:tblBorders>
-          <w:top w:val="single" w:sz="6" w:space="0" w:color="A7C4B2"/>
-          <w:left w:val="single" w:sz="6" w:space="0" w:color="A7C4B2"/>
-          <w:bottom w:val="single" w:sz="6" w:space="0" w:color="A7C4B2"/>
-          <w:right w:val="single" w:sz="6" w:space="0" w:color="A7C4B2"/>
-          <w:insideH w:val="single" w:sz="6" w:space="0" w:color="A7C4B2"/>
-          <w:insideV w:val="single" w:sz="6" w:space="0" w:color="A7C4B2"/>
-        </w:tblBorders>
-        <w:tblLayout w:type="fixed"/>
-        <w:tblCellMar>
-          <w:top w:w="80" w:type="dxa"/>
-          <w:left w:w="110" w:type="dxa"/>
-          <w:bottom w:w="80" w:type="dxa"/>
-          <w:right w:w="110" w:type="dxa"/>
-        </w:tblCellMar>
-        <w:tblLook w:val="04A0" w:firstRow="1" w:lastRow="0" w:firstColumn="1" w:lastColumn="0" w:noHBand="0" w:noVBand="1"/>
-      </w:tblPr>
-      <w:tblGrid>
-        <w:gridCol w:w="1700"/>
-        <w:gridCol w:w="6940"/>
-        <w:gridCol w:w="1800"/>
-      </w:tblGrid>
-      <w:tr>
-        <w:trPr>
-          <w:cantSplit/>
-          <w:trHeight w:val="420"/>
-          <w:tblHeader/>
-        </w:trPr>
-        <w:tc>
-          <w:tcPr>
-            <w:tcW w:w="1700" w:type="dxa"/>
-            <w:shd w:val="clear" w:color="auto" w:fill="14532D"/>
-            <w:vAlign w:val="center"/>
-          </w:tcPr>
-          <w:p>
-            <w:pPr>
-              <w:bidi/>
-              <w:spacing w:before="0" w:after="0" w:line="276" w:lineRule="auto"/>
-              <w:jc w:val="center"/>
-            </w:pPr>
-            <w:r>
-              <w:rPr>
-                <w:rFonts w:ascii="Calibri" w:eastAsia="Calibri" w:hAnsi="Calibri" w:cs="Arial"/>
-                <w:b/>
-                <w:bCs/>
-                <w:color w:val="FFFFFF"/>
-                <w:sz w:val="24"/>
-                <w:szCs w:val="24"/>
-                <w:rtl/>
-              </w:rPr>
-              <w:t xml:space="preserve">البند</w:t>
-            </w:r>
-          </w:p>
-        </w:tc>
-        <w:tc>
-          <w:tcPr>
-            <w:tcW w:w="6940" w:type="dxa"/>
-            <w:shd w:val="clear" w:color="auto" w:fill="14532D"/>
-            <w:vAlign w:val="center"/>
-          </w:tcPr>
-          <w:p>
-            <w:pPr>
-              <w:bidi/>
-              <w:spacing w:before="0" w:after="0" w:line="276" w:lineRule="auto"/>
-              <w:jc w:val="center"/>
-            </w:pPr>
-            <w:r>
-              <w:rPr>
-                <w:rFonts w:ascii="Calibri" w:eastAsia="Calibri" w:hAnsi="Calibri" w:cs="Arial"/>
-                <w:b/>
-                <w:bCs/>
-                <w:color w:val="FFFFFF"/>
-                <w:sz w:val="24"/>
-                <w:szCs w:val="24"/>
-                <w:rtl/>
-              </w:rPr>
-              <w:t xml:space="preserve">الإجابة</w:t>
-            </w:r>
-          </w:p>
-        </w:tc>
-        <w:tc>
-          <w:tcPr>
-            <w:tcW w:w="1800" w:type="dxa"/>
-            <w:shd w:val="clear" w:color="auto" w:fill="B8860B"/>
-            <w:vAlign w:val="center"/>
-          </w:tcPr>
-          <w:p>
-            <w:pPr>
-              <w:bidi/>
-              <w:spacing w:before="0" w:after="0" w:line="276" w:lineRule="auto"/>
-              <w:jc w:val="center"/>
-            </w:pPr>
-            <w:r>
-              <w:rPr>
-                <w:rFonts w:ascii="Calibri" w:eastAsia="Calibri" w:hAnsi="Calibri" w:cs="Arial"/>
-                <w:b/>
-                <w:bCs/>
-                <w:color w:val="FFFFFF"/>
-                <w:sz w:val="24"/>
-                <w:szCs w:val="24"/>
-                <w:rtl/>
-              </w:rPr>
-              <w:t xml:space="preserve">العلامة</w:t>
-            </w:r>
-          </w:p>
-        </w:tc>
-      </w:tr>
-      <w:tr>
-        <w:trPr>
-          <w:cantSplit/>
-          <w:trHeight w:val="440"/>
-        </w:trPr>
-        <w:tc>
-          <w:tcPr>
-            <w:tcW w:w="1700" w:type="dxa"/>
-            <w:shd w:val="clear" w:color="auto" w:fill="EEF6F1"/>
-            <w:vAlign w:val="center"/>
-          </w:tcPr>
-          <w:p>
-            <w:pPr>
-              <w:bidi/>
-              <w:spacing w:before="0" w:after="0" w:line="276" w:lineRule="auto"/>
-              <w:jc w:val="center"/>
-            </w:pPr>
-            <w:r>
-              <w:rPr>
-                <w:rFonts w:ascii="Calibri" w:eastAsia="Calibri" w:hAnsi="Calibri" w:cs="Arial"/>
-                <w:b/>
-                <w:bCs/>
-                <w:color w:val="14532D"/>
-                <w:sz w:val="26"/>
-                <w:szCs w:val="26"/>
-                <w:rtl/>
-              </w:rPr>
-              <w:t xml:space="preserve">أ)</w:t>
-            </w:r>
-          </w:p>
-        </w:tc>
-        <w:tc>
-          <w:tcPr>
-            <w:tcW w:w="6940" w:type="dxa"/>
-            <w:vAlign w:val="center"/>
-          </w:tcPr>
-          <w:p>
-            <w:pPr>
-              <w:bidi w:val="0"/>
-              <w:spacing w:before="0" w:after="20" w:line="276" w:lineRule="auto"/>
-            </w:pPr>
-            <w:r>
-              <w:rPr>
-                <w:rFonts w:ascii="Cambria Math" w:hAnsi="Cambria Math" w:cs="Cambria Math"/>
-                <w:color w:val="1A1A1A"/>
-                <w:sz w:val="26"/>
-                <w:szCs w:val="26"/>
-              </w:rPr>
-              <w:t xml:space="preserve">3x ≤ 12  ⇒  x ≤ 4</w:t>
-            </w:r>
-          </w:p>
-          <w:p>
-            <w:pPr>
-              <w:bidi w:val="0"/>
-              <w:spacing w:before="0" w:after="20" w:line="276" w:lineRule="auto"/>
-            </w:pPr>
-            <w:r>
-              <w:rPr>
-                <w:rFonts w:ascii="Cambria Math" w:hAnsi="Cambria Math" w:cs="Cambria Math"/>
-                <w:color w:val="1A1A1A"/>
-                <w:sz w:val="26"/>
-                <w:szCs w:val="26"/>
-              </w:rPr>
-              <w:t xml:space="preserve">S = ]−∞ ; 4]</w:t>
-            </w:r>
-          </w:p>
-        </w:tc>
-        <w:tc>
-          <w:tcPr>
-            <w:tcW w:w="1800" w:type="dxa"/>
-            <w:shd w:val="clear" w:color="auto" w:fill="F6E9C6"/>
-            <w:vAlign w:val="center"/>
-          </w:tcPr>
-          <w:p>
-            <w:pPr>
-              <w:bidi w:val="0"/>
-              <w:spacing w:before="0" w:after="0" w:line="276" w:lineRule="auto"/>
-              <w:jc w:val="center"/>
-            </w:pPr>
-            <w:r>
-              <w:rPr>
-                <w:rFonts w:ascii="Cambria Math" w:hAnsi="Cambria Math" w:cs="Cambria Math"/>
-                <w:b/>
-                <w:color w:val="B8860B"/>
-                <w:sz w:val="26"/>
-                <w:szCs w:val="26"/>
-              </w:rPr>
-              <w:t xml:space="preserve">1 + 0.5</w:t>
-            </w:r>
-          </w:p>
-        </w:tc>
-      </w:tr>
-    </w:tbl>
     <w:p>
       <w:pPr>
         <w:keepNext/>
         <w:bidi/>
         <w:spacing w:before="120" w:after="60" w:line="276" w:lineRule="auto"/>
       </w:pPr>
-      <w:r>
-        <w:rPr>
-          <w:rFonts w:ascii="Calibri" w:eastAsia="Calibri" w:hAnsi="Calibri" w:cs="Arial"/>
-          <w:b/>
-          <w:bCs/>
-          <w:color w:val="14532D"/>
-          <w:sz w:val="28"/>
-          <w:szCs w:val="28"/>
-          <w:rtl/>
-        </w:rPr>
-        <w:t xml:space="preserve">ب)  </w:t>
-      </w:r>
       <m:oMath>
         <m:sSup>
           <m:sSupPr>
@@ -2846,7 +2155,7 @@
           <w:szCs w:val="22"/>
           <w:rtl/>
         </w:rPr>
-        <w:t xml:space="preserve">  (الدراسة 1 + S 0.5)</w:t>
+        <w:t xml:space="preserve">  (الدراسة 1.5 + S 0.5)</w:t>
       </w:r>
     </w:p>
     <w:p>
@@ -2891,7 +2200,7 @@
           <w:szCs w:val="30"/>
           <w:rtl/>
         </w:rPr>
-        <w:t xml:space="preserve">السؤال السادس: اختر مجموعة الحلول الصحيحة</w:t>
+        <w:t xml:space="preserve">السؤال الخامس: اختر مجموعة الحلول الصحيحة</w:t>
       </w:r>
       <w:r>
         <w:rPr>
@@ -3090,7 +2399,7 @@
                 <w:sz w:val="26"/>
                 <w:szCs w:val="26"/>
               </w:rPr>
-              <w:t xml:space="preserve">0.75</w:t>
+              <w:t xml:space="preserve">1</w:t>
             </w:r>
           </w:p>
         </w:tc>
@@ -3122,7 +2431,7 @@
                 <w:szCs w:val="26"/>
                 <w:rtl/>
               </w:rPr>
-              <w:t xml:space="preserve">2 – ج)</w:t>
+              <w:t xml:space="preserve">2 – ب)</w:t>
             </w:r>
           </w:p>
         </w:tc>
@@ -3143,7 +2452,7 @@
                 <w:sz w:val="26"/>
                 <w:szCs w:val="26"/>
               </w:rPr>
-              <w:t xml:space="preserve">]−∞ ; 3[</w:t>
+              <w:t xml:space="preserve">]−3 ; 3[</w:t>
             </w:r>
           </w:p>
         </w:tc>
@@ -3167,7 +2476,7 @@
                 <w:sz w:val="26"/>
                 <w:szCs w:val="26"/>
               </w:rPr>
-              <w:t xml:space="preserve">0.75</w:t>
+              <w:t xml:space="preserve">1</w:t>
             </w:r>
           </w:p>
         </w:tc>
@@ -3199,7 +2508,7 @@
                 <w:szCs w:val="26"/>
                 <w:rtl/>
               </w:rPr>
-              <w:t xml:space="preserve">3 – ب)</w:t>
+              <w:t xml:space="preserve">3 – ج)</w:t>
             </w:r>
           </w:p>
         </w:tc>
@@ -3220,7 +2529,7 @@
                 <w:sz w:val="26"/>
                 <w:szCs w:val="26"/>
               </w:rPr>
-              <w:t xml:space="preserve">]−3 ; 3[</w:t>
+              <w:t xml:space="preserve">]−∞ ; −2] ∪ [2 ; +∞[</w:t>
             </w:r>
           </w:p>
         </w:tc>
@@ -3244,7 +2553,158 @@
                 <w:sz w:val="26"/>
                 <w:szCs w:val="26"/>
               </w:rPr>
-              <w:t xml:space="preserve">0.75</w:t>
+              <w:t xml:space="preserve">1</w:t>
+            </w:r>
+          </w:p>
+        </w:tc>
+      </w:tr>
+    </w:tbl>
+    <w:p>
+      <w:pPr>
+        <w:keepNext/>
+        <w:pBdr>
+          <w:top w:val="single" w:sz="18" w:space="3" w:color="14532D"/>
+          <w:bottom w:val="single" w:sz="18" w:space="3" w:color="14532D"/>
+          <w:right w:val="single" w:sz="48" w:space="6" w:color="B8860B"/>
+        </w:pBdr>
+        <w:shd w:val="clear" w:color="auto" w:fill="14532D"/>
+        <w:bidi/>
+        <w:spacing w:before="180" w:after="100" w:line="276" w:lineRule="auto"/>
+        <w:ind w:left="120" w:right="120"/>
+      </w:pPr>
+      <w:r>
+        <w:rPr>
+          <w:rFonts w:ascii="Calibri" w:eastAsia="Calibri" w:hAnsi="Calibri" w:cs="Arial"/>
+          <w:b/>
+          <w:bCs/>
+          <w:color w:val="FFFFFF"/>
+          <w:sz w:val="30"/>
+          <w:szCs w:val="30"/>
+          <w:rtl/>
+        </w:rPr>
+        <w:t xml:space="preserve">السؤال السادس: المجموعات</w:t>
+      </w:r>
+      <w:r>
+        <w:rPr>
+          <w:rFonts w:ascii="Calibri" w:eastAsia="Calibri" w:hAnsi="Calibri" w:cs="Arial"/>
+          <w:b/>
+          <w:bCs/>
+          <w:color w:val="F6D98B"/>
+          <w:sz w:val="26"/>
+          <w:szCs w:val="26"/>
+          <w:rtl/>
+        </w:rPr>
+        <w:t xml:space="preserve">   —  4 علامات</w:t>
+      </w:r>
+    </w:p>
+    <w:tbl>
+      <w:tblPr>
+        <w:bidiVisual/>
+        <w:tblW w:w="10440" w:type="dxa"/>
+        <w:jc w:val="center"/>
+        <w:tblBorders>
+          <w:top w:val="single" w:sz="6" w:space="0" w:color="A7C4B2"/>
+          <w:left w:val="single" w:sz="6" w:space="0" w:color="A7C4B2"/>
+          <w:bottom w:val="single" w:sz="6" w:space="0" w:color="A7C4B2"/>
+          <w:right w:val="single" w:sz="6" w:space="0" w:color="A7C4B2"/>
+          <w:insideH w:val="single" w:sz="6" w:space="0" w:color="A7C4B2"/>
+          <w:insideV w:val="single" w:sz="6" w:space="0" w:color="A7C4B2"/>
+        </w:tblBorders>
+        <w:tblLayout w:type="fixed"/>
+        <w:tblCellMar>
+          <w:top w:w="80" w:type="dxa"/>
+          <w:left w:w="110" w:type="dxa"/>
+          <w:bottom w:w="80" w:type="dxa"/>
+          <w:right w:w="110" w:type="dxa"/>
+        </w:tblCellMar>
+        <w:tblLook w:val="04A0" w:firstRow="1" w:lastRow="0" w:firstColumn="1" w:lastColumn="0" w:noHBand="0" w:noVBand="1"/>
+      </w:tblPr>
+      <w:tblGrid>
+        <w:gridCol w:w="1700"/>
+        <w:gridCol w:w="6940"/>
+        <w:gridCol w:w="1800"/>
+      </w:tblGrid>
+      <w:tr>
+        <w:trPr>
+          <w:cantSplit/>
+          <w:trHeight w:val="420"/>
+          <w:tblHeader/>
+        </w:trPr>
+        <w:tc>
+          <w:tcPr>
+            <w:tcW w:w="1700" w:type="dxa"/>
+            <w:shd w:val="clear" w:color="auto" w:fill="14532D"/>
+            <w:vAlign w:val="center"/>
+          </w:tcPr>
+          <w:p>
+            <w:pPr>
+              <w:bidi/>
+              <w:spacing w:before="0" w:after="0" w:line="276" w:lineRule="auto"/>
+              <w:jc w:val="center"/>
+            </w:pPr>
+            <w:r>
+              <w:rPr>
+                <w:rFonts w:ascii="Calibri" w:eastAsia="Calibri" w:hAnsi="Calibri" w:cs="Arial"/>
+                <w:b/>
+                <w:bCs/>
+                <w:color w:val="FFFFFF"/>
+                <w:sz w:val="24"/>
+                <w:szCs w:val="24"/>
+                <w:rtl/>
+              </w:rPr>
+              <w:t xml:space="preserve">البند</w:t>
+            </w:r>
+          </w:p>
+        </w:tc>
+        <w:tc>
+          <w:tcPr>
+            <w:tcW w:w="6940" w:type="dxa"/>
+            <w:shd w:val="clear" w:color="auto" w:fill="14532D"/>
+            <w:vAlign w:val="center"/>
+          </w:tcPr>
+          <w:p>
+            <w:pPr>
+              <w:bidi/>
+              <w:spacing w:before="0" w:after="0" w:line="276" w:lineRule="auto"/>
+              <w:jc w:val="center"/>
+            </w:pPr>
+            <w:r>
+              <w:rPr>
+                <w:rFonts w:ascii="Calibri" w:eastAsia="Calibri" w:hAnsi="Calibri" w:cs="Arial"/>
+                <w:b/>
+                <w:bCs/>
+                <w:color w:val="FFFFFF"/>
+                <w:sz w:val="24"/>
+                <w:szCs w:val="24"/>
+                <w:rtl/>
+              </w:rPr>
+              <w:t xml:space="preserve">الإجابة</w:t>
+            </w:r>
+          </w:p>
+        </w:tc>
+        <w:tc>
+          <w:tcPr>
+            <w:tcW w:w="1800" w:type="dxa"/>
+            <w:shd w:val="clear" w:color="auto" w:fill="B8860B"/>
+            <w:vAlign w:val="center"/>
+          </w:tcPr>
+          <w:p>
+            <w:pPr>
+              <w:bidi/>
+              <w:spacing w:before="0" w:after="0" w:line="276" w:lineRule="auto"/>
+              <w:jc w:val="center"/>
+            </w:pPr>
+            <w:r>
+              <w:rPr>
+                <w:rFonts w:ascii="Calibri" w:eastAsia="Calibri" w:hAnsi="Calibri" w:cs="Arial"/>
+                <w:b/>
+                <w:bCs/>
+                <w:color w:val="FFFFFF"/>
+                <w:sz w:val="24"/>
+                <w:szCs w:val="24"/>
+                <w:rtl/>
+              </w:rPr>
+              <w:t xml:space="preserve">العلامة</w:t>
             </w:r>
           </w:p>
         </w:tc>
@@ -3276,7 +2736,7 @@
                 <w:szCs w:val="26"/>
                 <w:rtl/>
               </w:rPr>
-              <w:t xml:space="preserve">4 – ج)</w:t>
+              <w:t xml:space="preserve">أ)</w:t>
             </w:r>
           </w:p>
         </w:tc>
@@ -3297,7 +2757,7 @@
                 <w:sz w:val="26"/>
                 <w:szCs w:val="26"/>
               </w:rPr>
-              <w:t xml:space="preserve">]−∞ ; −2] ∪ [2 ; +∞[</w:t>
+              <w:t xml:space="preserve">A ∩ B = {2, 4, 6}</w:t>
             </w:r>
           </w:p>
         </w:tc>
@@ -3321,7 +2781,253 @@
                 <w:sz w:val="26"/>
                 <w:szCs w:val="26"/>
               </w:rPr>
-              <w:t xml:space="preserve">0.75</w:t>
+              <w:t xml:space="preserve">1</w:t>
+            </w:r>
+          </w:p>
+        </w:tc>
+      </w:tr>
+      <w:tr>
+        <w:trPr>
+          <w:cantSplit/>
+          <w:trHeight w:val="440"/>
+        </w:trPr>
+        <w:tc>
+          <w:tcPr>
+            <w:tcW w:w="1700" w:type="dxa"/>
+            <w:shd w:val="clear" w:color="auto" w:fill="EEF6F1"/>
+            <w:vAlign w:val="center"/>
+          </w:tcPr>
+          <w:p>
+            <w:pPr>
+              <w:bidi/>
+              <w:spacing w:before="0" w:after="0" w:line="276" w:lineRule="auto"/>
+              <w:jc w:val="center"/>
+            </w:pPr>
+            <w:r>
+              <w:rPr>
+                <w:rFonts w:ascii="Calibri" w:eastAsia="Calibri" w:hAnsi="Calibri" w:cs="Arial"/>
+                <w:b/>
+                <w:bCs/>
+                <w:color w:val="14532D"/>
+                <w:sz w:val="26"/>
+                <w:szCs w:val="26"/>
+                <w:rtl/>
+              </w:rPr>
+              <w:t xml:space="preserve">ب)</w:t>
+            </w:r>
+          </w:p>
+        </w:tc>
+        <w:tc>
+          <w:tcPr>
+            <w:tcW w:w="6940" w:type="dxa"/>
+            <w:vAlign w:val="center"/>
+          </w:tcPr>
+          <w:p>
+            <w:pPr>
+              <w:bidi w:val="0"/>
+              <w:spacing w:before="0" w:after="20" w:line="276" w:lineRule="auto"/>
+            </w:pPr>
+            <w:r>
+              <w:rPr>
+                <w:rFonts w:ascii="Cambria Math" w:hAnsi="Cambria Math" w:cs="Cambria Math"/>
+                <w:color w:val="1A1A1A"/>
+                <w:sz w:val="26"/>
+                <w:szCs w:val="26"/>
+              </w:rPr>
+              <w:t xml:space="preserve">A ∪ B = {1, 2, 3, 4, 6, 8, 10}</w:t>
+            </w:r>
+          </w:p>
+        </w:tc>
+        <w:tc>
+          <w:tcPr>
+            <w:tcW w:w="1800" w:type="dxa"/>
+            <w:shd w:val="clear" w:color="auto" w:fill="F6E9C6"/>
+            <w:vAlign w:val="center"/>
+          </w:tcPr>
+          <w:p>
+            <w:pPr>
+              <w:bidi w:val="0"/>
+              <w:spacing w:before="0" w:after="0" w:line="276" w:lineRule="auto"/>
+              <w:jc w:val="center"/>
+            </w:pPr>
+            <w:r>
+              <w:rPr>
+                <w:rFonts w:ascii="Cambria Math" w:hAnsi="Cambria Math" w:cs="Cambria Math"/>
+                <w:b/>
+                <w:color w:val="B8860B"/>
+                <w:sz w:val="26"/>
+                <w:szCs w:val="26"/>
+              </w:rPr>
+              <w:t xml:space="preserve">1</w:t>
+            </w:r>
+          </w:p>
+        </w:tc>
+      </w:tr>
+      <w:tr>
+        <w:trPr>
+          <w:cantSplit/>
+          <w:trHeight w:val="440"/>
+        </w:trPr>
+        <w:tc>
+          <w:tcPr>
+            <w:tcW w:w="1700" w:type="dxa"/>
+            <w:shd w:val="clear" w:color="auto" w:fill="EEF6F1"/>
+            <w:vAlign w:val="center"/>
+          </w:tcPr>
+          <w:p>
+            <w:pPr>
+              <w:bidi/>
+              <w:spacing w:before="0" w:after="0" w:line="276" w:lineRule="auto"/>
+              <w:jc w:val="center"/>
+            </w:pPr>
+            <w:r>
+              <w:rPr>
+                <w:rFonts w:ascii="Calibri" w:eastAsia="Calibri" w:hAnsi="Calibri" w:cs="Arial"/>
+                <w:b/>
+                <w:bCs/>
+                <w:color w:val="14532D"/>
+                <w:sz w:val="26"/>
+                <w:szCs w:val="26"/>
+                <w:rtl/>
+              </w:rPr>
+              <w:t xml:space="preserve">ج)</w:t>
+            </w:r>
+          </w:p>
+        </w:tc>
+        <w:tc>
+          <w:tcPr>
+            <w:tcW w:w="6940" w:type="dxa"/>
+            <w:vAlign w:val="center"/>
+          </w:tcPr>
+          <w:p>
+            <w:pPr>
+              <w:bidi w:val="0"/>
+              <w:spacing w:before="0" w:after="20" w:line="276" w:lineRule="auto"/>
+            </w:pPr>
+            <w:r>
+              <w:rPr>
+                <w:rFonts w:ascii="Cambria Math" w:hAnsi="Cambria Math" w:cs="Cambria Math"/>
+                <w:color w:val="1A1A1A"/>
+                <w:sz w:val="26"/>
+                <w:szCs w:val="26"/>
+              </w:rPr>
+              <w:t xml:space="preserve">Ā = {5, 7, 8, 9, 10}</w:t>
+            </w:r>
+          </w:p>
+        </w:tc>
+        <w:tc>
+          <w:tcPr>
+            <w:tcW w:w="1800" w:type="dxa"/>
+            <w:shd w:val="clear" w:color="auto" w:fill="F6E9C6"/>
+            <w:vAlign w:val="center"/>
+          </w:tcPr>
+          <w:p>
+            <w:pPr>
+              <w:bidi w:val="0"/>
+              <w:spacing w:before="0" w:after="0" w:line="276" w:lineRule="auto"/>
+              <w:jc w:val="center"/>
+            </w:pPr>
+            <w:r>
+              <w:rPr>
+                <w:rFonts w:ascii="Cambria Math" w:hAnsi="Cambria Math" w:cs="Cambria Math"/>
+                <w:b/>
+                <w:color w:val="B8860B"/>
+                <w:sz w:val="26"/>
+                <w:szCs w:val="26"/>
+              </w:rPr>
+              <w:t xml:space="preserve">1</w:t>
+            </w:r>
+          </w:p>
+        </w:tc>
+      </w:tr>
+      <w:tr>
+        <w:trPr>
+          <w:cantSplit/>
+          <w:trHeight w:val="440"/>
+        </w:trPr>
+        <w:tc>
+          <w:tcPr>
+            <w:tcW w:w="1700" w:type="dxa"/>
+            <w:shd w:val="clear" w:color="auto" w:fill="EEF6F1"/>
+            <w:vAlign w:val="center"/>
+          </w:tcPr>
+          <w:p>
+            <w:pPr>
+              <w:bidi/>
+              <w:spacing w:before="0" w:after="0" w:line="276" w:lineRule="auto"/>
+              <w:jc w:val="center"/>
+            </w:pPr>
+            <w:r>
+              <w:rPr>
+                <w:rFonts w:ascii="Calibri" w:eastAsia="Calibri" w:hAnsi="Calibri" w:cs="Arial"/>
+                <w:b/>
+                <w:bCs/>
+                <w:color w:val="14532D"/>
+                <w:sz w:val="26"/>
+                <w:szCs w:val="26"/>
+                <w:rtl/>
+              </w:rPr>
+              <w:t xml:space="preserve">د)</w:t>
+            </w:r>
+          </w:p>
+        </w:tc>
+        <w:tc>
+          <w:tcPr>
+            <w:tcW w:w="6940" w:type="dxa"/>
+            <w:vAlign w:val="center"/>
+          </w:tcPr>
+          <w:p>
+            <w:pPr>
+              <w:bidi w:val="0"/>
+              <w:spacing w:before="0" w:after="20" w:line="276" w:lineRule="auto"/>
+            </w:pPr>
+            <w:r>
+              <w:rPr>
+                <w:rFonts w:ascii="Cambria Math" w:hAnsi="Cambria Math" w:cs="Cambria Math"/>
+                <w:color w:val="1A1A1A"/>
+                <w:sz w:val="26"/>
+                <w:szCs w:val="26"/>
+              </w:rPr>
+              <w:t xml:space="preserve">B̄ = {1, 3, 5, 7, 9}</w:t>
+            </w:r>
+          </w:p>
+          <w:p>
+            <w:pPr>
+              <w:bidi w:val="0"/>
+              <w:spacing w:before="0" w:after="20" w:line="276" w:lineRule="auto"/>
+            </w:pPr>
+            <w:r>
+              <w:rPr>
+                <w:rFonts w:ascii="Cambria Math" w:hAnsi="Cambria Math" w:cs="Cambria Math"/>
+                <w:color w:val="1A1A1A"/>
+                <w:sz w:val="26"/>
+                <w:szCs w:val="26"/>
+              </w:rPr>
+              <w:t xml:space="preserve">Ā ∩ B̄ = {5, 7, 9}</w:t>
+            </w:r>
+          </w:p>
+        </w:tc>
+        <w:tc>
+          <w:tcPr>
+            <w:tcW w:w="1800" w:type="dxa"/>
+            <w:shd w:val="clear" w:color="auto" w:fill="F6E9C6"/>
+            <w:vAlign w:val="center"/>
+          </w:tcPr>
+          <w:p>
+            <w:pPr>
+              <w:bidi w:val="0"/>
+              <w:spacing w:before="0" w:after="0" w:line="276" w:lineRule="auto"/>
+              <w:jc w:val="center"/>
+            </w:pPr>
+            <w:r>
+              <w:rPr>
+                <w:rFonts w:ascii="Cambria Math" w:hAnsi="Cambria Math" w:cs="Cambria Math"/>
+                <w:b/>
+                <w:color w:val="B8860B"/>
+                <w:sz w:val="26"/>
+                <w:szCs w:val="26"/>
+              </w:rPr>
+              <w:t xml:space="preserve">1</w:t>
             </w:r>
           </w:p>
         </w:tc>

</xml_diff>

<commit_message>
BT2 Arabic exam: 18pt font, flowing question boxes, two full pages
Co-Authored-By: Claude Opus 5.5 <noreply@anthropic.com>
Claude-Session: https://claude.ai/code/session_01PHgZqhLAeFoDhbHXzt9YLK
</commit_message>
<xml_diff>
--- a/exams/BT2-الباريم.docx
+++ b/exams/BT2-الباريم.docx
@@ -2529,7 +2529,22 @@
                 <w:sz w:val="26"/>
                 <w:szCs w:val="26"/>
               </w:rPr>
-              <w:t xml:space="preserve">]−∞ ; −2] ∪ [2 ; +∞[</w:t>
+              <w:t xml:space="preserve">ℝ − ]−2 ; 2[</w:t>
+            </w:r>
+          </w:p>
+          <w:p>
+            <w:pPr>
+              <w:bidi w:val="0"/>
+              <w:spacing w:before="0" w:after="20" w:line="276" w:lineRule="auto"/>
+            </w:pPr>
+            <w:r>
+              <w:rPr>
+                <w:rFonts w:ascii="Cambria Math" w:hAnsi="Cambria Math" w:cs="Cambria Math"/>
+                <w:color w:val="1A1A1A"/>
+                <w:sz w:val="26"/>
+                <w:szCs w:val="26"/>
+              </w:rPr>
+              <w:t xml:space="preserve">= ]−∞ ; −2] ∪ [2 ; +∞[</w:t>
             </w:r>
           </w:p>
         </w:tc>

</xml_diff>

<commit_message>
BT2 exam: drop multiple-choice question, shorten identities, rebalance marks
Co-Authored-By: Claude Opus 5.5 <noreply@anthropic.com>
Claude-Session: https://claude.ai/code/session_01PHgZqhLAeFoDhbHXzt9YLK
</commit_message>
<xml_diff>
--- a/exams/BT2-الباريم.docx
+++ b/exams/BT2-الباريم.docx
@@ -163,7 +163,7 @@
           <w:szCs w:val="26"/>
           <w:rtl/>
         </w:rPr>
-        <w:t xml:space="preserve">   —  علامتان</w:t>
+        <w:t xml:space="preserve">   —  3 علامات</w:t>
       </w:r>
     </w:p>
     <w:tbl>
@@ -350,7 +350,7 @@
                 <w:sz w:val="26"/>
                 <w:szCs w:val="26"/>
               </w:rPr>
-              <w:t xml:space="preserve">1</w:t>
+              <w:t xml:space="preserve">1.5</w:t>
             </w:r>
           </w:p>
         </w:tc>
@@ -456,7 +456,7 @@
                 <w:sz w:val="26"/>
                 <w:szCs w:val="26"/>
               </w:rPr>
-              <w:t xml:space="preserve">0.5 + 0.5</w:t>
+              <w:t xml:space="preserve">0.5 + 1</w:t>
             </w:r>
           </w:p>
         </w:tc>
@@ -497,7 +497,7 @@
           <w:szCs w:val="26"/>
           <w:rtl/>
         </w:rPr>
-        <w:t xml:space="preserve">   —  3 علامات</w:t>
+        <w:t xml:space="preserve">   —  علامتان</w:t>
       </w:r>
     </w:p>
     <w:tbl>
@@ -717,83 +717,6 @@
                 <w:rtl/>
               </w:rPr>
               <w:t xml:space="preserve">ب)</w:t>
-            </w:r>
-          </w:p>
-        </w:tc>
-        <w:tc>
-          <w:tcPr>
-            <w:tcW w:w="6940" w:type="dxa"/>
-            <w:vAlign w:val="center"/>
-          </w:tcPr>
-          <w:p>
-            <w:pPr>
-              <w:bidi w:val="0"/>
-              <w:spacing w:before="0" w:after="20" w:line="276" w:lineRule="auto"/>
-            </w:pPr>
-            <w:r>
-              <w:rPr>
-                <w:rFonts w:ascii="Cambria Math" w:hAnsi="Cambria Math" w:cs="Cambria Math"/>
-                <w:color w:val="1A1A1A"/>
-                <w:sz w:val="26"/>
-                <w:szCs w:val="26"/>
-              </w:rPr>
-              <w:t xml:space="preserve">9x² − 12x + 4 = (3x − 2)²</w:t>
-            </w:r>
-          </w:p>
-        </w:tc>
-        <w:tc>
-          <w:tcPr>
-            <w:tcW w:w="1800" w:type="dxa"/>
-            <w:shd w:val="clear" w:color="auto" w:fill="F6E9C6"/>
-            <w:vAlign w:val="center"/>
-          </w:tcPr>
-          <w:p>
-            <w:pPr>
-              <w:bidi w:val="0"/>
-              <w:spacing w:before="0" w:after="0" w:line="276" w:lineRule="auto"/>
-              <w:jc w:val="center"/>
-            </w:pPr>
-            <w:r>
-              <w:rPr>
-                <w:rFonts w:ascii="Cambria Math" w:hAnsi="Cambria Math" w:cs="Cambria Math"/>
-                <w:b/>
-                <w:color w:val="B8860B"/>
-                <w:sz w:val="26"/>
-                <w:szCs w:val="26"/>
-              </w:rPr>
-              <w:t xml:space="preserve">1</w:t>
-            </w:r>
-          </w:p>
-        </w:tc>
-      </w:tr>
-      <w:tr>
-        <w:trPr>
-          <w:cantSplit/>
-          <w:trHeight w:val="440"/>
-        </w:trPr>
-        <w:tc>
-          <w:tcPr>
-            <w:tcW w:w="1700" w:type="dxa"/>
-            <w:shd w:val="clear" w:color="auto" w:fill="EEF6F1"/>
-            <w:vAlign w:val="center"/>
-          </w:tcPr>
-          <w:p>
-            <w:pPr>
-              <w:bidi/>
-              <w:spacing w:before="0" w:after="0" w:line="276" w:lineRule="auto"/>
-              <w:jc w:val="center"/>
-            </w:pPr>
-            <w:r>
-              <w:rPr>
-                <w:rFonts w:ascii="Calibri" w:eastAsia="Calibri" w:hAnsi="Calibri" w:cs="Arial"/>
-                <w:b/>
-                <w:bCs/>
-                <w:color w:val="14532D"/>
-                <w:sz w:val="26"/>
-                <w:szCs w:val="26"/>
-                <w:rtl/>
-              </w:rPr>
-              <w:t xml:space="preserve">ج)</w:t>
             </w:r>
           </w:p>
         </w:tc>
@@ -879,7 +802,7 @@
           <w:szCs w:val="26"/>
           <w:rtl/>
         </w:rPr>
-        <w:t xml:space="preserve">   —  3 علامات</w:t>
+        <w:t xml:space="preserve">   —  4 علامات</w:t>
       </w:r>
     </w:p>
     <w:tbl>
@@ -1081,7 +1004,7 @@
                 <w:sz w:val="26"/>
                 <w:szCs w:val="26"/>
               </w:rPr>
-              <w:t xml:space="preserve">0.75 + 0.75</w:t>
+              <w:t xml:space="preserve">1 + 1</w:t>
             </w:r>
           </w:p>
         </w:tc>
@@ -1173,7 +1096,7 @@
                 <w:sz w:val="26"/>
                 <w:szCs w:val="26"/>
               </w:rPr>
-              <w:t xml:space="preserve">0.75 + 0.75</w:t>
+              <w:t xml:space="preserve">1 + 1</w:t>
             </w:r>
           </w:p>
         </w:tc>
@@ -1233,7 +1156,7 @@
           <w:szCs w:val="26"/>
           <w:rtl/>
         </w:rPr>
-        <w:t xml:space="preserve">   —  علامتان</w:t>
+        <w:t xml:space="preserve">   —  3 علامات</w:t>
       </w:r>
     </w:p>
     <w:p>
@@ -2155,7 +2078,7 @@
           <w:szCs w:val="22"/>
           <w:rtl/>
         </w:rPr>
-        <w:t xml:space="preserve">  (الدراسة 1.5 + S 0.5)</w:t>
+        <w:t xml:space="preserve">  (الدراسة 2 + S 1)</w:t>
       </w:r>
     </w:p>
     <w:p>
@@ -2200,404 +2123,7 @@
           <w:szCs w:val="30"/>
           <w:rtl/>
         </w:rPr>
-        <w:t xml:space="preserve">السؤال الخامس: اختر مجموعة الحلول الصحيحة</w:t>
-      </w:r>
-      <w:r>
-        <w:rPr>
-          <w:rFonts w:ascii="Calibri" w:eastAsia="Calibri" w:hAnsi="Calibri" w:cs="Arial"/>
-          <w:b/>
-          <w:bCs/>
-          <w:color w:val="F6D98B"/>
-          <w:sz w:val="26"/>
-          <w:szCs w:val="26"/>
-          <w:rtl/>
-        </w:rPr>
-        <w:t xml:space="preserve">   —  3 علامات</w:t>
-      </w:r>
-    </w:p>
-    <w:tbl>
-      <w:tblPr>
-        <w:bidiVisual/>
-        <w:tblW w:w="10440" w:type="dxa"/>
-        <w:jc w:val="center"/>
-        <w:tblBorders>
-          <w:top w:val="single" w:sz="6" w:space="0" w:color="A7C4B2"/>
-          <w:left w:val="single" w:sz="6" w:space="0" w:color="A7C4B2"/>
-          <w:bottom w:val="single" w:sz="6" w:space="0" w:color="A7C4B2"/>
-          <w:right w:val="single" w:sz="6" w:space="0" w:color="A7C4B2"/>
-          <w:insideH w:val="single" w:sz="6" w:space="0" w:color="A7C4B2"/>
-          <w:insideV w:val="single" w:sz="6" w:space="0" w:color="A7C4B2"/>
-        </w:tblBorders>
-        <w:tblLayout w:type="fixed"/>
-        <w:tblCellMar>
-          <w:top w:w="80" w:type="dxa"/>
-          <w:left w:w="110" w:type="dxa"/>
-          <w:bottom w:w="80" w:type="dxa"/>
-          <w:right w:w="110" w:type="dxa"/>
-        </w:tblCellMar>
-        <w:tblLook w:val="04A0" w:firstRow="1" w:lastRow="0" w:firstColumn="1" w:lastColumn="0" w:noHBand="0" w:noVBand="1"/>
-      </w:tblPr>
-      <w:tblGrid>
-        <w:gridCol w:w="1700"/>
-        <w:gridCol w:w="6940"/>
-        <w:gridCol w:w="1800"/>
-      </w:tblGrid>
-      <w:tr>
-        <w:trPr>
-          <w:cantSplit/>
-          <w:trHeight w:val="420"/>
-          <w:tblHeader/>
-        </w:trPr>
-        <w:tc>
-          <w:tcPr>
-            <w:tcW w:w="1700" w:type="dxa"/>
-            <w:shd w:val="clear" w:color="auto" w:fill="14532D"/>
-            <w:vAlign w:val="center"/>
-          </w:tcPr>
-          <w:p>
-            <w:pPr>
-              <w:bidi/>
-              <w:spacing w:before="0" w:after="0" w:line="276" w:lineRule="auto"/>
-              <w:jc w:val="center"/>
-            </w:pPr>
-            <w:r>
-              <w:rPr>
-                <w:rFonts w:ascii="Calibri" w:eastAsia="Calibri" w:hAnsi="Calibri" w:cs="Arial"/>
-                <w:b/>
-                <w:bCs/>
-                <w:color w:val="FFFFFF"/>
-                <w:sz w:val="24"/>
-                <w:szCs w:val="24"/>
-                <w:rtl/>
-              </w:rPr>
-              <w:t xml:space="preserve">البند</w:t>
-            </w:r>
-          </w:p>
-        </w:tc>
-        <w:tc>
-          <w:tcPr>
-            <w:tcW w:w="6940" w:type="dxa"/>
-            <w:shd w:val="clear" w:color="auto" w:fill="14532D"/>
-            <w:vAlign w:val="center"/>
-          </w:tcPr>
-          <w:p>
-            <w:pPr>
-              <w:bidi/>
-              <w:spacing w:before="0" w:after="0" w:line="276" w:lineRule="auto"/>
-              <w:jc w:val="center"/>
-            </w:pPr>
-            <w:r>
-              <w:rPr>
-                <w:rFonts w:ascii="Calibri" w:eastAsia="Calibri" w:hAnsi="Calibri" w:cs="Arial"/>
-                <w:b/>
-                <w:bCs/>
-                <w:color w:val="FFFFFF"/>
-                <w:sz w:val="24"/>
-                <w:szCs w:val="24"/>
-                <w:rtl/>
-              </w:rPr>
-              <w:t xml:space="preserve">الإجابة</w:t>
-            </w:r>
-          </w:p>
-        </w:tc>
-        <w:tc>
-          <w:tcPr>
-            <w:tcW w:w="1800" w:type="dxa"/>
-            <w:shd w:val="clear" w:color="auto" w:fill="B8860B"/>
-            <w:vAlign w:val="center"/>
-          </w:tcPr>
-          <w:p>
-            <w:pPr>
-              <w:bidi/>
-              <w:spacing w:before="0" w:after="0" w:line="276" w:lineRule="auto"/>
-              <w:jc w:val="center"/>
-            </w:pPr>
-            <w:r>
-              <w:rPr>
-                <w:rFonts w:ascii="Calibri" w:eastAsia="Calibri" w:hAnsi="Calibri" w:cs="Arial"/>
-                <w:b/>
-                <w:bCs/>
-                <w:color w:val="FFFFFF"/>
-                <w:sz w:val="24"/>
-                <w:szCs w:val="24"/>
-                <w:rtl/>
-              </w:rPr>
-              <w:t xml:space="preserve">العلامة</w:t>
-            </w:r>
-          </w:p>
-        </w:tc>
-      </w:tr>
-      <w:tr>
-        <w:trPr>
-          <w:cantSplit/>
-          <w:trHeight w:val="440"/>
-        </w:trPr>
-        <w:tc>
-          <w:tcPr>
-            <w:tcW w:w="1700" w:type="dxa"/>
-            <w:shd w:val="clear" w:color="auto" w:fill="EEF6F1"/>
-            <w:vAlign w:val="center"/>
-          </w:tcPr>
-          <w:p>
-            <w:pPr>
-              <w:bidi/>
-              <w:spacing w:before="0" w:after="0" w:line="276" w:lineRule="auto"/>
-              <w:jc w:val="center"/>
-            </w:pPr>
-            <w:r>
-              <w:rPr>
-                <w:rFonts w:ascii="Calibri" w:eastAsia="Calibri" w:hAnsi="Calibri" w:cs="Arial"/>
-                <w:b/>
-                <w:bCs/>
-                <w:color w:val="14532D"/>
-                <w:sz w:val="26"/>
-                <w:szCs w:val="26"/>
-                <w:rtl/>
-              </w:rPr>
-              <w:t xml:space="preserve">1 – أ)</w:t>
-            </w:r>
-          </w:p>
-        </w:tc>
-        <w:tc>
-          <w:tcPr>
-            <w:tcW w:w="6940" w:type="dxa"/>
-            <w:vAlign w:val="center"/>
-          </w:tcPr>
-          <w:p>
-            <w:pPr>
-              <w:bidi w:val="0"/>
-              <w:spacing w:before="0" w:after="20" w:line="276" w:lineRule="auto"/>
-            </w:pPr>
-            <w:r>
-              <w:rPr>
-                <w:rFonts w:ascii="Cambria Math" w:hAnsi="Cambria Math" w:cs="Cambria Math"/>
-                <w:color w:val="1A1A1A"/>
-                <w:sz w:val="26"/>
-                <w:szCs w:val="26"/>
-              </w:rPr>
-              <w:t xml:space="preserve">]2 ; +∞[</w:t>
-            </w:r>
-          </w:p>
-        </w:tc>
-        <w:tc>
-          <w:tcPr>
-            <w:tcW w:w="1800" w:type="dxa"/>
-            <w:shd w:val="clear" w:color="auto" w:fill="F6E9C6"/>
-            <w:vAlign w:val="center"/>
-          </w:tcPr>
-          <w:p>
-            <w:pPr>
-              <w:bidi w:val="0"/>
-              <w:spacing w:before="0" w:after="0" w:line="276" w:lineRule="auto"/>
-              <w:jc w:val="center"/>
-            </w:pPr>
-            <w:r>
-              <w:rPr>
-                <w:rFonts w:ascii="Cambria Math" w:hAnsi="Cambria Math" w:cs="Cambria Math"/>
-                <w:b/>
-                <w:color w:val="B8860B"/>
-                <w:sz w:val="26"/>
-                <w:szCs w:val="26"/>
-              </w:rPr>
-              <w:t xml:space="preserve">1</w:t>
-            </w:r>
-          </w:p>
-        </w:tc>
-      </w:tr>
-      <w:tr>
-        <w:trPr>
-          <w:cantSplit/>
-          <w:trHeight w:val="440"/>
-        </w:trPr>
-        <w:tc>
-          <w:tcPr>
-            <w:tcW w:w="1700" w:type="dxa"/>
-            <w:shd w:val="clear" w:color="auto" w:fill="EEF6F1"/>
-            <w:vAlign w:val="center"/>
-          </w:tcPr>
-          <w:p>
-            <w:pPr>
-              <w:bidi/>
-              <w:spacing w:before="0" w:after="0" w:line="276" w:lineRule="auto"/>
-              <w:jc w:val="center"/>
-            </w:pPr>
-            <w:r>
-              <w:rPr>
-                <w:rFonts w:ascii="Calibri" w:eastAsia="Calibri" w:hAnsi="Calibri" w:cs="Arial"/>
-                <w:b/>
-                <w:bCs/>
-                <w:color w:val="14532D"/>
-                <w:sz w:val="26"/>
-                <w:szCs w:val="26"/>
-                <w:rtl/>
-              </w:rPr>
-              <w:t xml:space="preserve">2 – ب)</w:t>
-            </w:r>
-          </w:p>
-        </w:tc>
-        <w:tc>
-          <w:tcPr>
-            <w:tcW w:w="6940" w:type="dxa"/>
-            <w:vAlign w:val="center"/>
-          </w:tcPr>
-          <w:p>
-            <w:pPr>
-              <w:bidi w:val="0"/>
-              <w:spacing w:before="0" w:after="20" w:line="276" w:lineRule="auto"/>
-            </w:pPr>
-            <w:r>
-              <w:rPr>
-                <w:rFonts w:ascii="Cambria Math" w:hAnsi="Cambria Math" w:cs="Cambria Math"/>
-                <w:color w:val="1A1A1A"/>
-                <w:sz w:val="26"/>
-                <w:szCs w:val="26"/>
-              </w:rPr>
-              <w:t xml:space="preserve">]−3 ; 3[</w:t>
-            </w:r>
-          </w:p>
-        </w:tc>
-        <w:tc>
-          <w:tcPr>
-            <w:tcW w:w="1800" w:type="dxa"/>
-            <w:shd w:val="clear" w:color="auto" w:fill="F6E9C6"/>
-            <w:vAlign w:val="center"/>
-          </w:tcPr>
-          <w:p>
-            <w:pPr>
-              <w:bidi w:val="0"/>
-              <w:spacing w:before="0" w:after="0" w:line="276" w:lineRule="auto"/>
-              <w:jc w:val="center"/>
-            </w:pPr>
-            <w:r>
-              <w:rPr>
-                <w:rFonts w:ascii="Cambria Math" w:hAnsi="Cambria Math" w:cs="Cambria Math"/>
-                <w:b/>
-                <w:color w:val="B8860B"/>
-                <w:sz w:val="26"/>
-                <w:szCs w:val="26"/>
-              </w:rPr>
-              <w:t xml:space="preserve">1</w:t>
-            </w:r>
-          </w:p>
-        </w:tc>
-      </w:tr>
-      <w:tr>
-        <w:trPr>
-          <w:cantSplit/>
-          <w:trHeight w:val="440"/>
-        </w:trPr>
-        <w:tc>
-          <w:tcPr>
-            <w:tcW w:w="1700" w:type="dxa"/>
-            <w:shd w:val="clear" w:color="auto" w:fill="EEF6F1"/>
-            <w:vAlign w:val="center"/>
-          </w:tcPr>
-          <w:p>
-            <w:pPr>
-              <w:bidi/>
-              <w:spacing w:before="0" w:after="0" w:line="276" w:lineRule="auto"/>
-              <w:jc w:val="center"/>
-            </w:pPr>
-            <w:r>
-              <w:rPr>
-                <w:rFonts w:ascii="Calibri" w:eastAsia="Calibri" w:hAnsi="Calibri" w:cs="Arial"/>
-                <w:b/>
-                <w:bCs/>
-                <w:color w:val="14532D"/>
-                <w:sz w:val="26"/>
-                <w:szCs w:val="26"/>
-                <w:rtl/>
-              </w:rPr>
-              <w:t xml:space="preserve">3 – ج)</w:t>
-            </w:r>
-          </w:p>
-        </w:tc>
-        <w:tc>
-          <w:tcPr>
-            <w:tcW w:w="6940" w:type="dxa"/>
-            <w:vAlign w:val="center"/>
-          </w:tcPr>
-          <w:p>
-            <w:pPr>
-              <w:bidi w:val="0"/>
-              <w:spacing w:before="0" w:after="20" w:line="276" w:lineRule="auto"/>
-            </w:pPr>
-            <w:r>
-              <w:rPr>
-                <w:rFonts w:ascii="Cambria Math" w:hAnsi="Cambria Math" w:cs="Cambria Math"/>
-                <w:color w:val="1A1A1A"/>
-                <w:sz w:val="26"/>
-                <w:szCs w:val="26"/>
-              </w:rPr>
-              <w:t xml:space="preserve">ℝ − ]−2 ; 2[</w:t>
-            </w:r>
-          </w:p>
-          <w:p>
-            <w:pPr>
-              <w:bidi w:val="0"/>
-              <w:spacing w:before="0" w:after="20" w:line="276" w:lineRule="auto"/>
-            </w:pPr>
-            <w:r>
-              <w:rPr>
-                <w:rFonts w:ascii="Cambria Math" w:hAnsi="Cambria Math" w:cs="Cambria Math"/>
-                <w:color w:val="1A1A1A"/>
-                <w:sz w:val="26"/>
-                <w:szCs w:val="26"/>
-              </w:rPr>
-              <w:t xml:space="preserve">= ]−∞ ; −2] ∪ [2 ; +∞[</w:t>
-            </w:r>
-          </w:p>
-        </w:tc>
-        <w:tc>
-          <w:tcPr>
-            <w:tcW w:w="1800" w:type="dxa"/>
-            <w:shd w:val="clear" w:color="auto" w:fill="F6E9C6"/>
-            <w:vAlign w:val="center"/>
-          </w:tcPr>
-          <w:p>
-            <w:pPr>
-              <w:bidi w:val="0"/>
-              <w:spacing w:before="0" w:after="0" w:line="276" w:lineRule="auto"/>
-              <w:jc w:val="center"/>
-            </w:pPr>
-            <w:r>
-              <w:rPr>
-                <w:rFonts w:ascii="Cambria Math" w:hAnsi="Cambria Math" w:cs="Cambria Math"/>
-                <w:b/>
-                <w:color w:val="B8860B"/>
-                <w:sz w:val="26"/>
-                <w:szCs w:val="26"/>
-              </w:rPr>
-              <w:t xml:space="preserve">1</w:t>
-            </w:r>
-          </w:p>
-        </w:tc>
-      </w:tr>
-    </w:tbl>
-    <w:p>
-      <w:pPr>
-        <w:keepNext/>
-        <w:pBdr>
-          <w:top w:val="single" w:sz="18" w:space="3" w:color="14532D"/>
-          <w:bottom w:val="single" w:sz="18" w:space="3" w:color="14532D"/>
-          <w:right w:val="single" w:sz="48" w:space="6" w:color="B8860B"/>
-        </w:pBdr>
-        <w:shd w:val="clear" w:color="auto" w:fill="14532D"/>
-        <w:bidi/>
-        <w:spacing w:before="180" w:after="100" w:line="276" w:lineRule="auto"/>
-        <w:ind w:left="120" w:right="120"/>
-      </w:pPr>
-      <w:r>
-        <w:rPr>
-          <w:rFonts w:ascii="Calibri" w:eastAsia="Calibri" w:hAnsi="Calibri" w:cs="Arial"/>
-          <w:b/>
-          <w:bCs/>
-          <w:color w:val="FFFFFF"/>
-          <w:sz w:val="30"/>
-          <w:szCs w:val="30"/>
-          <w:rtl/>
-        </w:rPr>
-        <w:t xml:space="preserve">السؤال السادس: المجموعات</w:t>
+        <w:t xml:space="preserve">السؤال الخامس: المجموعات</w:t>
       </w:r>
       <w:r>
         <w:rPr>
@@ -3071,7 +2597,7 @@
           <w:szCs w:val="30"/>
           <w:rtl/>
         </w:rPr>
-        <w:t xml:space="preserve">السؤال السابع: نظام معادلتين من الدرجة الأولى بمجهولين</w:t>
+        <w:t xml:space="preserve">السؤال السادس: نظام معادلتين بمجهولين</w:t>
       </w:r>
       <w:r>
         <w:rPr>
@@ -3083,7 +2609,7 @@
           <w:szCs w:val="26"/>
           <w:rtl/>
         </w:rPr>
-        <w:t xml:space="preserve">   —  3 علامات</w:t>
+        <w:t xml:space="preserve">   —  4 علامات</w:t>
       </w:r>
     </w:p>
     <w:tbl>
@@ -3332,7 +2858,7 @@
                 <w:sz w:val="26"/>
                 <w:szCs w:val="26"/>
               </w:rPr>
-              <w:t xml:space="preserve">1 + 1 + 1</w:t>
+              <w:t xml:space="preserve">1.5 + 1.5 + 1</w:t>
             </w:r>
           </w:p>
         </w:tc>

</xml_diff>

<commit_message>
BT2 exam: remove inequality question, add multiple-choice table as question 1
Co-Authored-By: Claude Opus 5.5 <noreply@anthropic.com>
Claude-Session: https://claude.ai/code/session_01PHgZqhLAeFoDhbHXzt9YLK
</commit_message>
<xml_diff>
--- a/exams/BT2-الباريم.docx
+++ b/exams/BT2-الباريم.docx
@@ -151,7 +151,7 @@
           <w:szCs w:val="30"/>
           <w:rtl/>
         </w:rPr>
-        <w:t xml:space="preserve">السؤال الأول: تنطيق المقام</w:t>
+        <w:t xml:space="preserve">السؤال الأول: اختر الجواب الصحيح</w:t>
       </w:r>
       <w:r>
         <w:rPr>
@@ -305,7 +305,7 @@
                 <w:szCs w:val="26"/>
                 <w:rtl/>
               </w:rPr>
-              <w:t xml:space="preserve">أ)</w:t>
+              <w:t xml:space="preserve">1 – أ)</w:t>
             </w:r>
           </w:p>
         </w:tc>
@@ -326,7 +326,7 @@
                 <w:sz w:val="26"/>
                 <w:szCs w:val="26"/>
               </w:rPr>
-              <w:t xml:space="preserve">A = 6√3 / 3 = 2√3</w:t>
+              <w:t xml:space="preserve">(√5 − 2)(√5 + 2) = 5 − 4 = 1</w:t>
             </w:r>
           </w:p>
         </w:tc>
@@ -350,7 +350,7 @@
                 <w:sz w:val="26"/>
                 <w:szCs w:val="26"/>
               </w:rPr>
-              <w:t xml:space="preserve">1.5</w:t>
+              <w:t xml:space="preserve">0.75</w:t>
             </w:r>
           </w:p>
         </w:tc>
@@ -382,7 +382,7 @@
                 <w:szCs w:val="26"/>
                 <w:rtl/>
               </w:rPr>
-              <w:t xml:space="preserve">ب)</w:t>
+              <w:t xml:space="preserve">2 – ب)</w:t>
             </w:r>
           </w:p>
         </w:tc>
@@ -391,35 +391,6 @@
             <w:tcW w:w="6940" w:type="dxa"/>
             <w:vAlign w:val="center"/>
           </w:tcPr>
-          <w:p>
-            <w:pPr>
-              <w:bidi/>
-              <w:spacing w:before="0" w:after="20" w:line="276" w:lineRule="auto"/>
-            </w:pPr>
-            <w:r>
-              <w:rPr>
-                <w:rFonts w:ascii="Calibri" w:eastAsia="Calibri" w:hAnsi="Calibri" w:cs="Arial"/>
-                <w:color w:val="1A1A1A"/>
-                <w:sz w:val="26"/>
-                <w:szCs w:val="26"/>
-                <w:rtl/>
-              </w:rPr>
-              <w:t xml:space="preserve">نضرب البسط والمقام بالمرافق </w:t>
-            </w:r>
-            <m:oMath>
-              <m:r>
-                <m:rPr>
-                  <m:sty m:val="p"/>
-                </m:rPr>
-                <w:rPr>
-                  <w:rFonts w:ascii="Cambria Math" w:hAnsi="Cambria Math"/>
-                  <w:sz w:val="30"/>
-                  <w:szCs w:val="30"/>
-                </w:rPr>
-                <m:t xml:space="preserve">(√7 + √2)</m:t>
-              </m:r>
-            </m:oMath>
-          </w:p>
           <w:p>
             <w:pPr>
               <w:bidi w:val="0"/>
@@ -432,7 +403,7 @@
                 <w:sz w:val="26"/>
                 <w:szCs w:val="26"/>
               </w:rPr>
-              <w:t xml:space="preserve">B = 5(√7 + √2) / (7 − 2) = √7 + √2</w:t>
+              <w:t xml:space="preserve">x² − 9 = (x − 3)(x + 3)</w:t>
             </w:r>
           </w:p>
         </w:tc>
@@ -456,7 +427,161 @@
                 <w:sz w:val="26"/>
                 <w:szCs w:val="26"/>
               </w:rPr>
-              <w:t xml:space="preserve">0.5 + 1</w:t>
+              <w:t xml:space="preserve">0.75</w:t>
+            </w:r>
+          </w:p>
+        </w:tc>
+      </w:tr>
+      <w:tr>
+        <w:trPr>
+          <w:cantSplit/>
+          <w:trHeight w:val="440"/>
+        </w:trPr>
+        <w:tc>
+          <w:tcPr>
+            <w:tcW w:w="1700" w:type="dxa"/>
+            <w:shd w:val="clear" w:color="auto" w:fill="EEF6F1"/>
+            <w:vAlign w:val="center"/>
+          </w:tcPr>
+          <w:p>
+            <w:pPr>
+              <w:bidi/>
+              <w:spacing w:before="0" w:after="0" w:line="276" w:lineRule="auto"/>
+              <w:jc w:val="center"/>
+            </w:pPr>
+            <w:r>
+              <w:rPr>
+                <w:rFonts w:ascii="Calibri" w:eastAsia="Calibri" w:hAnsi="Calibri" w:cs="Arial"/>
+                <w:b/>
+                <w:bCs/>
+                <w:color w:val="14532D"/>
+                <w:sz w:val="26"/>
+                <w:szCs w:val="26"/>
+                <w:rtl/>
+              </w:rPr>
+              <w:t xml:space="preserve">3 – ج)</w:t>
+            </w:r>
+          </w:p>
+        </w:tc>
+        <w:tc>
+          <w:tcPr>
+            <w:tcW w:w="6940" w:type="dxa"/>
+            <w:vAlign w:val="center"/>
+          </w:tcPr>
+          <w:p>
+            <w:pPr>
+              <w:bidi w:val="0"/>
+              <w:spacing w:before="0" w:after="20" w:line="276" w:lineRule="auto"/>
+            </w:pPr>
+            <w:r>
+              <w:rPr>
+                <w:rFonts w:ascii="Cambria Math" w:hAnsi="Cambria Math" w:cs="Cambria Math"/>
+                <w:color w:val="1A1A1A"/>
+                <w:sz w:val="26"/>
+                <w:szCs w:val="26"/>
+              </w:rPr>
+              <w:t xml:space="preserve">2x &gt; 4  ⇒  x &gt; 2  ⇒  S = ]2 ; +∞[</w:t>
+            </w:r>
+          </w:p>
+        </w:tc>
+        <w:tc>
+          <w:tcPr>
+            <w:tcW w:w="1800" w:type="dxa"/>
+            <w:shd w:val="clear" w:color="auto" w:fill="F6E9C6"/>
+            <w:vAlign w:val="center"/>
+          </w:tcPr>
+          <w:p>
+            <w:pPr>
+              <w:bidi w:val="0"/>
+              <w:spacing w:before="0" w:after="0" w:line="276" w:lineRule="auto"/>
+              <w:jc w:val="center"/>
+            </w:pPr>
+            <w:r>
+              <w:rPr>
+                <w:rFonts w:ascii="Cambria Math" w:hAnsi="Cambria Math" w:cs="Cambria Math"/>
+                <w:b/>
+                <w:color w:val="B8860B"/>
+                <w:sz w:val="26"/>
+                <w:szCs w:val="26"/>
+              </w:rPr>
+              <w:t xml:space="preserve">0.75</w:t>
+            </w:r>
+          </w:p>
+        </w:tc>
+      </w:tr>
+      <w:tr>
+        <w:trPr>
+          <w:cantSplit/>
+          <w:trHeight w:val="440"/>
+        </w:trPr>
+        <w:tc>
+          <w:tcPr>
+            <w:tcW w:w="1700" w:type="dxa"/>
+            <w:shd w:val="clear" w:color="auto" w:fill="EEF6F1"/>
+            <w:vAlign w:val="center"/>
+          </w:tcPr>
+          <w:p>
+            <w:pPr>
+              <w:bidi/>
+              <w:spacing w:before="0" w:after="0" w:line="276" w:lineRule="auto"/>
+              <w:jc w:val="center"/>
+            </w:pPr>
+            <w:r>
+              <w:rPr>
+                <w:rFonts w:ascii="Calibri" w:eastAsia="Calibri" w:hAnsi="Calibri" w:cs="Arial"/>
+                <w:b/>
+                <w:bCs/>
+                <w:color w:val="14532D"/>
+                <w:sz w:val="26"/>
+                <w:szCs w:val="26"/>
+                <w:rtl/>
+              </w:rPr>
+              <w:t xml:space="preserve">4 – أ)</w:t>
+            </w:r>
+          </w:p>
+        </w:tc>
+        <w:tc>
+          <w:tcPr>
+            <w:tcW w:w="6940" w:type="dxa"/>
+            <w:vAlign w:val="center"/>
+          </w:tcPr>
+          <w:p>
+            <w:pPr>
+              <w:bidi w:val="0"/>
+              <w:spacing w:before="0" w:after="20" w:line="276" w:lineRule="auto"/>
+            </w:pPr>
+            <w:r>
+              <w:rPr>
+                <w:rFonts w:ascii="Cambria Math" w:hAnsi="Cambria Math" w:cs="Cambria Math"/>
+                <w:color w:val="1A1A1A"/>
+                <w:sz w:val="26"/>
+                <w:szCs w:val="26"/>
+              </w:rPr>
+              <w:t xml:space="preserve">A ∩ B = {3}</w:t>
+            </w:r>
+          </w:p>
+        </w:tc>
+        <w:tc>
+          <w:tcPr>
+            <w:tcW w:w="1800" w:type="dxa"/>
+            <w:shd w:val="clear" w:color="auto" w:fill="F6E9C6"/>
+            <w:vAlign w:val="center"/>
+          </w:tcPr>
+          <w:p>
+            <w:pPr>
+              <w:bidi w:val="0"/>
+              <w:spacing w:before="0" w:after="0" w:line="276" w:lineRule="auto"/>
+              <w:jc w:val="center"/>
+            </w:pPr>
+            <w:r>
+              <w:rPr>
+                <w:rFonts w:ascii="Cambria Math" w:hAnsi="Cambria Math" w:cs="Cambria Math"/>
+                <w:b/>
+                <w:color w:val="B8860B"/>
+                <w:sz w:val="26"/>
+                <w:szCs w:val="26"/>
+              </w:rPr>
+              <w:t xml:space="preserve">0.75</w:t>
             </w:r>
           </w:p>
         </w:tc>
@@ -485,7 +610,341 @@
           <w:szCs w:val="30"/>
           <w:rtl/>
         </w:rPr>
-        <w:t xml:space="preserve">السؤال الثاني: المتطابقات الشهيرة</w:t>
+        <w:t xml:space="preserve">السؤال الثاني: تنطيق المقام</w:t>
+      </w:r>
+      <w:r>
+        <w:rPr>
+          <w:rFonts w:ascii="Calibri" w:eastAsia="Calibri" w:hAnsi="Calibri" w:cs="Arial"/>
+          <w:b/>
+          <w:bCs/>
+          <w:color w:val="F6D98B"/>
+          <w:sz w:val="26"/>
+          <w:szCs w:val="26"/>
+          <w:rtl/>
+        </w:rPr>
+        <w:t xml:space="preserve">   —  3 علامات</w:t>
+      </w:r>
+    </w:p>
+    <w:tbl>
+      <w:tblPr>
+        <w:bidiVisual/>
+        <w:tblW w:w="10440" w:type="dxa"/>
+        <w:jc w:val="center"/>
+        <w:tblBorders>
+          <w:top w:val="single" w:sz="6" w:space="0" w:color="A7C4B2"/>
+          <w:left w:val="single" w:sz="6" w:space="0" w:color="A7C4B2"/>
+          <w:bottom w:val="single" w:sz="6" w:space="0" w:color="A7C4B2"/>
+          <w:right w:val="single" w:sz="6" w:space="0" w:color="A7C4B2"/>
+          <w:insideH w:val="single" w:sz="6" w:space="0" w:color="A7C4B2"/>
+          <w:insideV w:val="single" w:sz="6" w:space="0" w:color="A7C4B2"/>
+        </w:tblBorders>
+        <w:tblLayout w:type="fixed"/>
+        <w:tblCellMar>
+          <w:top w:w="80" w:type="dxa"/>
+          <w:left w:w="110" w:type="dxa"/>
+          <w:bottom w:w="80" w:type="dxa"/>
+          <w:right w:w="110" w:type="dxa"/>
+        </w:tblCellMar>
+        <w:tblLook w:val="04A0" w:firstRow="1" w:lastRow="0" w:firstColumn="1" w:lastColumn="0" w:noHBand="0" w:noVBand="1"/>
+      </w:tblPr>
+      <w:tblGrid>
+        <w:gridCol w:w="1700"/>
+        <w:gridCol w:w="6940"/>
+        <w:gridCol w:w="1800"/>
+      </w:tblGrid>
+      <w:tr>
+        <w:trPr>
+          <w:cantSplit/>
+          <w:trHeight w:val="420"/>
+          <w:tblHeader/>
+        </w:trPr>
+        <w:tc>
+          <w:tcPr>
+            <w:tcW w:w="1700" w:type="dxa"/>
+            <w:shd w:val="clear" w:color="auto" w:fill="14532D"/>
+            <w:vAlign w:val="center"/>
+          </w:tcPr>
+          <w:p>
+            <w:pPr>
+              <w:bidi/>
+              <w:spacing w:before="0" w:after="0" w:line="276" w:lineRule="auto"/>
+              <w:jc w:val="center"/>
+            </w:pPr>
+            <w:r>
+              <w:rPr>
+                <w:rFonts w:ascii="Calibri" w:eastAsia="Calibri" w:hAnsi="Calibri" w:cs="Arial"/>
+                <w:b/>
+                <w:bCs/>
+                <w:color w:val="FFFFFF"/>
+                <w:sz w:val="24"/>
+                <w:szCs w:val="24"/>
+                <w:rtl/>
+              </w:rPr>
+              <w:t xml:space="preserve">البند</w:t>
+            </w:r>
+          </w:p>
+        </w:tc>
+        <w:tc>
+          <w:tcPr>
+            <w:tcW w:w="6940" w:type="dxa"/>
+            <w:shd w:val="clear" w:color="auto" w:fill="14532D"/>
+            <w:vAlign w:val="center"/>
+          </w:tcPr>
+          <w:p>
+            <w:pPr>
+              <w:bidi/>
+              <w:spacing w:before="0" w:after="0" w:line="276" w:lineRule="auto"/>
+              <w:jc w:val="center"/>
+            </w:pPr>
+            <w:r>
+              <w:rPr>
+                <w:rFonts w:ascii="Calibri" w:eastAsia="Calibri" w:hAnsi="Calibri" w:cs="Arial"/>
+                <w:b/>
+                <w:bCs/>
+                <w:color w:val="FFFFFF"/>
+                <w:sz w:val="24"/>
+                <w:szCs w:val="24"/>
+                <w:rtl/>
+              </w:rPr>
+              <w:t xml:space="preserve">الإجابة</w:t>
+            </w:r>
+          </w:p>
+        </w:tc>
+        <w:tc>
+          <w:tcPr>
+            <w:tcW w:w="1800" w:type="dxa"/>
+            <w:shd w:val="clear" w:color="auto" w:fill="B8860B"/>
+            <w:vAlign w:val="center"/>
+          </w:tcPr>
+          <w:p>
+            <w:pPr>
+              <w:bidi/>
+              <w:spacing w:before="0" w:after="0" w:line="276" w:lineRule="auto"/>
+              <w:jc w:val="center"/>
+            </w:pPr>
+            <w:r>
+              <w:rPr>
+                <w:rFonts w:ascii="Calibri" w:eastAsia="Calibri" w:hAnsi="Calibri" w:cs="Arial"/>
+                <w:b/>
+                <w:bCs/>
+                <w:color w:val="FFFFFF"/>
+                <w:sz w:val="24"/>
+                <w:szCs w:val="24"/>
+                <w:rtl/>
+              </w:rPr>
+              <w:t xml:space="preserve">العلامة</w:t>
+            </w:r>
+          </w:p>
+        </w:tc>
+      </w:tr>
+      <w:tr>
+        <w:trPr>
+          <w:cantSplit/>
+          <w:trHeight w:val="440"/>
+        </w:trPr>
+        <w:tc>
+          <w:tcPr>
+            <w:tcW w:w="1700" w:type="dxa"/>
+            <w:shd w:val="clear" w:color="auto" w:fill="EEF6F1"/>
+            <w:vAlign w:val="center"/>
+          </w:tcPr>
+          <w:p>
+            <w:pPr>
+              <w:bidi/>
+              <w:spacing w:before="0" w:after="0" w:line="276" w:lineRule="auto"/>
+              <w:jc w:val="center"/>
+            </w:pPr>
+            <w:r>
+              <w:rPr>
+                <w:rFonts w:ascii="Calibri" w:eastAsia="Calibri" w:hAnsi="Calibri" w:cs="Arial"/>
+                <w:b/>
+                <w:bCs/>
+                <w:color w:val="14532D"/>
+                <w:sz w:val="26"/>
+                <w:szCs w:val="26"/>
+                <w:rtl/>
+              </w:rPr>
+              <w:t xml:space="preserve">أ)</w:t>
+            </w:r>
+          </w:p>
+        </w:tc>
+        <w:tc>
+          <w:tcPr>
+            <w:tcW w:w="6940" w:type="dxa"/>
+            <w:vAlign w:val="center"/>
+          </w:tcPr>
+          <w:p>
+            <w:pPr>
+              <w:bidi w:val="0"/>
+              <w:spacing w:before="0" w:after="20" w:line="276" w:lineRule="auto"/>
+            </w:pPr>
+            <w:r>
+              <w:rPr>
+                <w:rFonts w:ascii="Cambria Math" w:hAnsi="Cambria Math" w:cs="Cambria Math"/>
+                <w:color w:val="1A1A1A"/>
+                <w:sz w:val="26"/>
+                <w:szCs w:val="26"/>
+              </w:rPr>
+              <w:t xml:space="preserve">A = 6√3 / 3 = 2√3</w:t>
+            </w:r>
+          </w:p>
+        </w:tc>
+        <w:tc>
+          <w:tcPr>
+            <w:tcW w:w="1800" w:type="dxa"/>
+            <w:shd w:val="clear" w:color="auto" w:fill="F6E9C6"/>
+            <w:vAlign w:val="center"/>
+          </w:tcPr>
+          <w:p>
+            <w:pPr>
+              <w:bidi w:val="0"/>
+              <w:spacing w:before="0" w:after="0" w:line="276" w:lineRule="auto"/>
+              <w:jc w:val="center"/>
+            </w:pPr>
+            <w:r>
+              <w:rPr>
+                <w:rFonts w:ascii="Cambria Math" w:hAnsi="Cambria Math" w:cs="Cambria Math"/>
+                <w:b/>
+                <w:color w:val="B8860B"/>
+                <w:sz w:val="26"/>
+                <w:szCs w:val="26"/>
+              </w:rPr>
+              <w:t xml:space="preserve">1.5</w:t>
+            </w:r>
+          </w:p>
+        </w:tc>
+      </w:tr>
+      <w:tr>
+        <w:trPr>
+          <w:cantSplit/>
+          <w:trHeight w:val="440"/>
+        </w:trPr>
+        <w:tc>
+          <w:tcPr>
+            <w:tcW w:w="1700" w:type="dxa"/>
+            <w:shd w:val="clear" w:color="auto" w:fill="EEF6F1"/>
+            <w:vAlign w:val="center"/>
+          </w:tcPr>
+          <w:p>
+            <w:pPr>
+              <w:bidi/>
+              <w:spacing w:before="0" w:after="0" w:line="276" w:lineRule="auto"/>
+              <w:jc w:val="center"/>
+            </w:pPr>
+            <w:r>
+              <w:rPr>
+                <w:rFonts w:ascii="Calibri" w:eastAsia="Calibri" w:hAnsi="Calibri" w:cs="Arial"/>
+                <w:b/>
+                <w:bCs/>
+                <w:color w:val="14532D"/>
+                <w:sz w:val="26"/>
+                <w:szCs w:val="26"/>
+                <w:rtl/>
+              </w:rPr>
+              <w:t xml:space="preserve">ب)</w:t>
+            </w:r>
+          </w:p>
+        </w:tc>
+        <w:tc>
+          <w:tcPr>
+            <w:tcW w:w="6940" w:type="dxa"/>
+            <w:vAlign w:val="center"/>
+          </w:tcPr>
+          <w:p>
+            <w:pPr>
+              <w:bidi/>
+              <w:spacing w:before="0" w:after="20" w:line="276" w:lineRule="auto"/>
+            </w:pPr>
+            <w:r>
+              <w:rPr>
+                <w:rFonts w:ascii="Calibri" w:eastAsia="Calibri" w:hAnsi="Calibri" w:cs="Arial"/>
+                <w:color w:val="1A1A1A"/>
+                <w:sz w:val="26"/>
+                <w:szCs w:val="26"/>
+                <w:rtl/>
+              </w:rPr>
+              <w:t xml:space="preserve">نضرب البسط والمقام بالمرافق </w:t>
+            </w:r>
+            <m:oMath>
+              <m:r>
+                <m:rPr>
+                  <m:sty m:val="p"/>
+                </m:rPr>
+                <w:rPr>
+                  <w:rFonts w:ascii="Cambria Math" w:hAnsi="Cambria Math"/>
+                  <w:sz w:val="30"/>
+                  <w:szCs w:val="30"/>
+                </w:rPr>
+                <m:t xml:space="preserve">(√7 + √2)</m:t>
+              </m:r>
+            </m:oMath>
+          </w:p>
+          <w:p>
+            <w:pPr>
+              <w:bidi w:val="0"/>
+              <w:spacing w:before="0" w:after="20" w:line="276" w:lineRule="auto"/>
+            </w:pPr>
+            <w:r>
+              <w:rPr>
+                <w:rFonts w:ascii="Cambria Math" w:hAnsi="Cambria Math" w:cs="Cambria Math"/>
+                <w:color w:val="1A1A1A"/>
+                <w:sz w:val="26"/>
+                <w:szCs w:val="26"/>
+              </w:rPr>
+              <w:t xml:space="preserve">B = 5(√7 + √2) / (7 − 2) = √7 + √2</w:t>
+            </w:r>
+          </w:p>
+        </w:tc>
+        <w:tc>
+          <w:tcPr>
+            <w:tcW w:w="1800" w:type="dxa"/>
+            <w:shd w:val="clear" w:color="auto" w:fill="F6E9C6"/>
+            <w:vAlign w:val="center"/>
+          </w:tcPr>
+          <w:p>
+            <w:pPr>
+              <w:bidi w:val="0"/>
+              <w:spacing w:before="0" w:after="0" w:line="276" w:lineRule="auto"/>
+              <w:jc w:val="center"/>
+            </w:pPr>
+            <w:r>
+              <w:rPr>
+                <w:rFonts w:ascii="Cambria Math" w:hAnsi="Cambria Math" w:cs="Cambria Math"/>
+                <w:b/>
+                <w:color w:val="B8860B"/>
+                <w:sz w:val="26"/>
+                <w:szCs w:val="26"/>
+              </w:rPr>
+              <w:t xml:space="preserve">0.5 + 1</w:t>
+            </w:r>
+          </w:p>
+        </w:tc>
+      </w:tr>
+    </w:tbl>
+    <w:p>
+      <w:pPr>
+        <w:keepNext/>
+        <w:pBdr>
+          <w:top w:val="single" w:sz="18" w:space="3" w:color="14532D"/>
+          <w:bottom w:val="single" w:sz="18" w:space="3" w:color="14532D"/>
+          <w:right w:val="single" w:sz="48" w:space="6" w:color="B8860B"/>
+        </w:pBdr>
+        <w:shd w:val="clear" w:color="auto" w:fill="14532D"/>
+        <w:bidi/>
+        <w:spacing w:before="180" w:after="100" w:line="276" w:lineRule="auto"/>
+        <w:ind w:left="120" w:right="120"/>
+      </w:pPr>
+      <w:r>
+        <w:rPr>
+          <w:rFonts w:ascii="Calibri" w:eastAsia="Calibri" w:hAnsi="Calibri" w:cs="Arial"/>
+          <w:b/>
+          <w:bCs/>
+          <w:color w:val="FFFFFF"/>
+          <w:sz w:val="30"/>
+          <w:szCs w:val="30"/>
+          <w:rtl/>
+        </w:rPr>
+        <w:t xml:space="preserve">السؤال الثالث: المتطابقات الشهيرة</w:t>
       </w:r>
       <w:r>
         <w:rPr>
@@ -790,7 +1249,7 @@
           <w:szCs w:val="30"/>
           <w:rtl/>
         </w:rPr>
-        <w:t xml:space="preserve">السؤال الثالث: تحليل عبارات من الدرجة الثانية</w:t>
+        <w:t xml:space="preserve">السؤال الرابع: تحليل عبارات من الدرجة الثانية</w:t>
       </w:r>
       <w:r>
         <w:rPr>
@@ -1119,985 +1578,6 @@
           <w:rtl/>
         </w:rPr>
         <w:t xml:space="preserve">تُقبل أي طريقة صحيحة (المميّز Δ، أو المجموع والجداء، أو التجميع) وتُعطى العلامة كاملة.</w:t>
-      </w:r>
-    </w:p>
-    <w:p>
-      <w:pPr>
-        <w:keepNext/>
-        <w:pBdr>
-          <w:top w:val="single" w:sz="18" w:space="3" w:color="14532D"/>
-          <w:bottom w:val="single" w:sz="18" w:space="3" w:color="14532D"/>
-          <w:right w:val="single" w:sz="48" w:space="6" w:color="B8860B"/>
-        </w:pBdr>
-        <w:shd w:val="clear" w:color="auto" w:fill="14532D"/>
-        <w:bidi/>
-        <w:spacing w:before="180" w:after="100" w:line="276" w:lineRule="auto"/>
-        <w:ind w:left="120" w:right="120"/>
-      </w:pPr>
-      <w:r>
-        <w:rPr>
-          <w:rFonts w:ascii="Calibri" w:eastAsia="Calibri" w:hAnsi="Calibri" w:cs="Arial"/>
-          <w:b/>
-          <w:bCs/>
-          <w:color w:val="FFFFFF"/>
-          <w:sz w:val="30"/>
-          <w:szCs w:val="30"/>
-          <w:rtl/>
-        </w:rPr>
-        <w:t xml:space="preserve">السؤال الرابع: المتراجحات</w:t>
-      </w:r>
-      <w:r>
-        <w:rPr>
-          <w:rFonts w:ascii="Calibri" w:eastAsia="Calibri" w:hAnsi="Calibri" w:cs="Arial"/>
-          <w:b/>
-          <w:bCs/>
-          <w:color w:val="F6D98B"/>
-          <w:sz w:val="26"/>
-          <w:szCs w:val="26"/>
-          <w:rtl/>
-        </w:rPr>
-        <w:t xml:space="preserve">   —  3 علامات</w:t>
-      </w:r>
-    </w:p>
-    <w:p>
-      <w:pPr>
-        <w:keepNext/>
-        <w:bidi/>
-        <w:spacing w:before="120" w:after="60" w:line="276" w:lineRule="auto"/>
-      </w:pPr>
-      <m:oMath>
-        <m:sSup>
-          <m:sSupPr>
-            <m:ctrlPr>
-              <w:rPr>
-                <w:rFonts w:ascii="Cambria Math" w:hAnsi="Cambria Math"/>
-                <w:sz w:val="30"/>
-                <w:szCs w:val="30"/>
-              </w:rPr>
-            </m:ctrlPr>
-          </m:sSupPr>
-          <m:e>
-            <m:r>
-              <w:rPr>
-                <w:rFonts w:ascii="Cambria Math" w:hAnsi="Cambria Math"/>
-                <w:sz w:val="30"/>
-                <w:szCs w:val="30"/>
-              </w:rPr>
-              <m:t xml:space="preserve">x</m:t>
-            </m:r>
-          </m:e>
-          <m:sup>
-            <m:r>
-              <m:rPr>
-                <m:sty m:val="p"/>
-              </m:rPr>
-              <w:rPr>
-                <w:rFonts w:ascii="Cambria Math" w:hAnsi="Cambria Math"/>
-                <w:sz w:val="30"/>
-                <w:szCs w:val="30"/>
-              </w:rPr>
-              <m:t xml:space="preserve">2</m:t>
-            </m:r>
-          </m:sup>
-        </m:sSup>
-        <m:r>
-          <m:rPr>
-            <m:sty m:val="p"/>
-          </m:rPr>
-          <w:rPr>
-            <w:rFonts w:ascii="Cambria Math" w:hAnsi="Cambria Math"/>
-            <w:sz w:val="30"/>
-            <w:szCs w:val="30"/>
-          </w:rPr>
-          <m:t xml:space="preserve"> − 5</m:t>
-        </m:r>
-        <m:r>
-          <w:rPr>
-            <w:rFonts w:ascii="Cambria Math" w:hAnsi="Cambria Math"/>
-            <w:sz w:val="30"/>
-            <w:szCs w:val="30"/>
-          </w:rPr>
-          <m:t xml:space="preserve">x</m:t>
-        </m:r>
-        <m:r>
-          <m:rPr>
-            <m:sty m:val="p"/>
-          </m:rPr>
-          <w:rPr>
-            <w:rFonts w:ascii="Cambria Math" w:hAnsi="Cambria Math"/>
-            <w:sz w:val="30"/>
-            <w:szCs w:val="30"/>
-          </w:rPr>
-          <m:t xml:space="preserve"> + 6 ≤ 0  ⇔  (</m:t>
-        </m:r>
-        <m:r>
-          <w:rPr>
-            <w:rFonts w:ascii="Cambria Math" w:hAnsi="Cambria Math"/>
-            <w:sz w:val="30"/>
-            <w:szCs w:val="30"/>
-          </w:rPr>
-          <m:t xml:space="preserve">x</m:t>
-        </m:r>
-        <m:r>
-          <m:rPr>
-            <m:sty m:val="p"/>
-          </m:rPr>
-          <w:rPr>
-            <w:rFonts w:ascii="Cambria Math" w:hAnsi="Cambria Math"/>
-            <w:sz w:val="30"/>
-            <w:szCs w:val="30"/>
-          </w:rPr>
-          <m:t xml:space="preserve"> − 2)(</m:t>
-        </m:r>
-        <m:r>
-          <w:rPr>
-            <w:rFonts w:ascii="Cambria Math" w:hAnsi="Cambria Math"/>
-            <w:sz w:val="30"/>
-            <w:szCs w:val="30"/>
-          </w:rPr>
-          <m:t xml:space="preserve">x</m:t>
-        </m:r>
-        <m:r>
-          <m:rPr>
-            <m:sty m:val="p"/>
-          </m:rPr>
-          <w:rPr>
-            <w:rFonts w:ascii="Cambria Math" w:hAnsi="Cambria Math"/>
-            <w:sz w:val="30"/>
-            <w:szCs w:val="30"/>
-          </w:rPr>
-          <m:t xml:space="preserve"> − 3) ≤ 0</m:t>
-        </m:r>
-      </m:oMath>
-    </w:p>
-    <w:tbl>
-      <w:tblPr>
-        <w:tblW w:w="10380" w:type="dxa"/>
-        <w:jc w:val="center"/>
-        <w:tblBorders>
-          <w:top w:val="single" w:sz="6" w:space="0" w:color="A7C4B2"/>
-          <w:left w:val="single" w:sz="6" w:space="0" w:color="A7C4B2"/>
-          <w:bottom w:val="single" w:sz="6" w:space="0" w:color="A7C4B2"/>
-          <w:right w:val="single" w:sz="6" w:space="0" w:color="A7C4B2"/>
-          <w:insideH w:val="single" w:sz="6" w:space="0" w:color="A7C4B2"/>
-          <w:insideV w:val="single" w:sz="6" w:space="0" w:color="A7C4B2"/>
-        </w:tblBorders>
-        <w:tblLayout w:type="fixed"/>
-        <w:tblCellMar>
-          <w:top w:w="80" w:type="dxa"/>
-          <w:left w:w="110" w:type="dxa"/>
-          <w:bottom w:w="80" w:type="dxa"/>
-          <w:right w:w="110" w:type="dxa"/>
-        </w:tblCellMar>
-        <w:tblLook w:val="04A0" w:firstRow="1" w:lastRow="0" w:firstColumn="1" w:lastColumn="0" w:noHBand="0" w:noVBand="1"/>
-      </w:tblPr>
-      <w:tblGrid>
-        <w:gridCol w:w="1560"/>
-        <w:gridCol w:w="1260"/>
-        <w:gridCol w:w="1260"/>
-        <w:gridCol w:w="1260"/>
-        <w:gridCol w:w="1260"/>
-        <w:gridCol w:w="1260"/>
-        <w:gridCol w:w="1260"/>
-        <w:gridCol w:w="1260"/>
-      </w:tblGrid>
-      <w:tr>
-        <w:trPr>
-          <w:cantSplit/>
-          <w:trHeight w:val="460"/>
-        </w:trPr>
-        <w:tc>
-          <w:tcPr>
-            <w:tcW w:w="1560" w:type="dxa"/>
-            <w:shd w:val="clear" w:color="auto" w:fill="EEF6F1"/>
-            <w:vAlign w:val="center"/>
-          </w:tcPr>
-          <w:p>
-            <w:pPr>
-              <w:bidi w:val="0"/>
-              <w:spacing w:before="0" w:after="0" w:line="276" w:lineRule="auto"/>
-              <w:jc w:val="center"/>
-            </w:pPr>
-            <w:r>
-              <w:rPr>
-                <w:rFonts w:ascii="Cambria Math" w:hAnsi="Cambria Math" w:cs="Cambria Math"/>
-                <w:color w:val="1A1A1A"/>
-                <w:sz w:val="26"/>
-                <w:szCs w:val="26"/>
-              </w:rPr>
-              <w:t xml:space="preserve">x</w:t>
-            </w:r>
-          </w:p>
-        </w:tc>
-        <w:tc>
-          <w:tcPr>
-            <w:tcW w:w="1260" w:type="dxa"/>
-            <w:shd w:val="clear" w:color="auto" w:fill="EEF6F1"/>
-            <w:vAlign w:val="center"/>
-          </w:tcPr>
-          <w:p>
-            <w:pPr>
-              <w:bidi w:val="0"/>
-              <w:spacing w:before="0" w:after="0" w:line="276" w:lineRule="auto"/>
-              <w:jc w:val="center"/>
-            </w:pPr>
-            <w:r>
-              <w:rPr>
-                <w:rFonts w:ascii="Cambria Math" w:hAnsi="Cambria Math" w:cs="Cambria Math"/>
-                <w:color w:val="1A1A1A"/>
-                <w:sz w:val="26"/>
-                <w:szCs w:val="26"/>
-              </w:rPr>
-              <w:t xml:space="preserve">−∞</w:t>
-            </w:r>
-          </w:p>
-        </w:tc>
-        <w:tc>
-          <w:tcPr>
-            <w:tcW w:w="1260" w:type="dxa"/>
-            <w:shd w:val="clear" w:color="auto" w:fill="EEF6F1"/>
-            <w:vAlign w:val="center"/>
-          </w:tcPr>
-          <w:p>
-            <w:pPr>
-              <w:bidi w:val="0"/>
-              <w:spacing w:before="0" w:after="0" w:line="276" w:lineRule="auto"/>
-              <w:jc w:val="center"/>
-            </w:pPr>
-            <w:r>
-              <w:rPr>
-                <w:rFonts w:ascii="Cambria Math" w:hAnsi="Cambria Math" w:cs="Cambria Math"/>
-                <w:color w:val="1A1A1A"/>
-                <w:sz w:val="26"/>
-                <w:szCs w:val="26"/>
-              </w:rPr>
-              <w:t xml:space="preserve"/>
-            </w:r>
-          </w:p>
-        </w:tc>
-        <w:tc>
-          <w:tcPr>
-            <w:tcW w:w="1260" w:type="dxa"/>
-            <w:shd w:val="clear" w:color="auto" w:fill="EEF6F1"/>
-            <w:vAlign w:val="center"/>
-          </w:tcPr>
-          <w:p>
-            <w:pPr>
-              <w:bidi w:val="0"/>
-              <w:spacing w:before="0" w:after="0" w:line="276" w:lineRule="auto"/>
-              <w:jc w:val="center"/>
-            </w:pPr>
-            <w:r>
-              <w:rPr>
-                <w:rFonts w:ascii="Cambria Math" w:hAnsi="Cambria Math" w:cs="Cambria Math"/>
-                <w:color w:val="1A1A1A"/>
-                <w:sz w:val="26"/>
-                <w:szCs w:val="26"/>
-              </w:rPr>
-              <w:t xml:space="preserve">2</w:t>
-            </w:r>
-          </w:p>
-        </w:tc>
-        <w:tc>
-          <w:tcPr>
-            <w:tcW w:w="1260" w:type="dxa"/>
-            <w:shd w:val="clear" w:color="auto" w:fill="EEF6F1"/>
-            <w:vAlign w:val="center"/>
-          </w:tcPr>
-          <w:p>
-            <w:pPr>
-              <w:bidi w:val="0"/>
-              <w:spacing w:before="0" w:after="0" w:line="276" w:lineRule="auto"/>
-              <w:jc w:val="center"/>
-            </w:pPr>
-            <w:r>
-              <w:rPr>
-                <w:rFonts w:ascii="Cambria Math" w:hAnsi="Cambria Math" w:cs="Cambria Math"/>
-                <w:color w:val="1A1A1A"/>
-                <w:sz w:val="26"/>
-                <w:szCs w:val="26"/>
-              </w:rPr>
-              <w:t xml:space="preserve"/>
-            </w:r>
-          </w:p>
-        </w:tc>
-        <w:tc>
-          <w:tcPr>
-            <w:tcW w:w="1260" w:type="dxa"/>
-            <w:shd w:val="clear" w:color="auto" w:fill="EEF6F1"/>
-            <w:vAlign w:val="center"/>
-          </w:tcPr>
-          <w:p>
-            <w:pPr>
-              <w:bidi w:val="0"/>
-              <w:spacing w:before="0" w:after="0" w:line="276" w:lineRule="auto"/>
-              <w:jc w:val="center"/>
-            </w:pPr>
-            <w:r>
-              <w:rPr>
-                <w:rFonts w:ascii="Cambria Math" w:hAnsi="Cambria Math" w:cs="Cambria Math"/>
-                <w:color w:val="1A1A1A"/>
-                <w:sz w:val="26"/>
-                <w:szCs w:val="26"/>
-              </w:rPr>
-              <w:t xml:space="preserve">3</w:t>
-            </w:r>
-          </w:p>
-        </w:tc>
-        <w:tc>
-          <w:tcPr>
-            <w:tcW w:w="1260" w:type="dxa"/>
-            <w:shd w:val="clear" w:color="auto" w:fill="EEF6F1"/>
-            <w:vAlign w:val="center"/>
-          </w:tcPr>
-          <w:p>
-            <w:pPr>
-              <w:bidi w:val="0"/>
-              <w:spacing w:before="0" w:after="0" w:line="276" w:lineRule="auto"/>
-              <w:jc w:val="center"/>
-            </w:pPr>
-            <w:r>
-              <w:rPr>
-                <w:rFonts w:ascii="Cambria Math" w:hAnsi="Cambria Math" w:cs="Cambria Math"/>
-                <w:color w:val="1A1A1A"/>
-                <w:sz w:val="26"/>
-                <w:szCs w:val="26"/>
-              </w:rPr>
-              <w:t xml:space="preserve"/>
-            </w:r>
-          </w:p>
-        </w:tc>
-        <w:tc>
-          <w:tcPr>
-            <w:tcW w:w="1260" w:type="dxa"/>
-            <w:shd w:val="clear" w:color="auto" w:fill="EEF6F1"/>
-            <w:vAlign w:val="center"/>
-          </w:tcPr>
-          <w:p>
-            <w:pPr>
-              <w:bidi w:val="0"/>
-              <w:spacing w:before="0" w:after="0" w:line="276" w:lineRule="auto"/>
-              <w:jc w:val="center"/>
-            </w:pPr>
-            <w:r>
-              <w:rPr>
-                <w:rFonts w:ascii="Cambria Math" w:hAnsi="Cambria Math" w:cs="Cambria Math"/>
-                <w:color w:val="1A1A1A"/>
-                <w:sz w:val="26"/>
-                <w:szCs w:val="26"/>
-              </w:rPr>
-              <w:t xml:space="preserve">+∞</w:t>
-            </w:r>
-          </w:p>
-        </w:tc>
-      </w:tr>
-      <w:tr>
-        <w:trPr>
-          <w:cantSplit/>
-          <w:trHeight w:val="460"/>
-        </w:trPr>
-        <w:tc>
-          <w:tcPr>
-            <w:tcW w:w="1560" w:type="dxa"/>
-            <w:shd w:val="clear" w:color="auto" w:fill="EEF6F1"/>
-            <w:vAlign w:val="center"/>
-          </w:tcPr>
-          <w:p>
-            <w:pPr>
-              <w:bidi w:val="0"/>
-              <w:spacing w:before="0" w:after="0" w:line="276" w:lineRule="auto"/>
-              <w:jc w:val="center"/>
-            </w:pPr>
-            <w:r>
-              <w:rPr>
-                <w:rFonts w:ascii="Cambria Math" w:hAnsi="Cambria Math" w:cs="Cambria Math"/>
-                <w:color w:val="1A1A1A"/>
-                <w:sz w:val="26"/>
-                <w:szCs w:val="26"/>
-              </w:rPr>
-              <w:t xml:space="preserve">x − 2</w:t>
-            </w:r>
-          </w:p>
-        </w:tc>
-        <w:tc>
-          <w:tcPr>
-            <w:tcW w:w="1260" w:type="dxa"/>
-            <w:vAlign w:val="center"/>
-          </w:tcPr>
-          <w:p>
-            <w:pPr>
-              <w:bidi w:val="0"/>
-              <w:spacing w:before="0" w:after="0" w:line="276" w:lineRule="auto"/>
-              <w:jc w:val="center"/>
-            </w:pPr>
-            <w:r>
-              <w:rPr>
-                <w:rFonts w:ascii="Cambria Math" w:hAnsi="Cambria Math" w:cs="Cambria Math"/>
-                <w:color w:val="1A1A1A"/>
-                <w:sz w:val="26"/>
-                <w:szCs w:val="26"/>
-              </w:rPr>
-              <w:t xml:space="preserve"/>
-            </w:r>
-          </w:p>
-        </w:tc>
-        <w:tc>
-          <w:tcPr>
-            <w:tcW w:w="1260" w:type="dxa"/>
-            <w:vAlign w:val="center"/>
-          </w:tcPr>
-          <w:p>
-            <w:pPr>
-              <w:bidi w:val="0"/>
-              <w:spacing w:before="0" w:after="0" w:line="276" w:lineRule="auto"/>
-              <w:jc w:val="center"/>
-            </w:pPr>
-            <w:r>
-              <w:rPr>
-                <w:rFonts w:ascii="Cambria Math" w:hAnsi="Cambria Math" w:cs="Cambria Math"/>
-                <w:color w:val="1A1A1A"/>
-                <w:sz w:val="26"/>
-                <w:szCs w:val="26"/>
-              </w:rPr>
-              <w:t xml:space="preserve">−</w:t>
-            </w:r>
-          </w:p>
-        </w:tc>
-        <w:tc>
-          <w:tcPr>
-            <w:tcW w:w="1260" w:type="dxa"/>
-            <w:vAlign w:val="center"/>
-          </w:tcPr>
-          <w:p>
-            <w:pPr>
-              <w:bidi w:val="0"/>
-              <w:spacing w:before="0" w:after="0" w:line="276" w:lineRule="auto"/>
-              <w:jc w:val="center"/>
-            </w:pPr>
-            <w:r>
-              <w:rPr>
-                <w:rFonts w:ascii="Cambria Math" w:hAnsi="Cambria Math" w:cs="Cambria Math"/>
-                <w:color w:val="1A1A1A"/>
-                <w:sz w:val="26"/>
-                <w:szCs w:val="26"/>
-              </w:rPr>
-              <w:t xml:space="preserve">0</w:t>
-            </w:r>
-          </w:p>
-        </w:tc>
-        <w:tc>
-          <w:tcPr>
-            <w:tcW w:w="1260" w:type="dxa"/>
-            <w:vAlign w:val="center"/>
-          </w:tcPr>
-          <w:p>
-            <w:pPr>
-              <w:bidi w:val="0"/>
-              <w:spacing w:before="0" w:after="0" w:line="276" w:lineRule="auto"/>
-              <w:jc w:val="center"/>
-            </w:pPr>
-            <w:r>
-              <w:rPr>
-                <w:rFonts w:ascii="Cambria Math" w:hAnsi="Cambria Math" w:cs="Cambria Math"/>
-                <w:color w:val="1A1A1A"/>
-                <w:sz w:val="26"/>
-                <w:szCs w:val="26"/>
-              </w:rPr>
-              <w:t xml:space="preserve">+</w:t>
-            </w:r>
-          </w:p>
-        </w:tc>
-        <w:tc>
-          <w:tcPr>
-            <w:tcW w:w="1260" w:type="dxa"/>
-            <w:vAlign w:val="center"/>
-          </w:tcPr>
-          <w:p>
-            <w:pPr>
-              <w:bidi w:val="0"/>
-              <w:spacing w:before="0" w:after="0" w:line="276" w:lineRule="auto"/>
-              <w:jc w:val="center"/>
-            </w:pPr>
-            <w:r>
-              <w:rPr>
-                <w:rFonts w:ascii="Cambria Math" w:hAnsi="Cambria Math" w:cs="Cambria Math"/>
-                <w:color w:val="1A1A1A"/>
-                <w:sz w:val="26"/>
-                <w:szCs w:val="26"/>
-              </w:rPr>
-              <w:t xml:space="preserve">|</w:t>
-            </w:r>
-          </w:p>
-        </w:tc>
-        <w:tc>
-          <w:tcPr>
-            <w:tcW w:w="1260" w:type="dxa"/>
-            <w:vAlign w:val="center"/>
-          </w:tcPr>
-          <w:p>
-            <w:pPr>
-              <w:bidi w:val="0"/>
-              <w:spacing w:before="0" w:after="0" w:line="276" w:lineRule="auto"/>
-              <w:jc w:val="center"/>
-            </w:pPr>
-            <w:r>
-              <w:rPr>
-                <w:rFonts w:ascii="Cambria Math" w:hAnsi="Cambria Math" w:cs="Cambria Math"/>
-                <w:color w:val="1A1A1A"/>
-                <w:sz w:val="26"/>
-                <w:szCs w:val="26"/>
-              </w:rPr>
-              <w:t xml:space="preserve">+</w:t>
-            </w:r>
-          </w:p>
-        </w:tc>
-        <w:tc>
-          <w:tcPr>
-            <w:tcW w:w="1260" w:type="dxa"/>
-            <w:vAlign w:val="center"/>
-          </w:tcPr>
-          <w:p>
-            <w:pPr>
-              <w:bidi w:val="0"/>
-              <w:spacing w:before="0" w:after="0" w:line="276" w:lineRule="auto"/>
-              <w:jc w:val="center"/>
-            </w:pPr>
-            <w:r>
-              <w:rPr>
-                <w:rFonts w:ascii="Cambria Math" w:hAnsi="Cambria Math" w:cs="Cambria Math"/>
-                <w:color w:val="1A1A1A"/>
-                <w:sz w:val="26"/>
-                <w:szCs w:val="26"/>
-              </w:rPr>
-              <w:t xml:space="preserve"/>
-            </w:r>
-          </w:p>
-        </w:tc>
-      </w:tr>
-      <w:tr>
-        <w:trPr>
-          <w:cantSplit/>
-          <w:trHeight w:val="460"/>
-        </w:trPr>
-        <w:tc>
-          <w:tcPr>
-            <w:tcW w:w="1560" w:type="dxa"/>
-            <w:shd w:val="clear" w:color="auto" w:fill="EEF6F1"/>
-            <w:vAlign w:val="center"/>
-          </w:tcPr>
-          <w:p>
-            <w:pPr>
-              <w:bidi w:val="0"/>
-              <w:spacing w:before="0" w:after="0" w:line="276" w:lineRule="auto"/>
-              <w:jc w:val="center"/>
-            </w:pPr>
-            <w:r>
-              <w:rPr>
-                <w:rFonts w:ascii="Cambria Math" w:hAnsi="Cambria Math" w:cs="Cambria Math"/>
-                <w:color w:val="1A1A1A"/>
-                <w:sz w:val="26"/>
-                <w:szCs w:val="26"/>
-              </w:rPr>
-              <w:t xml:space="preserve">x − 3</w:t>
-            </w:r>
-          </w:p>
-        </w:tc>
-        <w:tc>
-          <w:tcPr>
-            <w:tcW w:w="1260" w:type="dxa"/>
-            <w:vAlign w:val="center"/>
-          </w:tcPr>
-          <w:p>
-            <w:pPr>
-              <w:bidi w:val="0"/>
-              <w:spacing w:before="0" w:after="0" w:line="276" w:lineRule="auto"/>
-              <w:jc w:val="center"/>
-            </w:pPr>
-            <w:r>
-              <w:rPr>
-                <w:rFonts w:ascii="Cambria Math" w:hAnsi="Cambria Math" w:cs="Cambria Math"/>
-                <w:color w:val="1A1A1A"/>
-                <w:sz w:val="26"/>
-                <w:szCs w:val="26"/>
-              </w:rPr>
-              <w:t xml:space="preserve"/>
-            </w:r>
-          </w:p>
-        </w:tc>
-        <w:tc>
-          <w:tcPr>
-            <w:tcW w:w="1260" w:type="dxa"/>
-            <w:vAlign w:val="center"/>
-          </w:tcPr>
-          <w:p>
-            <w:pPr>
-              <w:bidi w:val="0"/>
-              <w:spacing w:before="0" w:after="0" w:line="276" w:lineRule="auto"/>
-              <w:jc w:val="center"/>
-            </w:pPr>
-            <w:r>
-              <w:rPr>
-                <w:rFonts w:ascii="Cambria Math" w:hAnsi="Cambria Math" w:cs="Cambria Math"/>
-                <w:color w:val="1A1A1A"/>
-                <w:sz w:val="26"/>
-                <w:szCs w:val="26"/>
-              </w:rPr>
-              <w:t xml:space="preserve">−</w:t>
-            </w:r>
-          </w:p>
-        </w:tc>
-        <w:tc>
-          <w:tcPr>
-            <w:tcW w:w="1260" w:type="dxa"/>
-            <w:vAlign w:val="center"/>
-          </w:tcPr>
-          <w:p>
-            <w:pPr>
-              <w:bidi w:val="0"/>
-              <w:spacing w:before="0" w:after="0" w:line="276" w:lineRule="auto"/>
-              <w:jc w:val="center"/>
-            </w:pPr>
-            <w:r>
-              <w:rPr>
-                <w:rFonts w:ascii="Cambria Math" w:hAnsi="Cambria Math" w:cs="Cambria Math"/>
-                <w:color w:val="1A1A1A"/>
-                <w:sz w:val="26"/>
-                <w:szCs w:val="26"/>
-              </w:rPr>
-              <w:t xml:space="preserve">|</w:t>
-            </w:r>
-          </w:p>
-        </w:tc>
-        <w:tc>
-          <w:tcPr>
-            <w:tcW w:w="1260" w:type="dxa"/>
-            <w:vAlign w:val="center"/>
-          </w:tcPr>
-          <w:p>
-            <w:pPr>
-              <w:bidi w:val="0"/>
-              <w:spacing w:before="0" w:after="0" w:line="276" w:lineRule="auto"/>
-              <w:jc w:val="center"/>
-            </w:pPr>
-            <w:r>
-              <w:rPr>
-                <w:rFonts w:ascii="Cambria Math" w:hAnsi="Cambria Math" w:cs="Cambria Math"/>
-                <w:color w:val="1A1A1A"/>
-                <w:sz w:val="26"/>
-                <w:szCs w:val="26"/>
-              </w:rPr>
-              <w:t xml:space="preserve">−</w:t>
-            </w:r>
-          </w:p>
-        </w:tc>
-        <w:tc>
-          <w:tcPr>
-            <w:tcW w:w="1260" w:type="dxa"/>
-            <w:vAlign w:val="center"/>
-          </w:tcPr>
-          <w:p>
-            <w:pPr>
-              <w:bidi w:val="0"/>
-              <w:spacing w:before="0" w:after="0" w:line="276" w:lineRule="auto"/>
-              <w:jc w:val="center"/>
-            </w:pPr>
-            <w:r>
-              <w:rPr>
-                <w:rFonts w:ascii="Cambria Math" w:hAnsi="Cambria Math" w:cs="Cambria Math"/>
-                <w:color w:val="1A1A1A"/>
-                <w:sz w:val="26"/>
-                <w:szCs w:val="26"/>
-              </w:rPr>
-              <w:t xml:space="preserve">0</w:t>
-            </w:r>
-          </w:p>
-        </w:tc>
-        <w:tc>
-          <w:tcPr>
-            <w:tcW w:w="1260" w:type="dxa"/>
-            <w:vAlign w:val="center"/>
-          </w:tcPr>
-          <w:p>
-            <w:pPr>
-              <w:bidi w:val="0"/>
-              <w:spacing w:before="0" w:after="0" w:line="276" w:lineRule="auto"/>
-              <w:jc w:val="center"/>
-            </w:pPr>
-            <w:r>
-              <w:rPr>
-                <w:rFonts w:ascii="Cambria Math" w:hAnsi="Cambria Math" w:cs="Cambria Math"/>
-                <w:color w:val="1A1A1A"/>
-                <w:sz w:val="26"/>
-                <w:szCs w:val="26"/>
-              </w:rPr>
-              <w:t xml:space="preserve">+</w:t>
-            </w:r>
-          </w:p>
-        </w:tc>
-        <w:tc>
-          <w:tcPr>
-            <w:tcW w:w="1260" w:type="dxa"/>
-            <w:vAlign w:val="center"/>
-          </w:tcPr>
-          <w:p>
-            <w:pPr>
-              <w:bidi w:val="0"/>
-              <w:spacing w:before="0" w:after="0" w:line="276" w:lineRule="auto"/>
-              <w:jc w:val="center"/>
-            </w:pPr>
-            <w:r>
-              <w:rPr>
-                <w:rFonts w:ascii="Cambria Math" w:hAnsi="Cambria Math" w:cs="Cambria Math"/>
-                <w:color w:val="1A1A1A"/>
-                <w:sz w:val="26"/>
-                <w:szCs w:val="26"/>
-              </w:rPr>
-              <w:t xml:space="preserve"/>
-            </w:r>
-          </w:p>
-        </w:tc>
-      </w:tr>
-      <w:tr>
-        <w:trPr>
-          <w:cantSplit/>
-          <w:trHeight w:val="460"/>
-        </w:trPr>
-        <w:tc>
-          <w:tcPr>
-            <w:tcW w:w="1560" w:type="dxa"/>
-            <w:shd w:val="clear" w:color="auto" w:fill="EEF6F1"/>
-            <w:vAlign w:val="center"/>
-          </w:tcPr>
-          <w:p>
-            <w:pPr>
-              <w:bidi w:val="0"/>
-              <w:spacing w:before="0" w:after="0" w:line="276" w:lineRule="auto"/>
-              <w:jc w:val="center"/>
-            </w:pPr>
-            <w:r>
-              <w:rPr>
-                <w:rFonts w:ascii="Cambria Math" w:hAnsi="Cambria Math" w:cs="Cambria Math"/>
-                <w:color w:val="1A1A1A"/>
-                <w:sz w:val="26"/>
-                <w:szCs w:val="26"/>
-              </w:rPr>
-              <w:t xml:space="preserve">P(x)</w:t>
-            </w:r>
-          </w:p>
-        </w:tc>
-        <w:tc>
-          <w:tcPr>
-            <w:tcW w:w="1260" w:type="dxa"/>
-            <w:vAlign w:val="center"/>
-          </w:tcPr>
-          <w:p>
-            <w:pPr>
-              <w:bidi w:val="0"/>
-              <w:spacing w:before="0" w:after="0" w:line="276" w:lineRule="auto"/>
-              <w:jc w:val="center"/>
-            </w:pPr>
-            <w:r>
-              <w:rPr>
-                <w:rFonts w:ascii="Cambria Math" w:hAnsi="Cambria Math" w:cs="Cambria Math"/>
-                <w:color w:val="1A1A1A"/>
-                <w:sz w:val="26"/>
-                <w:szCs w:val="26"/>
-              </w:rPr>
-              <w:t xml:space="preserve"/>
-            </w:r>
-          </w:p>
-        </w:tc>
-        <w:tc>
-          <w:tcPr>
-            <w:tcW w:w="1260" w:type="dxa"/>
-            <w:vAlign w:val="center"/>
-          </w:tcPr>
-          <w:p>
-            <w:pPr>
-              <w:bidi w:val="0"/>
-              <w:spacing w:before="0" w:after="0" w:line="276" w:lineRule="auto"/>
-              <w:jc w:val="center"/>
-            </w:pPr>
-            <w:r>
-              <w:rPr>
-                <w:rFonts w:ascii="Cambria Math" w:hAnsi="Cambria Math" w:cs="Cambria Math"/>
-                <w:color w:val="1A1A1A"/>
-                <w:sz w:val="26"/>
-                <w:szCs w:val="26"/>
-              </w:rPr>
-              <w:t xml:space="preserve">+</w:t>
-            </w:r>
-          </w:p>
-        </w:tc>
-        <w:tc>
-          <w:tcPr>
-            <w:tcW w:w="1260" w:type="dxa"/>
-            <w:vAlign w:val="center"/>
-          </w:tcPr>
-          <w:p>
-            <w:pPr>
-              <w:bidi w:val="0"/>
-              <w:spacing w:before="0" w:after="0" w:line="276" w:lineRule="auto"/>
-              <w:jc w:val="center"/>
-            </w:pPr>
-            <w:r>
-              <w:rPr>
-                <w:rFonts w:ascii="Cambria Math" w:hAnsi="Cambria Math" w:cs="Cambria Math"/>
-                <w:color w:val="1A1A1A"/>
-                <w:sz w:val="26"/>
-                <w:szCs w:val="26"/>
-              </w:rPr>
-              <w:t xml:space="preserve">0</w:t>
-            </w:r>
-          </w:p>
-        </w:tc>
-        <w:tc>
-          <w:tcPr>
-            <w:tcW w:w="1260" w:type="dxa"/>
-            <w:vAlign w:val="center"/>
-          </w:tcPr>
-          <w:p>
-            <w:pPr>
-              <w:bidi w:val="0"/>
-              <w:spacing w:before="0" w:after="0" w:line="276" w:lineRule="auto"/>
-              <w:jc w:val="center"/>
-            </w:pPr>
-            <w:r>
-              <w:rPr>
-                <w:rFonts w:ascii="Cambria Math" w:hAnsi="Cambria Math" w:cs="Cambria Math"/>
-                <w:color w:val="1A1A1A"/>
-                <w:sz w:val="26"/>
-                <w:szCs w:val="26"/>
-              </w:rPr>
-              <w:t xml:space="preserve">−</w:t>
-            </w:r>
-          </w:p>
-        </w:tc>
-        <w:tc>
-          <w:tcPr>
-            <w:tcW w:w="1260" w:type="dxa"/>
-            <w:vAlign w:val="center"/>
-          </w:tcPr>
-          <w:p>
-            <w:pPr>
-              <w:bidi w:val="0"/>
-              <w:spacing w:before="0" w:after="0" w:line="276" w:lineRule="auto"/>
-              <w:jc w:val="center"/>
-            </w:pPr>
-            <w:r>
-              <w:rPr>
-                <w:rFonts w:ascii="Cambria Math" w:hAnsi="Cambria Math" w:cs="Cambria Math"/>
-                <w:color w:val="1A1A1A"/>
-                <w:sz w:val="26"/>
-                <w:szCs w:val="26"/>
-              </w:rPr>
-              <w:t xml:space="preserve">0</w:t>
-            </w:r>
-          </w:p>
-        </w:tc>
-        <w:tc>
-          <w:tcPr>
-            <w:tcW w:w="1260" w:type="dxa"/>
-            <w:vAlign w:val="center"/>
-          </w:tcPr>
-          <w:p>
-            <w:pPr>
-              <w:bidi w:val="0"/>
-              <w:spacing w:before="0" w:after="0" w:line="276" w:lineRule="auto"/>
-              <w:jc w:val="center"/>
-            </w:pPr>
-            <w:r>
-              <w:rPr>
-                <w:rFonts w:ascii="Cambria Math" w:hAnsi="Cambria Math" w:cs="Cambria Math"/>
-                <w:color w:val="1A1A1A"/>
-                <w:sz w:val="26"/>
-                <w:szCs w:val="26"/>
-              </w:rPr>
-              <w:t xml:space="preserve">+</w:t>
-            </w:r>
-          </w:p>
-        </w:tc>
-        <w:tc>
-          <w:tcPr>
-            <w:tcW w:w="1260" w:type="dxa"/>
-            <w:vAlign w:val="center"/>
-          </w:tcPr>
-          <w:p>
-            <w:pPr>
-              <w:bidi w:val="0"/>
-              <w:spacing w:before="0" w:after="0" w:line="276" w:lineRule="auto"/>
-              <w:jc w:val="center"/>
-            </w:pPr>
-            <w:r>
-              <w:rPr>
-                <w:rFonts w:ascii="Cambria Math" w:hAnsi="Cambria Math" w:cs="Cambria Math"/>
-                <w:color w:val="1A1A1A"/>
-                <w:sz w:val="26"/>
-                <w:szCs w:val="26"/>
-              </w:rPr>
-              <w:t xml:space="preserve"/>
-            </w:r>
-          </w:p>
-        </w:tc>
-      </w:tr>
-    </w:tbl>
-    <w:p>
-      <w:pPr>
-        <w:bidi/>
-        <w:spacing w:before="120" w:after="60" w:line="276" w:lineRule="auto"/>
-      </w:pPr>
-      <w:r>
-        <w:rPr>
-          <w:rFonts w:ascii="Calibri" w:eastAsia="Calibri" w:hAnsi="Calibri" w:cs="Arial"/>
-          <w:b/>
-          <w:bCs/>
-          <w:color w:val="1A1A1A"/>
-          <w:sz w:val="28"/>
-          <w:szCs w:val="28"/>
-          <w:rtl/>
-        </w:rPr>
-        <w:t xml:space="preserve">مجموعة الحلول:  </w:t>
-      </w:r>
-      <w:r>
-        <w:rPr>
-          <w:rFonts w:ascii="Cambria Math" w:hAnsi="Cambria Math" w:cs="Cambria Math"/>
-          <w:b/>
-          <w:color w:val="1A1A1A"/>
-          <w:sz w:val="28"/>
-          <w:szCs w:val="28"/>
-        </w:rPr>
-        <w:t xml:space="preserve">S = [2 ; 3]</w:t>
-      </w:r>
-      <w:r>
-        <w:rPr>
-          <w:rFonts w:ascii="Calibri" w:eastAsia="Calibri" w:hAnsi="Calibri" w:cs="Arial"/>
-          <w:b/>
-          <w:bCs/>
-          <w:color w:val="B8860B"/>
-          <w:sz w:val="22"/>
-          <w:szCs w:val="22"/>
-          <w:rtl/>
-        </w:rPr>
-        <w:t xml:space="preserve">  (الدراسة 2 + S 1)</w:t>
-      </w:r>
-    </w:p>
-    <w:p>
-      <w:pPr>
-        <w:keepNext/>
-        <w:bidi/>
-        <w:spacing w:before="0" w:after="80" w:line="276" w:lineRule="auto"/>
-      </w:pPr>
-      <w:r>
-        <w:rPr>
-          <w:rFonts w:ascii="Calibri" w:eastAsia="Calibri" w:hAnsi="Calibri" w:cs="Arial"/>
-          <w:i/>
-          <w:iCs/>
-          <w:color w:val="1F4E79"/>
-          <w:sz w:val="24"/>
-          <w:szCs w:val="24"/>
-          <w:rtl/>
-        </w:rPr>
-        <w:t xml:space="preserve">يُقبل جدول الإشارات أو أي طريقة صحيحة أخرى.</w:t>
       </w:r>
     </w:p>
     <w:p>

</xml_diff>